<commit_message>
Timeline Option B: canon table, Ch22/24-27 night counts, Ch24-25 fixes
- _canon-facts.md: single night-by-night table (N0 = Baju's death, Lake Wall = N12)
- Ch22 eleven left; Ch25 two nights left, Otto nine days out; Ch27 eleven days
- Ch26 date markers (morning after the corridor / next morning / yesterday)
- Ch24 peer fix list (one Grandmaster asks, Nayan finds the 47s, custody date)
- Notes: open threads for 29-30

Co-Authored-By: Claude Opus 5.5 <noreply@anthropic.com>
</commit_message>
<xml_diff>
--- a/claude-notes/manuscript-v2/24-first-contact-merged.docx
+++ b/claude-notes/manuscript-v2/24-first-contact-merged.docx
@@ -122,7 +122,7 @@
           <w:b w:val="0"/>
           <w:i w:val="0"/>
         </w:rPr>
-        <w:t>A grey folder lay on his table, square to the edge, its corners gone soft as cloth.</w:t>
+        <w:t>A grey folder lay on his table, square to the edge, its corners worn round.</w:t>
       </w:r>
     </w:p>
     <w:p>
@@ -149,7 +149,7 @@
           <w:b w:val="0"/>
           <w:i w:val="0"/>
         </w:rPr>
-        <w:t>"Two of the four Grandmasters have asked the table to sit out of season. In the life of anyone now living, that has happened never." He said it in the voice he used for reading gauges. "The first believes something is moving in her tower. The second, Ashoka's, has brought a matter. Someone in that house has laid four houses' public books side by side, on a floor, by hand, and found the same small leak in all four."</w:t>
+        <w:t>"One of the four Grandmasters has asked the table to sit out of season. In the life of anyone now living, that has happened never." He said it in the voice he used for reading gauges. "She believes something is moving in her tower. Ashoka's will bring a matter to it. Someone in that house has laid four houses' public books side by side, on a floor, by hand, and found the same small leak in all four."</w:t>
       </w:r>
     </w:p>
     <w:p>
@@ -219,7 +219,7 @@
           <w:b w:val="0"/>
           <w:i w:val="0"/>
         </w:rPr>
-        <w:t>"Every forty days, since the charter was signed. The sum has not changed because this office has not grown. It was built not to." He laid one hand flat on the folder. "Now one woman with a pencil has looked, and her Grandmaster will carry it to the table, and I will be asked to answer it."</w:t>
+        <w:t>The metal fingers on her knee closed, late, and she let them. "And the forty days," she said.</w:t>
       </w:r>
     </w:p>
     <w:p>
@@ -228,7 +228,7 @@
           <w:b w:val="0"/>
           <w:i w:val="0"/>
         </w:rPr>
-        <w:t>"Before our night, or after?" Gage said.</w:t>
+        <w:t>"Every forty days, since the charter was signed. The sum has not changed because this office has not grown. It was built not to." He laid one hand flat on the folder. "Now one woman with a pencil has looked, and her Grandmaster will carry it to the table, and I will be asked to answer it."</w:t>
       </w:r>
     </w:p>
     <w:p>
@@ -237,7 +237,7 @@
           <w:b w:val="0"/>
           <w:i w:val="0"/>
         </w:rPr>
-        <w:t>"The table names its own day. I had thought of that." He let it sit. "If it names yours, then the city's clock and ours have just become the same clock. I told you you would not feel ready." He opened the folder. "I am going to answer the copyist before it sits. I will send someone to work beside her, under this ring's cover, who reads as she reads, and I will not tell her what he is." His eyes came round to the stool by the door. "Nor will he."</w:t>
+        <w:t>"Before our night, or after?" Gage said.</w:t>
       </w:r>
     </w:p>
     <w:p>
@@ -246,7 +246,7 @@
           <w:b w:val="0"/>
           <w:i w:val="0"/>
         </w:rPr>
-        <w:t>"You want him to steer her off us," Camilla said.</w:t>
+        <w:t>"The table names its own day. I had thought of that." He let it sit. "If it names yours, then the city's clock and ours have just become the same clock. I told you you would not feel ready." He opened the folder. "I am going to answer the copyist before it sits. I will send someone to work beside her, under this ring's cover, who reads as she reads, and I will not tell her what he is." His eyes came round to the stool by the door. "Nor will he."</w:t>
       </w:r>
     </w:p>
     <w:p>
@@ -255,7 +255,7 @@
           <w:b w:val="0"/>
           <w:i w:val="0"/>
         </w:rPr>
-        <w:t>"No. She is not hunting this office. She is hunting a hand that moves through all four houses, the same hand that put a number on your brother. She stopped at us because we were lying across her road." His fingers stayed flat on the folder. "I would like her to look past us to what she came for. And I would like to know what this office looks like from her floor. I have only ever seen it from mine."</w:t>
+        <w:t>"You want him to steer her off us," Camilla said.</w:t>
       </w:r>
     </w:p>
     <w:p>
@@ -264,7 +264,7 @@
           <w:b w:val="0"/>
           <w:i w:val="0"/>
         </w:rPr>
-        <w:t>Ben had gone very still. His right hand had found his hip.</w:t>
+        <w:t>"No. What she hunts is a hand that moves through all four houses, the same hand, I think, that put a number on your brother. She stopped at us because we were lying across her road." His fingers stayed flat on the folder. "I would like her to look past us to what she came for. And I would like to know what this office looks like from her floor. I have only ever seen it from mine."</w:t>
       </w:r>
     </w:p>
     <w:p>
@@ -273,21 +273,7 @@
           <w:b w:val="0"/>
           <w:i w:val="0"/>
         </w:rPr>
-        <w:t xml:space="preserve">Inside the folder were sheets of thin ruled paper, filled edge to edge in a small upright hand that leaned nowhere. Camilla saw, upside down, the word </w:t>
-      </w:r>
-      <w:r>
-        <w:rPr>
-          <w:b w:val="0"/>
-          <w:i/>
-        </w:rPr>
-        <w:t>Plan</w:t>
-      </w:r>
-      <w:r>
-        <w:rPr>
-          <w:b w:val="0"/>
-          <w:i w:val="0"/>
-        </w:rPr>
-        <w:t xml:space="preserve"> at the head of one, and under it a number that wasn't a name.</w:t>
+        <w:t>Ben had gone very still. His right hand had found his hip.</w:t>
       </w:r>
     </w:p>
     <w:p>
@@ -296,21 +282,21 @@
           <w:b w:val="0"/>
           <w:i w:val="0"/>
         </w:rPr>
-        <w:t>"These were written in the trial rooms by an examiner called Sef, who had been writing them for thirty years and who does not, as a rule, use adjectives." He read without raising his voice. "</w:t>
+        <w:t xml:space="preserve">Inside the folder were sheets of thin ruled paper, filled edge to edge in a small upright hand that leaned nowhere. Camilla saw, upside down, the word </w:t>
       </w:r>
       <w:r>
         <w:rPr>
           <w:b w:val="0"/>
           <w:i/>
         </w:rPr>
-        <w:t>Fear present in all four. Reasoning continuous in all four. The girl thinks in exits, the gentle one thinks in patterns, and they listen to each other without ranking.</w:t>
+        <w:t>Plan</w:t>
       </w:r>
       <w:r>
         <w:rPr>
           <w:b w:val="0"/>
           <w:i w:val="0"/>
         </w:rPr>
-        <w:t>"</w:t>
+        <w:t xml:space="preserve"> at the head of one, and under it a number that wasn't a name.</w:t>
       </w:r>
     </w:p>
     <w:p>
@@ -319,7 +305,21 @@
           <w:b w:val="0"/>
           <w:i w:val="0"/>
         </w:rPr>
-        <w:t>The plucked thing failed its run of notes again and began it over.</w:t>
+        <w:t>"These were written in the trial rooms by an examiner called Sef." He read without raising his voice. "</w:t>
+      </w:r>
+      <w:r>
+        <w:rPr>
+          <w:b w:val="0"/>
+          <w:i/>
+        </w:rPr>
+        <w:t>Fear present in all four. Reasoning continuous in all four. The girl thinks in exits, the gentle one thinks in patterns, and they listen to each other without ranking.</w:t>
+      </w:r>
+      <w:r>
+        <w:rPr>
+          <w:b w:val="0"/>
+          <w:i w:val="0"/>
+        </w:rPr>
+        <w:t>"</w:t>
       </w:r>
     </w:p>
     <w:p>
@@ -328,63 +328,7 @@
           <w:b w:val="0"/>
           <w:i w:val="0"/>
         </w:rPr>
-        <w:t xml:space="preserve">"Under </w:t>
-      </w:r>
-      <w:r>
-        <w:rPr>
-          <w:b w:val="0"/>
-          <w:i/>
-        </w:rPr>
-        <w:t>Control</w:t>
-      </w:r>
-      <w:r>
-        <w:rPr>
-          <w:b w:val="0"/>
-          <w:i w:val="0"/>
-        </w:rPr>
-        <w:t xml:space="preserve">: </w:t>
-      </w:r>
-      <w:r>
-        <w:rPr>
-          <w:b w:val="0"/>
-          <w:i/>
-        </w:rPr>
-        <w:t>The strong one spent his strength making the others stronger.</w:t>
-      </w:r>
-      <w:r>
-        <w:rPr>
-          <w:b w:val="0"/>
-          <w:i w:val="0"/>
-        </w:rPr>
-        <w:t xml:space="preserve">" He closed the folder. "She asked me, that night, for an assessment. </w:t>
-      </w:r>
-      <w:r>
-        <w:rPr>
-          <w:b w:val="0"/>
-          <w:i/>
-        </w:rPr>
-        <w:t>Unlikely heroes,</w:t>
-      </w:r>
-      <w:r>
-        <w:rPr>
-          <w:b w:val="0"/>
-          <w:i w:val="0"/>
-        </w:rPr>
-        <w:t xml:space="preserve"> I told her. </w:t>
-      </w:r>
-      <w:r>
-        <w:rPr>
-          <w:b w:val="0"/>
-          <w:i/>
-        </w:rPr>
-        <w:t>Possible.</w:t>
-      </w:r>
-      <w:r>
-        <w:rPr>
-          <w:b w:val="0"/>
-          <w:i w:val="0"/>
-        </w:rPr>
-        <w:t xml:space="preserve"> She wrote it down. She writes everything down." He looked at Ben. "Ashoka's copyist does too. You will like her, I think. She will not like you for several hours."</w:t>
+        <w:t>The plucked thing failed its run of notes again and began it over.</w:t>
       </w:r>
     </w:p>
     <w:p>
@@ -393,7 +337,63 @@
           <w:b w:val="0"/>
           <w:i w:val="0"/>
         </w:rPr>
-        <w:t>"He's the shift," Gage said.</w:t>
+        <w:t xml:space="preserve">"Under </w:t>
+      </w:r>
+      <w:r>
+        <w:rPr>
+          <w:b w:val="0"/>
+          <w:i/>
+        </w:rPr>
+        <w:t>Control</w:t>
+      </w:r>
+      <w:r>
+        <w:rPr>
+          <w:b w:val="0"/>
+          <w:i w:val="0"/>
+        </w:rPr>
+        <w:t xml:space="preserve">: </w:t>
+      </w:r>
+      <w:r>
+        <w:rPr>
+          <w:b w:val="0"/>
+          <w:i/>
+        </w:rPr>
+        <w:t>The strong one spent his strength making the others stronger.</w:t>
+      </w:r>
+      <w:r>
+        <w:rPr>
+          <w:b w:val="0"/>
+          <w:i w:val="0"/>
+        </w:rPr>
+        <w:t xml:space="preserve">" He closed the folder. "Sef asked me, that night, for an assessment. </w:t>
+      </w:r>
+      <w:r>
+        <w:rPr>
+          <w:b w:val="0"/>
+          <w:i/>
+        </w:rPr>
+        <w:t>Unlikely heroes,</w:t>
+      </w:r>
+      <w:r>
+        <w:rPr>
+          <w:b w:val="0"/>
+          <w:i w:val="0"/>
+        </w:rPr>
+        <w:t xml:space="preserve"> I told her. </w:t>
+      </w:r>
+      <w:r>
+        <w:rPr>
+          <w:b w:val="0"/>
+          <w:i/>
+        </w:rPr>
+        <w:t>Possible.</w:t>
+      </w:r>
+      <w:r>
+        <w:rPr>
+          <w:b w:val="0"/>
+          <w:i w:val="0"/>
+        </w:rPr>
+        <w:t xml:space="preserve"> Sef wrote it down. Sef writes everything down." He looked at Ben. "Ashoka's copyist does too. You will like her, I think. She will not like you for several hours."</w:t>
       </w:r>
     </w:p>
     <w:p>
@@ -402,7 +402,7 @@
           <w:b w:val="0"/>
           <w:i w:val="0"/>
         </w:rPr>
-        <w:t>Four words. His hands had come up off his sides and stayed open, showing Flitzberg they were empty.</w:t>
+        <w:t>"He's the shift," Gage said.</w:t>
       </w:r>
     </w:p>
     <w:p>
@@ -411,7 +411,7 @@
           <w:b w:val="0"/>
           <w:i w:val="0"/>
         </w:rPr>
-        <w:t>"He is."</w:t>
+        <w:t>Three words. His hands had come up off his sides and stayed open, showing Flitzberg they were empty.</w:t>
       </w:r>
     </w:p>
     <w:p>
@@ -420,21 +420,7 @@
           <w:b w:val="0"/>
           <w:i w:val="0"/>
         </w:rPr>
-        <w:t xml:space="preserve">"Five nights. He counts the men off the Hub. Nobody else can." Gage looked at Ben, and his voice stayed where it was, which Camilla knew cost him. "You go up there, and something keeps you, and I'm at that wall with Cami saying </w:t>
-      </w:r>
-      <w:r>
-        <w:rPr>
-          <w:b w:val="0"/>
-          <w:i/>
-        </w:rPr>
-        <w:t>feeds</w:t>
-      </w:r>
-      <w:r>
-        <w:rPr>
-          <w:b w:val="0"/>
-          <w:i w:val="0"/>
-        </w:rPr>
-        <w:t xml:space="preserve"> into an empty count."</w:t>
+        <w:t>"He is."</w:t>
       </w:r>
     </w:p>
     <w:p>
@@ -443,7 +429,21 @@
           <w:b w:val="0"/>
           <w:i w:val="0"/>
         </w:rPr>
-        <w:t>"I know," Ben said.</w:t>
+        <w:t xml:space="preserve">"Five nights. He counts the men off the Hub. Nobody else can." Gage looked at Ben, and his voice stayed where it was, which Camilla knew cost him. "You go up there, and something keeps you, and I'm at that wall with Cami saying </w:t>
+      </w:r>
+      <w:r>
+        <w:rPr>
+          <w:b w:val="0"/>
+          <w:i/>
+        </w:rPr>
+        <w:t>feeds</w:t>
+      </w:r>
+      <w:r>
+        <w:rPr>
+          <w:b w:val="0"/>
+          <w:i w:val="0"/>
+        </w:rPr>
+        <w:t xml:space="preserve"> into an empty count."</w:t>
       </w:r>
     </w:p>
     <w:p>
@@ -452,7 +452,7 @@
           <w:b w:val="0"/>
           <w:i w:val="0"/>
         </w:rPr>
-        <w:t>"Then say no."</w:t>
+        <w:t>"I know," Ben said.</w:t>
       </w:r>
     </w:p>
     <w:p>
@@ -461,7 +461,7 @@
           <w:b w:val="0"/>
           <w:i w:val="0"/>
         </w:rPr>
-        <w:t>Ben's hand pressed flat over the pocket that wasn't there. He was looking at the join in the floor plates between his boots, and Camilla knew the look; he'd worn it kneeling over her shoulder with a spray can, reading what the wound needed before he let himself feel anything about it.</w:t>
+        <w:t>"Then say no."</w:t>
       </w:r>
     </w:p>
     <w:p>
@@ -470,7 +470,7 @@
           <w:b w:val="0"/>
           <w:i w:val="0"/>
         </w:rPr>
-        <w:t>"I'm scared of it," he said. "Up there. All that light, and everyone's wrist talking. I'm scared I'll look at the wrong thing and someone'll see me looking." He lifted his head. "And I'm scared of what I'll do with a wall of somebody else's paper in front of me, because I'll be good at it, and I'll like it. Same as the screens." He breathed in. "I want to go anyway. That's the truth, so I'm saying it."</w:t>
+        <w:t>Ben's hand pressed flat over the pocket that wasn't there. He was looking at the join in the floor plates between his boots, and Camilla knew the look; he'd worn it kneeling over her shoulder with a spray can, reading what the wound needed before he let himself feel anything about it.</w:t>
       </w:r>
     </w:p>
     <w:p>
@@ -479,7 +479,7 @@
           <w:b w:val="0"/>
           <w:i w:val="0"/>
         </w:rPr>
-        <w:t>Gage looked at him for a long time, and then he looked at her. They all did.</w:t>
+        <w:t>"I'm scared of it," he said. "Up there. All that light, and everyone's wrist talking. I'm scared I'll look at the wrong thing and someone'll see me looking." He lifted his head. "And I'm scared of what I'll do with a wall of somebody else's paper in front of me, because I'll be good at it. Same as the screens. And up there I might start to like it." He breathed in. "I want to go anyway. That's the truth, so I'm saying it."</w:t>
       </w:r>
     </w:p>
     <w:p>
@@ -488,7 +488,7 @@
           <w:b w:val="0"/>
           <w:i w:val="0"/>
         </w:rPr>
-        <w:t>She thought about the bench two levels down, and the box with the ear in it that she'd built to listen to the Lake Wall. Yesterday it had heard the engineer's hammer through the workshop partition, three blows and a pause, clean; it still couldn't tell rock from anything else. Closer than it had been. Not proven.</w:t>
+        <w:t>Gage looked at him for a long time, and then he looked at her. They all did.</w:t>
       </w:r>
     </w:p>
     <w:p>
@@ -497,7 +497,7 @@
           <w:b w:val="0"/>
           <w:i w:val="0"/>
         </w:rPr>
-        <w:t>"How long," she said.</w:t>
+        <w:t>She thought about the box on her bench, which still couldn't tell rock from footsteps.</w:t>
       </w:r>
     </w:p>
     <w:p>
@@ -506,7 +506,7 @@
           <w:b w:val="0"/>
           <w:i w:val="0"/>
         </w:rPr>
-        <w:t>"Up tomorrow. Two nights there, in a bed Ashoka will give him under a name that is not his. Back by the third night."</w:t>
+        <w:t>"How long," she said.</w:t>
       </w:r>
     </w:p>
     <w:p>
@@ -515,7 +515,7 @@
           <w:b w:val="0"/>
           <w:i w:val="0"/>
         </w:rPr>
-        <w:t>"Last rehearsal's the third night."</w:t>
+        <w:t>"Up tomorrow. Two nights there, in a bed Ashoka will give him under a name that is not his. Back by the third night."</w:t>
       </w:r>
     </w:p>
     <w:p>
@@ -524,7 +524,7 @@
           <w:b w:val="0"/>
           <w:i w:val="0"/>
         </w:rPr>
-        <w:t>"Then he will be at it."</w:t>
+        <w:t>"Last rehearsal's the third night."</w:t>
       </w:r>
     </w:p>
     <w:p>
@@ -533,7 +533,7 @@
           <w:b w:val="0"/>
           <w:i w:val="0"/>
         </w:rPr>
-        <w:t>"He'd better be." She made the metal hand lie flat on her knee. "He goes. If you're not on that stool when the glass turns over, Ben, I call it without you." Her voice didn't move. "I'll hate it. I'll still call it."</w:t>
+        <w:t>"Then he will be at it."</w:t>
       </w:r>
     </w:p>
     <w:p>
@@ -542,7 +542,7 @@
           <w:b w:val="0"/>
           <w:i w:val="0"/>
         </w:rPr>
-        <w:t>Gage's hands went back to his sides. He didn't close them.</w:t>
+        <w:t>"He'd better be." She made the metal hand lie flat on her knee. "He goes. If you're not on that stool when the glass turns over, Ben, I call it without you." Her voice didn't move. "I'll hate it. I'll still call it."</w:t>
       </w:r>
     </w:p>
     <w:p>
@@ -551,7 +551,7 @@
           <w:b w:val="0"/>
           <w:i w:val="0"/>
         </w:rPr>
-        <w:t>"Three terms," Flitzberg said to Ben, "and they are mine, not the office's. You will not name this ring, to anyone, under anything. You will not lie to them. If a lie is the only thing between you and a floor, you tell it, and you tell me afterward; that is the one door I leave open, and I am telling you plainly so you will know where it is." He stood. "And you will come home. The count is Gage's reason. Mine is that you are owed one."</w:t>
+        <w:t>Gage's hands went back to his sides. He didn't close them.</w:t>
       </w:r>
     </w:p>
     <w:p>
@@ -560,7 +560,7 @@
           <w:b w:val="0"/>
           <w:i w:val="0"/>
         </w:rPr>
-        <w:t>"Right," Ben said. His voice had gone thin, and he cleared it. "Right."</w:t>
+        <w:t>"Three terms," Flitzberg said to Ben, "and they are mine, not the office's. You will not name this ring, to anyone, under anything. You will not lie to them. If a lie is the only thing between you and harm, you tell it, and you tell me afterward; that is the one door I leave open, and I am telling you plainly so you will know where it is." He stood. "And you will come home. The count is Gage's reason. Mine is that you are owed one."</w:t>
       </w:r>
     </w:p>
     <w:p>
@@ -569,7 +569,7 @@
           <w:b w:val="0"/>
           <w:i w:val="0"/>
         </w:rPr>
-        <w:t>The lift went up for a long time.</w:t>
+        <w:t>"Right," Ben said. His voice had gone thin, and he cleared it. "Right."</w:t>
       </w:r>
     </w:p>
     <w:p>
@@ -578,7 +578,7 @@
           <w:b w:val="0"/>
           <w:i w:val="0"/>
         </w:rPr>
-        <w:t>Ben lost count of the floors at sixty-something, and when the doors opened the first thing that came in was the air.</w:t>
+        <w:t>The lift went up for a long time.</w:t>
       </w:r>
     </w:p>
     <w:p>
@@ -587,7 +587,7 @@
           <w:b w:val="0"/>
           <w:i w:val="0"/>
         </w:rPr>
-        <w:t>It smelled of nothing. No sulfur, no coal-sweat, no people. A faint sweetness under it like washed stone.</w:t>
+        <w:t>Ben lost count of the floors at sixty-something, and when the doors opened the first thing that came in was the air.</w:t>
       </w:r>
     </w:p>
     <w:p>
@@ -596,7 +596,7 @@
           <w:b w:val="0"/>
           <w:i w:val="0"/>
         </w:rPr>
-        <w:t>The lower stacks were a cellar of shelving, and a door at the end of them opened onto the sky.</w:t>
+        <w:t>It smelled of nothing. No sulfur, no coal-sweat, no people. A faint sweetness under it like washed stone.</w:t>
       </w:r>
     </w:p>
     <w:p>
@@ -605,7 +605,7 @@
           <w:b w:val="0"/>
           <w:i w:val="0"/>
         </w:rPr>
-        <w:t>The light came from everywhere, in his eyes and on the backs of his hands, and he had to look at the floor. Someone had cut a thin groove along it for the rain.</w:t>
+        <w:t>The lower stacks were a cellar of shelving, and a door at the end of them opened onto the sky.</w:t>
       </w:r>
     </w:p>
     <w:p>
@@ -614,7 +614,7 @@
           <w:b w:val="0"/>
           <w:i w:val="0"/>
         </w:rPr>
-        <w:t>People went past him. Nobody looked, because nothing on their wrists had told them to. His own said what the ring had set it to say: RUNNER, LOWER STACKS, DRONA, and a number. He was no one. He was a boy with paper.</w:t>
+        <w:t>The light came from everywhere, in his eyes and on the backs of his hands, and he had to look at the floor. Someone had cut a thin groove along it for the rain.</w:t>
       </w:r>
     </w:p>
     <w:p>
@@ -623,7 +623,7 @@
           <w:b w:val="0"/>
           <w:i w:val="0"/>
         </w:rPr>
-        <w:t>He thought of the gates. He couldn't help it. Somewhere under his boots, under the rock and the cloud and the sixty-odd floors, Gretchen was standing on a worn patch of dirt with a scarf over her hair, and he was up here where nobody coughed, and the two facts wouldn't sit in the same chest. He put his hand on his hip.</w:t>
+        <w:t>People went past him. Nobody looked, because nothing on their wrists had told them to. His own said what the ring had set it to say: RUNNER, LOWER STACKS, DRONA, and a number. He was no one. He was a boy with paper.</w:t>
       </w:r>
     </w:p>
     <w:p>
@@ -632,7 +632,7 @@
           <w:b w:val="0"/>
           <w:i w:val="0"/>
         </w:rPr>
-        <w:t>Nothing there. There hadn't been anything there since a room full of orange light, and his hand went anyway. The habit was all that was left of the compass.</w:t>
+        <w:t>He thought of the gates. He couldn't help it. Somewhere under his boots, under the rock and the cloud and the sixty-odd floors, Gretchen was standing on a worn patch of dirt with a scarf over her hair, and he was up here where nobody coughed, and the two facts wouldn't sit in the same chest. He put his hand on his hip.</w:t>
       </w:r>
     </w:p>
     <w:p>
@@ -641,21 +641,7 @@
           <w:b w:val="0"/>
           <w:i w:val="0"/>
         </w:rPr>
-        <w:t xml:space="preserve">Ashoka was red-black and quieter, and its stone was old. He went down three flights worn hollow in the middle by feet, and at the bottom there was a door with </w:t>
-      </w:r>
-      <w:r>
-        <w:rPr>
-          <w:b w:val="0"/>
-          <w:i/>
-        </w:rPr>
-        <w:t>dead room</w:t>
-      </w:r>
-      <w:r>
-        <w:rPr>
-          <w:b w:val="0"/>
-          <w:i w:val="0"/>
-        </w:rPr>
-        <w:t xml:space="preserve"> on it in plain white paint, and a man in front of it.</w:t>
+        <w:t>Nothing there. There hadn't been anything there since a room full of orange light, and his hand went anyway.</w:t>
       </w:r>
     </w:p>
     <w:p>
@@ -664,7 +650,21 @@
           <w:b w:val="0"/>
           <w:i w:val="0"/>
         </w:rPr>
-        <w:t>Twenty-one, maybe. Red-black, no insignia. A scar along the jaw, old and pale. The knuckles of the right hand split and glued and split again; knuckles went like that when they met bone a lot. He stood as nobody in Miner Town stood, settled, as if the floor had asked him and he'd agreed to it.</w:t>
+        <w:t xml:space="preserve">A maglev took him across the open dark to Trinity-3. Ashoka was red-black and quieter, and its stone was old. He went down three flights worn hollow in the middle by feet, and at the bottom there was a door with </w:t>
+      </w:r>
+      <w:r>
+        <w:rPr>
+          <w:b w:val="0"/>
+          <w:i/>
+        </w:rPr>
+        <w:t>dead room</w:t>
+      </w:r>
+      <w:r>
+        <w:rPr>
+          <w:b w:val="0"/>
+          <w:i w:val="0"/>
+        </w:rPr>
+        <w:t xml:space="preserve"> on it in plain white paint, and a man in front of it.</w:t>
       </w:r>
     </w:p>
     <w:p>
@@ -673,7 +673,7 @@
           <w:b w:val="0"/>
           <w:i w:val="0"/>
         </w:rPr>
-        <w:t>"You're the runner."</w:t>
+        <w:t>Twenty-one, maybe. Red-black, no insignia. A scar along the jaw, old and pale. The knuckles of the right hand split and glued and split again; knuckles went like that when they met bone a lot. He stood as nobody in Miner Town stood, settled, as if the floor had asked him and he'd agreed to it.</w:t>
       </w:r>
     </w:p>
     <w:p>
@@ -682,7 +682,7 @@
           <w:b w:val="0"/>
           <w:i w:val="0"/>
         </w:rPr>
-        <w:t>"I'm the runner."</w:t>
+        <w:t>"She said they'd send someone who reads patterns."</w:t>
       </w:r>
     </w:p>
     <w:p>
@@ -691,7 +691,7 @@
           <w:b w:val="0"/>
           <w:i w:val="0"/>
         </w:rPr>
-        <w:t>The man looked at him the way the medic looked, all of it at once, and Ben felt himself counted: the gray-blue that didn't fit at the shoulder, the boots, the hand that had gone to his hip and come away. He looked back. A commander. A man who'd knelt on stone recently; the left knee of his fatigues was paler than the right.</w:t>
+        <w:t>"I'm the runner."</w:t>
       </w:r>
     </w:p>
     <w:p>
@@ -700,7 +700,7 @@
           <w:b w:val="0"/>
           <w:i w:val="0"/>
         </w:rPr>
-        <w:t>Neither of them said what they'd seen. The commander held it a second longer, then nodded once.</w:t>
+        <w:t>The man looked at him the way the medic looked, all of it at once, and Ben felt himself counted: the gray-blue that didn't fit at the shoulder, the boots, the hand that had gone to his hip and come away. He looked back. A commander. A man who'd knelt on stone recently; the left knee of his fatigues was paler than the right.</w:t>
       </w:r>
     </w:p>
     <w:p>
@@ -709,7 +709,7 @@
           <w:b w:val="0"/>
           <w:i w:val="0"/>
         </w:rPr>
-        <w:t>"Rohan. Terminal in the locker. Slot's the empty one."</w:t>
+        <w:t>Neither of them said what they'd seen. The commander held it a second longer, then nodded once.</w:t>
       </w:r>
     </w:p>
     <w:p>
@@ -718,7 +718,7 @@
           <w:b w:val="0"/>
           <w:i w:val="0"/>
         </w:rPr>
-        <w:t>Ben unbuckled the ring's terminal and laid it in the drawer, and the drawer sighed shut on it. The city had stopped talking to him. He hadn't known it had been.</w:t>
+        <w:t>"Rohan. Terminal in the locker. Slot's the empty one."</w:t>
       </w:r>
     </w:p>
     <w:p>
@@ -727,7 +727,7 @@
           <w:b w:val="0"/>
           <w:i w:val="0"/>
         </w:rPr>
-        <w:t>"Shoes," said a woman's voice from inside. "Walk on the gaps."</w:t>
+        <w:t>Ben unbuckled the ring's terminal and laid it in the drawer, and the drawer sighed shut on it. The city had stopped talking to him. He hadn't known it had been.</w:t>
       </w:r>
     </w:p>
     <w:p>
@@ -736,7 +736,7 @@
           <w:b w:val="0"/>
           <w:i w:val="0"/>
         </w:rPr>
-        <w:t>She was on the floor among her columns, and she didn't look up.</w:t>
+        <w:t>"Shoes," said a woman's voice from inside. "Walk on the gaps."</w:t>
       </w:r>
     </w:p>
     <w:p>
@@ -745,7 +745,7 @@
           <w:b w:val="0"/>
           <w:i w:val="0"/>
         </w:rPr>
-        <w:t>Four strips of paper ran from the wall to the door, held at their corners by pencils and a tin cup and a whetstone and one glove. Every sheet was dated in the same small level hand. A brass pin in the fourth wall panel, pushed in crooked, and two sheets pinned a finger's width clear of it on either side.</w:t>
+        <w:t>She was on the floor among her columns, and she didn't look up.</w:t>
       </w:r>
     </w:p>
     <w:p>
@@ -754,7 +754,7 @@
           <w:b w:val="0"/>
           <w:i w:val="0"/>
         </w:rPr>
-        <w:t>He counted the room without deciding to. Her. Rohan, shutting the door. And in the corner beside the locker, a man.</w:t>
+        <w:t>Four strips of paper ran from the wall to the door, held at their corners by pencils and a tin cup and a whetstone and one glove. Every sheet was dated in the same small level hand. A brass pin in the fourth wall panel, pushed in crooked, and two sheets pinned a finger's width clear of it on either side.</w:t>
       </w:r>
     </w:p>
     <w:p>
@@ -763,7 +763,7 @@
           <w:b w:val="0"/>
           <w:i w:val="0"/>
         </w:rPr>
-        <w:t>Medium height. Medium everything. A face you'd call a wall if you called it anything. Ben's eyes went over the corner, and registered a wall, and came back, because that was what his eyes did when something was standing in one of the holes between people. A small white nick through the left eyebrow, old. A collar turned so the frayed side was in.</w:t>
+        <w:t>He counted the room without deciding to. Her. Rohan, shutting the door. And in the corner beside the locker, a man.</w:t>
       </w:r>
     </w:p>
     <w:p>
@@ -772,7 +772,7 @@
           <w:b w:val="0"/>
           <w:i w:val="0"/>
         </w:rPr>
-        <w:t>The man in the corner looked at him. Nothing in the face moved. But the eyes, which had been resting on nothing, came onto Ben and stayed, and Ben had the sense of a door that had never once been tried finding a hand on it.</w:t>
+        <w:t>Medium height. Medium everything. A face you'd call a wall if you called it anything. Ben's eyes went over the corner, and registered a wall, and came back, because that was what his eyes did when something was standing in one of the holes between people. A small white nick through the left eyebrow, old. A collar turned so the frayed side was in.</w:t>
       </w:r>
     </w:p>
     <w:p>
@@ -781,7 +781,7 @@
           <w:b w:val="0"/>
           <w:i w:val="0"/>
         </w:rPr>
-        <w:t>"Three of us," Rohan said. "Nayan. Me. You."</w:t>
+        <w:t>The man in the corner looked at him. Nothing in the face moved. But the eyes, which had been resting on nothing, came onto Ben and stayed, and Ben had the sense of a door that had never once been tried finding a hand on it.</w:t>
       </w:r>
     </w:p>
     <w:p>
@@ -790,7 +790,7 @@
           <w:b w:val="0"/>
           <w:i w:val="0"/>
         </w:rPr>
-        <w:t>"Four," Ben said.</w:t>
+        <w:t>"Three of us," Rohan said. "Nayan. Me. You."</w:t>
       </w:r>
     </w:p>
     <w:p>
@@ -799,7 +799,7 @@
           <w:b w:val="0"/>
           <w:i w:val="0"/>
         </w:rPr>
-        <w:t>Rohan looked at the corner, and at Ben, and something along the scar tightened and let go.</w:t>
+        <w:t>"Four," Ben said.</w:t>
       </w:r>
     </w:p>
     <w:p>
@@ -808,7 +808,7 @@
           <w:b w:val="0"/>
           <w:i w:val="0"/>
         </w:rPr>
-        <w:t>"Kaan. He'll give you his hand after. He doesn't give it before." Rohan looked at Ben a moment longer. "How did you see him?"</w:t>
+        <w:t>Rohan looked at the corner, and at Ben, and his jaw shifted once.</w:t>
       </w:r>
     </w:p>
     <w:p>
@@ -817,7 +817,7 @@
           <w:b w:val="0"/>
           <w:i w:val="0"/>
         </w:rPr>
-        <w:t>"My friend Otto stands like that," Ben said. "An old man in a shed taught him. You stop seeing him, and then you do."</w:t>
+        <w:t>"Kaan. He'll give you his hand after. He doesn't give it before." Rohan held Ben's eyes. "How did you see him?"</w:t>
       </w:r>
     </w:p>
     <w:p>
@@ -826,7 +826,7 @@
           <w:b w:val="0"/>
           <w:i w:val="0"/>
         </w:rPr>
-        <w:t>Rohan didn't answer. Ben saw him put it somewhere.</w:t>
+        <w:t>"My friend Otto stands like that," Ben said. "An old man in a shed taught him. You stop seeing him, and then you do."</w:t>
       </w:r>
     </w:p>
     <w:p>
@@ -835,7 +835,7 @@
           <w:b w:val="0"/>
           <w:i w:val="0"/>
         </w:rPr>
-        <w:t>The woman on the floor sat back on her heels and took the pencil out of her teeth.</w:t>
+        <w:t>Rohan didn't answer. Ben saw him put it somewhere.</w:t>
       </w:r>
     </w:p>
     <w:p>
@@ -844,7 +844,7 @@
           <w:b w:val="0"/>
           <w:i w:val="0"/>
         </w:rPr>
-        <w:t>"Read me Chanakya. Third year, autumn."</w:t>
+        <w:t>The woman on the floor sat back on her heels and took the pencil out of her teeth.</w:t>
       </w:r>
     </w:p>
     <w:p>
@@ -853,7 +853,7 @@
           <w:b w:val="0"/>
           <w:i w:val="0"/>
         </w:rPr>
-        <w:t>He found the column, second from the shaft, walked the gaps to it in his socks, and knelt on the left, because she numbered the right.</w:t>
+        <w:t>"Read me Chanakya. Third year, autumn."</w:t>
       </w:r>
     </w:p>
     <w:p>
@@ -862,7 +862,7 @@
           <w:b w:val="0"/>
           <w:i w:val="0"/>
         </w:rPr>
-        <w:t>He read it aloud as he'd read the screens for the man with the crackers: flat, in order, nothing added. Filter media. Survey fee. Lamp oil. When he reached the forty-day line he read it like the rest and went on past, because stopping on it would have been a kind of speech.</w:t>
+        <w:t>He found the column, second from the shaft, walked the gaps to it in his socks, and knelt on the left, because she numbered the right.</w:t>
       </w:r>
     </w:p>
     <w:p>
@@ -871,7 +871,7 @@
           <w:b w:val="0"/>
           <w:i w:val="0"/>
         </w:rPr>
-        <w:t>She let him reach the bottom of the page. "Again. Across. Same date, all four. I want to see if you can."</w:t>
+        <w:t>He read it aloud as he'd read the screens for the man with the crackers: flat, in order, nothing added. Filter media. Survey fee. Lamp oil. When he reached the forty-day line he read it like the rest and went on past, because stopping on it would have been a kind of speech.</w:t>
       </w:r>
     </w:p>
     <w:p>
@@ -880,7 +880,7 @@
           <w:b w:val="0"/>
           <w:i w:val="0"/>
         </w:rPr>
-        <w:t>He could. He did it on his knees, hands on his thighs so they wouldn't touch her paper, and the columns stopped being columns and became one thing with a grain in it, and he followed the grain.</w:t>
+        <w:t>She let him reach the bottom of the page. "Again. Across. Same date, all four. I want to see if you can."</w:t>
       </w:r>
     </w:p>
     <w:p>
@@ -889,7 +889,7 @@
           <w:b w:val="0"/>
           <w:i w:val="0"/>
         </w:rPr>
-        <w:t>Forty days. Bearings, filters, dressings, paper. He followed it year by year toward the door, and somewhere in the fourth year his eye caught on nothing, and went back.</w:t>
+        <w:t>He could. He did it on his knees, hands on his thighs so they wouldn't touch her paper, and the columns stopped being columns and became one thing with a grain in it, and he followed the grain.</w:t>
       </w:r>
     </w:p>
     <w:p>
@@ -898,7 +898,7 @@
           <w:b w:val="0"/>
           <w:i w:val="0"/>
         </w:rPr>
-        <w:t>Forty, forty, forty, and then forty-seven. All four houses. Then forty again. Third year: forty-seven, a different week. Second. First. One week in every year the line came late, and the late week moved.</w:t>
+        <w:t>Forty days. Bearings, filters, dressings, paper. He followed it year by year toward the door, and somewhere in the fourth year his eye caught on something, and stopped, and he made it go on. It went on a beat too late.</w:t>
       </w:r>
     </w:p>
     <w:p>
@@ -907,7 +907,7 @@
           <w:b w:val="0"/>
           <w:i w:val="0"/>
         </w:rPr>
-        <w:t>He knew why.</w:t>
+        <w:t>He knew why. He knew whose cellar the paper was in. He'd eaten off a tin plate in it last night.</w:t>
       </w:r>
     </w:p>
     <w:p>
@@ -916,7 +916,7 @@
           <w:b w:val="0"/>
           <w:i w:val="0"/>
         </w:rPr>
-        <w:t>He knew it as he knew when the turbine man's kid was sick: the shape of it was in him before the words were. Once a year four people were taken to sit before a thing none of them could find, and for a week the thing bought nothing, because for a week its door was being watched. He didn't know when the table sat. He didn't know how the buying was done, or by whose hand. He knew whose cellar the paper was in. He'd eaten off a tin plate in it last night.</w:t>
+        <w:t>Nayan was looking at him. She'd been looking for a while.</w:t>
       </w:r>
     </w:p>
     <w:p>
@@ -925,7 +925,7 @@
           <w:b w:val="0"/>
           <w:i w:val="0"/>
         </w:rPr>
-        <w:t>Nayan was looking at him. She'd been looking for a while.</w:t>
+        <w:t>"You stopped."</w:t>
       </w:r>
     </w:p>
     <w:p>
@@ -934,7 +934,7 @@
           <w:b w:val="0"/>
           <w:i w:val="0"/>
         </w:rPr>
-        <w:t>"You stopped."</w:t>
+        <w:t>"I'm reading."</w:t>
       </w:r>
     </w:p>
     <w:p>
@@ -943,7 +943,7 @@
           <w:b w:val="0"/>
           <w:i w:val="0"/>
         </w:rPr>
-        <w:t>"I'm reading."</w:t>
+        <w:t>"No. You were reading. Then you stopped." She came down the column on her knees to where his eyes had been, and read it herself, and then read across. "Forty-seven," she said. "Not forty. All four." She went down a year, and another, fast. "Here. Here. Once a year, a week late, and never the same week." She sat back on her heels. "I read down. I've only ever read down. What's it waiting for?"</w:t>
       </w:r>
     </w:p>
     <w:p>
@@ -952,21 +952,21 @@
           <w:b w:val="0"/>
           <w:i w:val="0"/>
         </w:rPr>
-        <w:t xml:space="preserve">"No. You were reading. Then you stopped reading and started knowing something." She said it in the voice she'd used for </w:t>
+        <w:t xml:space="preserve">He opened his mouth to say </w:t>
       </w:r>
       <w:r>
         <w:rPr>
           <w:b w:val="0"/>
           <w:i/>
         </w:rPr>
-        <w:t>walk on the gaps</w:t>
+        <w:t>I don't know</w:t>
       </w:r>
       <w:r>
         <w:rPr>
           <w:b w:val="0"/>
           <w:i w:val="0"/>
         </w:rPr>
-        <w:t>. "What is it?"</w:t>
+        <w:t>, and it wasn't true, so he shut it again.</w:t>
       </w:r>
     </w:p>
     <w:p>
@@ -975,7 +975,7 @@
           <w:b w:val="0"/>
           <w:i w:val="0"/>
         </w:rPr>
-        <w:t>He put his finger a hair above the fourth-year sheet, not on it.</w:t>
+        <w:t>The silence went on long enough that Rohan turned from the wall. Kaan hadn't moved.</w:t>
       </w:r>
     </w:p>
     <w:p>
@@ -984,7 +984,7 @@
           <w:b w:val="0"/>
           <w:i w:val="0"/>
         </w:rPr>
-        <w:t>"It's late here. Forty-seven, not forty. All four." He moved down the floor to the third year, the second. "Here. Here. Once a year, a week late, and never the same week."</w:t>
+        <w:t>"There's a thing I can't tell you," Ben said at last. "It isn't that I won't. I gave my word before I came up, and I'm not going to lie to you to keep it, so this is what you get instead. I don't know how it works, any of it. I know there's a reason it's late, and I'm not allowed to say the reason." He kept his hand off his hip. "You can throw me out. You'd be right to."</w:t>
       </w:r>
     </w:p>
     <w:p>
@@ -993,7 +993,7 @@
           <w:b w:val="0"/>
           <w:i w:val="0"/>
         </w:rPr>
-        <w:t>She came down the column on her knees, fast. He watched six years of copying rearrange themselves behind her eyes.</w:t>
+        <w:t>Nayan looked at him over the pencil for a long while.</w:t>
       </w:r>
     </w:p>
     <w:p>
@@ -1002,7 +1002,7 @@
           <w:b w:val="0"/>
           <w:i w:val="0"/>
         </w:rPr>
-        <w:t>"I read down," she said. "I've only ever read down. What's it waiting for? The late week."</w:t>
+        <w:t>"I don't know his real name," she said, and tipped her head at Rohan. "Six years. He doesn't know mine. The man in the corner's never said a word in my hearing." She bent back to the sheet. "Nobody in this room gets to be angry about what somebody else won't say. Help me mark the late weeks."</w:t>
       </w:r>
     </w:p>
     <w:p>
@@ -1011,21 +1011,7 @@
           <w:b w:val="0"/>
           <w:i w:val="0"/>
         </w:rPr>
-        <w:t xml:space="preserve">He opened his mouth to say </w:t>
-      </w:r>
-      <w:r>
-        <w:rPr>
-          <w:b w:val="0"/>
-          <w:i/>
-        </w:rPr>
-        <w:t>I don't know</w:t>
-      </w:r>
-      <w:r>
-        <w:rPr>
-          <w:b w:val="0"/>
-          <w:i w:val="0"/>
-        </w:rPr>
-        <w:t>, and it wasn't true, so he shut it again.</w:t>
+        <w:t>She drew the squares; he found them. It took an hour, and he was good at it, and he liked it.</w:t>
       </w:r>
     </w:p>
     <w:p>
@@ -1034,7 +1020,7 @@
           <w:b w:val="0"/>
           <w:i w:val="0"/>
         </w:rPr>
-        <w:t>The silence went on long enough that Rohan turned from the wall. Kaan hadn't moved.</w:t>
+        <w:t>Kaan came out of the corner when they were done.</w:t>
       </w:r>
     </w:p>
     <w:p>
@@ -1043,7 +1029,7 @@
           <w:b w:val="0"/>
           <w:i w:val="0"/>
         </w:rPr>
-        <w:t>"There's a thing I can't tell you," Ben said at last. "It isn't that I won't. I gave my word before I came up, and I'm not going to lie to you to keep it, so this is what you get instead. I don't know how it works, any of it. I know there's a reason it's late, and I'm not allowed to say the reason." He kept his hand off his hip. "You can throw me out. You'd be right to."</w:t>
+        <w:t>He crossed the room on the gaps, crouched, and took a pencil stub and a scrap of the house's cheap tag paper from inside his coat. Block letters, pressed in hard. He laid the scrap on the stone in front of Ben and took his hand off it, and his eyes came up to Ben's face and held there, as they had at the door.</w:t>
       </w:r>
     </w:p>
     <w:p>
@@ -1052,7 +1038,7 @@
           <w:b w:val="0"/>
           <w:i w:val="0"/>
         </w:rPr>
-        <w:t>Nayan looked at him over the pencil for a long while.</w:t>
+        <w:t>A number. Long, with a letter in it. Nothing else.</w:t>
       </w:r>
     </w:p>
     <w:p>
@@ -1061,7 +1047,7 @@
           <w:b w:val="0"/>
           <w:i w:val="0"/>
         </w:rPr>
-        <w:t>"I don't know his name," she said, and tipped her head at Rohan. "Six years. He doesn't know mine. The man in the corner's never said a word in my hearing." She bent back to the sheet. "Nobody in this room gets to be angry about what somebody else won't say. Help me mark the late weeks."</w:t>
+        <w:t>"From a slip in a coat," Rohan said. "In Chanakya. The analyst's carried it three years."</w:t>
       </w:r>
     </w:p>
     <w:p>
@@ -1070,7 +1056,7 @@
           <w:b w:val="0"/>
           <w:i w:val="0"/>
         </w:rPr>
-        <w:t>She drew the squares; he found them. It took an hour, and he was good at it, and he liked it, and both of those were true at once.</w:t>
+        <w:t>Nayan was already moving. From under the tin cup she drew a thinner sheaf, and from under that a thinner one still, and laid a sheet beside Kaan's scrap without touching either.</w:t>
       </w:r>
     </w:p>
     <w:p>
@@ -1079,7 +1065,35 @@
           <w:b w:val="0"/>
           <w:i w:val="0"/>
         </w:rPr>
-        <w:t>Kaan came out of the corner when they were done.</w:t>
+        <w:t xml:space="preserve">Chanakya's records archive. Custody. File numbers, and beside each a name: </w:t>
+      </w:r>
+      <w:r>
+        <w:rPr>
+          <w:b w:val="0"/>
+          <w:i/>
+        </w:rPr>
+        <w:t>released to</w:t>
+      </w:r>
+      <w:r>
+        <w:rPr>
+          <w:b w:val="0"/>
+          <w:i w:val="0"/>
+        </w:rPr>
+        <w:t xml:space="preserve">, </w:t>
+      </w:r>
+      <w:r>
+        <w:rPr>
+          <w:b w:val="0"/>
+          <w:i/>
+        </w:rPr>
+        <w:t>returned by</w:t>
+      </w:r>
+      <w:r>
+        <w:rPr>
+          <w:b w:val="0"/>
+          <w:i w:val="0"/>
+        </w:rPr>
+        <w:t>.</w:t>
       </w:r>
     </w:p>
     <w:p>
@@ -1088,7 +1102,35 @@
           <w:b w:val="0"/>
           <w:i w:val="0"/>
         </w:rPr>
-        <w:t>He crossed the room on the gaps, crouched, and took a pencil stub and a scrap of the house's cheap tag paper from inside his coat. Block letters, pressed in hard. He laid the scrap on the stone in front of Ben and took his hand off it, and his eyes came up to Ben's face and held there, as they had at the door.</w:t>
+        <w:t xml:space="preserve">Near the bottom, the same number. Beside it: </w:t>
+      </w:r>
+      <w:r>
+        <w:rPr>
+          <w:b w:val="0"/>
+          <w:i/>
+        </w:rPr>
+        <w:t>Source folio. One night. Author's custody. Ravi.</w:t>
+      </w:r>
+      <w:r>
+        <w:rPr>
+          <w:b w:val="0"/>
+          <w:i w:val="0"/>
+        </w:rPr>
+        <w:t xml:space="preserve"> A date, the morning of the fourth. The </w:t>
+      </w:r>
+      <w:r>
+        <w:rPr>
+          <w:b w:val="0"/>
+          <w:i/>
+        </w:rPr>
+        <w:t>returned by</w:t>
+      </w:r>
+      <w:r>
+        <w:rPr>
+          <w:b w:val="0"/>
+          <w:i w:val="0"/>
+        </w:rPr>
+        <w:t xml:space="preserve"> column beside it was empty.</w:t>
       </w:r>
     </w:p>
     <w:p>
@@ -1097,7 +1139,7 @@
           <w:b w:val="0"/>
           <w:i w:val="0"/>
         </w:rPr>
-        <w:t>A number. Long, with a letter in it. Nothing else.</w:t>
+        <w:t>"Public," Nayan said. "It sits open on the counter. I copy it every fourth day."</w:t>
       </w:r>
     </w:p>
     <w:p>
@@ -1106,7 +1148,7 @@
           <w:b w:val="0"/>
           <w:i w:val="0"/>
         </w:rPr>
-        <w:t>"From a slip in a coat," Rohan said. "In Chanakya. The analyst's carried it three years."</w:t>
+        <w:t>One number, written twice, in two hands, by two people who'd never spoken. Ben looked at the two scraps as he'd looked at the crystal, waiting for the pulse.</w:t>
       </w:r>
     </w:p>
     <w:p>
@@ -1115,7 +1157,7 @@
           <w:b w:val="0"/>
           <w:i w:val="0"/>
         </w:rPr>
-        <w:t>Nayan was already moving. From under the tin cup she drew a thinner sheaf, and from under that a thinner one still, and laid a sheet beside Kaan's scrap without touching either.</w:t>
+        <w:t>The pulse was the date.</w:t>
       </w:r>
     </w:p>
     <w:p>
@@ -1124,35 +1166,7 @@
           <w:b w:val="0"/>
           <w:i w:val="0"/>
         </w:rPr>
-        <w:t xml:space="preserve">Chanakya's records archive. Custody. File numbers, and beside each a name: </w:t>
-      </w:r>
-      <w:r>
-        <w:rPr>
-          <w:b w:val="0"/>
-          <w:i/>
-        </w:rPr>
-        <w:t>released to</w:t>
-      </w:r>
-      <w:r>
-        <w:rPr>
-          <w:b w:val="0"/>
-          <w:i w:val="0"/>
-        </w:rPr>
-        <w:t xml:space="preserve">, </w:t>
-      </w:r>
-      <w:r>
-        <w:rPr>
-          <w:b w:val="0"/>
-          <w:i/>
-        </w:rPr>
-        <w:t>returned by</w:t>
-      </w:r>
-      <w:r>
-        <w:rPr>
-          <w:b w:val="0"/>
-          <w:i w:val="0"/>
-        </w:rPr>
-        <w:t>.</w:t>
+        <w:t>"When did you set the appointment?" he said to Kaan. "The one he kept."</w:t>
       </w:r>
     </w:p>
     <w:p>
@@ -1161,14 +1175,35 @@
           <w:b w:val="0"/>
           <w:i w:val="0"/>
         </w:rPr>
-        <w:t xml:space="preserve">Near the bottom, the same number. Beside it: </w:t>
+        <w:t xml:space="preserve">Kaan didn't answer. Rohan did. "A slip in his coat, the morning before. </w:t>
       </w:r>
       <w:r>
         <w:rPr>
           <w:b w:val="0"/>
           <w:i/>
         </w:rPr>
-        <w:t>Source folio. One night. Author's custody. Ravi.</w:t>
+        <w:t>Room Four. Two hours.</w:t>
+      </w:r>
+      <w:r>
+        <w:rPr>
+          <w:b w:val="0"/>
+          <w:i w:val="0"/>
+        </w:rPr>
+        <w:t xml:space="preserve"> He went and found a note instead. </w:t>
+      </w:r>
+      <w:r>
+        <w:rPr>
+          <w:b w:val="0"/>
+          <w:i/>
+        </w:rPr>
+        <w:t>Tomorrow. Bring what you took.</w:t>
+      </w:r>
+      <w:r>
+        <w:rPr>
+          <w:b w:val="0"/>
+          <w:i w:val="0"/>
+        </w:rPr>
+        <w:t>"</w:t>
       </w:r>
     </w:p>
     <w:p>
@@ -1177,7 +1212,21 @@
           <w:b w:val="0"/>
           <w:i w:val="0"/>
         </w:rPr>
-        <w:t>"Public," Nayan said. "It sits open on the counter. I copy it every fourth day."</w:t>
+        <w:t xml:space="preserve">Ben put his finger above the custody line. "Same morning. He signed this out before he ever saw your note." He looked up at Kaan. "Your note said </w:t>
+      </w:r>
+      <w:r>
+        <w:rPr>
+          <w:b w:val="0"/>
+          <w:i/>
+        </w:rPr>
+        <w:t>bring</w:t>
+      </w:r>
+      <w:r>
+        <w:rPr>
+          <w:b w:val="0"/>
+          <w:i w:val="0"/>
+        </w:rPr>
+        <w:t>. He'd already fetched it. He wanted it in his hands before anyone told him to."</w:t>
       </w:r>
     </w:p>
     <w:p>
@@ -1186,7 +1235,7 @@
           <w:b w:val="0"/>
           <w:i w:val="0"/>
         </w:rPr>
-        <w:t>One number, written twice, in two hands, by two people who'd never spoken. Ben looked at the two scraps as he'd looked at the crystal, waiting for the pulse.</w:t>
+        <w:t>Kaan's face did nothing. But he picked up the scrap and set it down again a finger's width closer to the custody page, so the two numbers lay nearly touching. Then Kaan held out his hand.</w:t>
       </w:r>
     </w:p>
     <w:p>
@@ -1195,7 +1244,7 @@
           <w:b w:val="0"/>
           <w:i w:val="0"/>
         </w:rPr>
-        <w:t>The pulse was the date.</w:t>
+        <w:t>"What is it?" Ben said. "The file."</w:t>
       </w:r>
     </w:p>
     <w:p>
@@ -1204,7 +1253,7 @@
           <w:b w:val="0"/>
           <w:i w:val="0"/>
         </w:rPr>
-        <w:t>"When did you set the appointment?" he said to Kaan. "The one he kept."</w:t>
+        <w:t>"Sealed above his grade," Nayan said. "Above mine. A case, three years old, filed by him in his first year. That's as far as paper goes."</w:t>
       </w:r>
     </w:p>
     <w:p>
@@ -1213,35 +1262,7 @@
           <w:b w:val="0"/>
           <w:i w:val="0"/>
         </w:rPr>
-        <w:t xml:space="preserve">Kaan didn't answer. Rohan did. "A slip in his coat, the morning before. </w:t>
-      </w:r>
-      <w:r>
-        <w:rPr>
-          <w:b w:val="0"/>
-          <w:i/>
-        </w:rPr>
-        <w:t>Room Four. Two hours.</w:t>
-      </w:r>
-      <w:r>
-        <w:rPr>
-          <w:b w:val="0"/>
-          <w:i w:val="0"/>
-        </w:rPr>
-        <w:t xml:space="preserve"> He went and found a note instead. </w:t>
-      </w:r>
-      <w:r>
-        <w:rPr>
-          <w:b w:val="0"/>
-          <w:i/>
-        </w:rPr>
-        <w:t>Tomorrow. Bring what you took.</w:t>
-      </w:r>
-      <w:r>
-        <w:rPr>
-          <w:b w:val="0"/>
-          <w:i w:val="0"/>
-        </w:rPr>
-        <w:t>"</w:t>
+        <w:t>"Then that's where we stop," Rohan said. "A number in two hands, both lawful, both citable. The man who holds it fetching it before he was asked." His jaw worked once along the scar. "That's the other road."</w:t>
       </w:r>
     </w:p>
     <w:p>
@@ -1250,21 +1271,7 @@
           <w:b w:val="0"/>
           <w:i w:val="0"/>
         </w:rPr>
-        <w:t xml:space="preserve">Ben put his finger above the custody line. "Same morning. He signed this out at first bell, before he read your note." He looked up at Kaan. "Your note said </w:t>
-      </w:r>
-      <w:r>
-        <w:rPr>
-          <w:b w:val="0"/>
-          <w:i/>
-        </w:rPr>
-        <w:t>bring</w:t>
-      </w:r>
-      <w:r>
-        <w:rPr>
-          <w:b w:val="0"/>
-          <w:i w:val="0"/>
-        </w:rPr>
-        <w:t>. He'd already fetched it. He wanted it in his hands before anyone told him to."</w:t>
+        <w:t>Nobody asked him what the first one was. Ben saw the question cross Nayan's face and get put away, and he said nothing either.</w:t>
       </w:r>
     </w:p>
     <w:p>
@@ -1273,7 +1280,7 @@
           <w:b w:val="0"/>
           <w:i w:val="0"/>
         </w:rPr>
-        <w:t>Kaan's face did nothing. But he picked up the scrap and set it down again a finger's width closer to the custody page, so the two numbers lay nearly touching.</w:t>
+        <w:t>They gave him a bed in a room with a window. He stood at it in his socks for a long time before he could make himself look down.</w:t>
       </w:r>
     </w:p>
     <w:p>
@@ -1282,7 +1289,7 @@
           <w:b w:val="0"/>
           <w:i w:val="0"/>
         </w:rPr>
-        <w:t>"What is it?" Ben said. "The file."</w:t>
+        <w:t>Cloud, at first. Then the cloud thinned, and the mountain came up through it, grey and brown and enormous, with the lights of the Hub lift like a row of teeth in its flank. He found the pithead. He found the basin, a dull sheet of water catching the last of the light. And there, on its granite shelf a hundred feet up and to the north-east, a scatter of rust and broken shapes, so small from here he could have covered it with his thumb.</w:t>
       </w:r>
     </w:p>
     <w:p>
@@ -1291,7 +1298,7 @@
           <w:b w:val="0"/>
           <w:i w:val="0"/>
         </w:rPr>
-        <w:t>"Sealed above his grade," Nayan said. "Above mine. A case, three years old. He filed the report himself, first year, and the house took it off him and never told him what it meant." She tapped the air over the number. "That's as far as paper goes."</w:t>
+        <w:t>The Junkyard. He'd never seen it from above.</w:t>
       </w:r>
     </w:p>
     <w:p>
@@ -1300,69 +1307,6 @@
           <w:b w:val="0"/>
           <w:i w:val="0"/>
         </w:rPr>
-        <w:t>"Then that's where we stop," Rohan said. "A number in two hands, both lawful, both citable. The man who holds it fetching it before he was asked." His jaw worked once along the scar. "That's the other road."</w:t>
-      </w:r>
-    </w:p>
-    <w:p>
-      <w:r>
-        <w:rPr>
-          <w:b w:val="0"/>
-          <w:i w:val="0"/>
-        </w:rPr>
-        <w:t>Nobody asked him what the first one was. Ben saw the question cross Nayan's face and get put away, and he said nothing either.</w:t>
-      </w:r>
-    </w:p>
-    <w:p>
-      <w:r>
-        <w:rPr>
-          <w:b w:val="0"/>
-          <w:i w:val="0"/>
-        </w:rPr>
-        <w:t>They gave him a bed in a room with a window, the first he'd ever slept under. He stood at it in his socks for a long time before he could make himself look down.</w:t>
-      </w:r>
-    </w:p>
-    <w:p>
-      <w:r>
-        <w:rPr>
-          <w:b w:val="0"/>
-          <w:i w:val="0"/>
-        </w:rPr>
-        <w:t>Cloud, at first. Then the cloud thinned, and the mountain came up through it, grey and brown and enormous, with the lights of the Hub lift like a row of teeth in its flank. He found the pithead. He found the basin, a dull sheet of water catching the last of the light. And there, on its granite shelf a hundred feet up and to the north-east, a scatter of rust and broken shapes, so small from here he could have covered it with his thumb.</w:t>
-      </w:r>
-    </w:p>
-    <w:p>
-      <w:r>
-        <w:rPr>
-          <w:b w:val="0"/>
-          <w:i w:val="0"/>
-        </w:rPr>
-        <w:t>The Junkyard. He'd never seen it from above.</w:t>
-      </w:r>
-    </w:p>
-    <w:p>
-      <w:r>
-        <w:rPr>
-          <w:b w:val="0"/>
-          <w:i w:val="0"/>
-        </w:rPr>
-        <w:t>Below it, somewhere in the rock, in a ring on no map, a tank was drying, and a boy was learning to hold a cup, and a girl with one hand of each kind was teaching a box to listen to a wall. Below that, in the shade of a tunnel mouth, a worn patch of dirt the size of two feet.</w:t>
-      </w:r>
-    </w:p>
-    <w:p>
-      <w:r>
-        <w:rPr>
-          <w:b w:val="0"/>
-          <w:i w:val="0"/>
-        </w:rPr>
-        <w:t>He couldn't see either from here. He knew where they were.</w:t>
-      </w:r>
-    </w:p>
-    <w:p>
-      <w:r>
-        <w:rPr>
-          <w:b w:val="0"/>
-          <w:i w:val="0"/>
-        </w:rPr>
         <w:t xml:space="preserve">Before he slept he took a sheet of the house's ruled paper and wrote one line on it in a small, level hand, as near Nayan's as he could make it. The date in the corner. Then: </w:t>
       </w:r>
       <w:r>
@@ -1370,7 +1314,7 @@
           <w:b w:val="0"/>
           <w:i/>
         </w:rPr>
-        <w:t>Forty-seven. One week in every year. Whatever it is, it holds still while it's being watched.</w:t>
+        <w:t>Forty-seven. One week in every year.</w:t>
       </w:r>
       <w:r>
         <w:rPr>

</xml_diff>

<commit_message>
Rohan's single split knuckle: ch4, ch24, ch30 and canon match Ch1
Co-Authored-By: Claude Opus 5.5 <noreply@anthropic.com>
</commit_message>
<xml_diff>
--- a/claude-notes/manuscript-v2/24-first-contact-merged.docx
+++ b/claude-notes/manuscript-v2/24-first-contact-merged.docx
@@ -20,6 +20,7 @@
         <w:rPr>
           <w:b w:val="0"/>
           <w:i/>
+          <w:strike w:val="0"/>
           <w:color w:val="5C6B7D"/>
         </w:rPr>
         <w:t>Ben pulled out a small brass compass. His father had given it to him years ago — the only thing he'd carried from home.</w:t>
@@ -30,6 +31,7 @@
         <w:rPr>
           <w:b w:val="0"/>
           <w:i/>
+          <w:strike w:val="0"/>
           <w:color w:val="5C6B7D"/>
         </w:rPr>
         <w:t>— Book 1, Chapter 25: Don't Do It</w:t>
@@ -49,6 +51,7 @@
         <w:rPr>
           <w:b w:val="0"/>
           <w:i w:val="0"/>
+          <w:strike w:val="0"/>
         </w:rPr>
         <w:t>Otto was sitting up when they passed his door, which he hadn't been yesterday.</w:t>
       </w:r>
@@ -58,6 +61,7 @@
         <w:rPr>
           <w:b w:val="0"/>
           <w:i w:val="0"/>
+          <w:strike w:val="0"/>
         </w:rPr>
         <w:t>The bed had been cranked to a slant and he lay against it with both hands flat on the folded blanket, holding it on. The grey-haired medic was feeding him broth from a cup with a spout. He turned his head when Camilla's boots stopped, and it took the rest of him a second to agree to it.</w:t>
       </w:r>
@@ -67,6 +71,7 @@
         <w:rPr>
           <w:b w:val="0"/>
           <w:i w:val="0"/>
+          <w:strike w:val="0"/>
         </w:rPr>
         <w:t>"Where're you going?"</w:t>
       </w:r>
@@ -76,6 +81,7 @@
         <w:rPr>
           <w:b w:val="0"/>
           <w:i w:val="0"/>
+          <w:strike w:val="0"/>
         </w:rPr>
         <w:t>"Up," Gage said. "He sent for us."</w:t>
       </w:r>
@@ -85,6 +91,7 @@
         <w:rPr>
           <w:b w:val="0"/>
           <w:i w:val="0"/>
+          <w:strike w:val="0"/>
         </w:rPr>
         <w:t>Otto looked at the cup, and at the medic, who didn't move it. "Tell me after."</w:t>
       </w:r>
@@ -94,6 +101,7 @@
         <w:rPr>
           <w:b w:val="0"/>
           <w:i w:val="0"/>
+          <w:strike w:val="0"/>
         </w:rPr>
         <w:t>The medic tipped the cup. Camilla watched his throat work, once, slow, and watched him keep his eyes open through it. Then Gage's hand was on her good shoulder, turning her back to the corridor.</w:t>
       </w:r>
@@ -103,6 +111,7 @@
         <w:rPr>
           <w:b w:val="0"/>
           <w:i w:val="0"/>
+          <w:strike w:val="0"/>
         </w:rPr>
         <w:t>She found Flitzberg's rooms by the music. Today it was one instrument, something plucked, going over a short run of notes and failing to finish it.</w:t>
       </w:r>
@@ -112,6 +121,7 @@
         <w:rPr>
           <w:b w:val="0"/>
           <w:i w:val="0"/>
+          <w:strike w:val="0"/>
         </w:rPr>
         <w:t>The dolls looked a little to the left of them as they came in.</w:t>
       </w:r>
@@ -121,6 +131,7 @@
         <w:rPr>
           <w:b w:val="0"/>
           <w:i w:val="0"/>
+          <w:strike w:val="0"/>
         </w:rPr>
         <w:t>A grey folder lay on his table, square to the edge, its corners worn round.</w:t>
       </w:r>
@@ -130,6 +141,7 @@
         <w:rPr>
           <w:b w:val="0"/>
           <w:i w:val="0"/>
+          <w:strike w:val="0"/>
         </w:rPr>
         <w:t>"Sit, if you like. Gage will not; I have stopped asking." Ben took the stool by the door and turned it a quarter, so he could see the corridor. "A thing to tell you and a thing to ask. Under our pact the telling comes first."</w:t>
       </w:r>
@@ -139,6 +151,7 @@
         <w:rPr>
           <w:b w:val="0"/>
           <w:i w:val="0"/>
+          <w:strike w:val="0"/>
         </w:rPr>
         <w:t>"Go on."</w:t>
       </w:r>
@@ -148,6 +161,7 @@
         <w:rPr>
           <w:b w:val="0"/>
           <w:i w:val="0"/>
+          <w:strike w:val="0"/>
         </w:rPr>
         <w:t>"One of the four Grandmasters has asked the table to sit out of season. In the life of anyone now living, that has happened never." He said it in the voice he used for reading gauges. "She believes something is moving in her tower. Ashoka's will bring a matter to it. Someone in that house has laid four houses' public books side by side, on a floor, by hand, and found the same small leak in all four."</w:t>
       </w:r>
@@ -157,6 +171,7 @@
         <w:rPr>
           <w:b w:val="0"/>
           <w:i w:val="0"/>
+          <w:strike w:val="0"/>
         </w:rPr>
         <w:t>Ben's stool creaked. Gage, standing by the shelves with his hands open at his sides, didn't move at all.</w:t>
       </w:r>
@@ -166,6 +181,7 @@
         <w:rPr>
           <w:b w:val="0"/>
           <w:i/>
+          <w:strike w:val="0"/>
         </w:rPr>
         <w:t>None of them has ever laid four sets of books side by side.</w:t>
       </w:r>
@@ -173,6 +189,7 @@
         <w:rPr>
           <w:b w:val="0"/>
           <w:i w:val="0"/>
+          <w:strike w:val="0"/>
         </w:rPr>
         <w:t xml:space="preserve"> He'd said it to her across a table the first week, with a bruise on his neck shaped like her brother's hand.</w:t>
       </w:r>
@@ -182,6 +199,7 @@
         <w:rPr>
           <w:b w:val="0"/>
           <w:i w:val="0"/>
+          <w:strike w:val="0"/>
         </w:rPr>
         <w:t>"It's you," she said. "The leak's this office."</w:t>
       </w:r>
@@ -191,6 +209,7 @@
         <w:rPr>
           <w:b w:val="0"/>
           <w:i w:val="0"/>
+          <w:strike w:val="0"/>
         </w:rPr>
         <w:t>"Yes."</w:t>
       </w:r>
@@ -200,6 +219,7 @@
         <w:rPr>
           <w:b w:val="0"/>
           <w:i w:val="0"/>
+          <w:strike w:val="0"/>
         </w:rPr>
         <w:t>"Forty reams of paper. Bearings." She'd read them off his own wall. "Dressings for the medics." Her metal hand was on her knee. She looked at it, and then at him. "And this. Where did this come from?"</w:t>
       </w:r>
@@ -209,6 +229,7 @@
         <w:rPr>
           <w:b w:val="0"/>
           <w:i w:val="0"/>
+          <w:strike w:val="0"/>
         </w:rPr>
         <w:t>"From Drona," Flitzberg said, because she had asked, and he had promised. "The part that listens was built for an instrument the four houses sealed away a century ago. This office copied it, the way it copies what it needs, and Drona's books show Drona buying for itself." He held her eyes. "I have never told anyone that. No one asked."</w:t>
       </w:r>
@@ -218,6 +239,7 @@
         <w:rPr>
           <w:b w:val="0"/>
           <w:i w:val="0"/>
+          <w:strike w:val="0"/>
         </w:rPr>
         <w:t>The metal fingers on her knee closed, late, and she let them. "And the forty days," she said.</w:t>
       </w:r>
@@ -227,6 +249,7 @@
         <w:rPr>
           <w:b w:val="0"/>
           <w:i w:val="0"/>
+          <w:strike w:val="0"/>
         </w:rPr>
         <w:t>"Every forty days, since the charter was signed. The sum has not changed because this office has not grown. It was built not to." He laid one hand flat on the folder. "Now one woman with a pencil has looked, and her Grandmaster will carry it to the table, and I will be asked to answer it."</w:t>
       </w:r>
@@ -236,6 +259,7 @@
         <w:rPr>
           <w:b w:val="0"/>
           <w:i w:val="0"/>
+          <w:strike w:val="0"/>
         </w:rPr>
         <w:t>"Before our night, or after?" Gage said.</w:t>
       </w:r>
@@ -245,6 +269,7 @@
         <w:rPr>
           <w:b w:val="0"/>
           <w:i w:val="0"/>
+          <w:strike w:val="0"/>
         </w:rPr>
         <w:t>"The table names its own day. I had thought of that." He let it sit. "If it names yours, then the city's clock and ours have just become the same clock. I told you you would not feel ready." He opened the folder. "I am going to answer the copyist before it sits. I will send someone to work beside her, under this ring's cover, who reads as she reads, and I will not tell her what he is." His eyes came round to the stool by the door. "Nor will he."</w:t>
       </w:r>
@@ -254,6 +279,7 @@
         <w:rPr>
           <w:b w:val="0"/>
           <w:i w:val="0"/>
+          <w:strike w:val="0"/>
         </w:rPr>
         <w:t>"You want him to steer her off us," Camilla said.</w:t>
       </w:r>
@@ -263,6 +289,7 @@
         <w:rPr>
           <w:b w:val="0"/>
           <w:i w:val="0"/>
+          <w:strike w:val="0"/>
         </w:rPr>
         <w:t>"No. What she hunts is a hand that moves through all four houses, the same hand, I think, that put a number on your brother. She stopped at us because we were lying across her road." His fingers stayed flat on the folder. "I would like her to look past us to what she came for. And I would like to know what this office looks like from her floor. I have only ever seen it from mine."</w:t>
       </w:r>
@@ -272,6 +299,7 @@
         <w:rPr>
           <w:b w:val="0"/>
           <w:i w:val="0"/>
+          <w:strike w:val="0"/>
         </w:rPr>
         <w:t>Ben had gone very still. His right hand had found his hip.</w:t>
       </w:r>
@@ -281,6 +309,7 @@
         <w:rPr>
           <w:b w:val="0"/>
           <w:i w:val="0"/>
+          <w:strike w:val="0"/>
         </w:rPr>
         <w:t xml:space="preserve">Inside the folder were sheets of thin ruled paper, filled edge to edge in a small upright hand that leaned nowhere. Camilla saw, upside down, the word </w:t>
       </w:r>
@@ -288,6 +317,7 @@
         <w:rPr>
           <w:b w:val="0"/>
           <w:i/>
+          <w:strike w:val="0"/>
         </w:rPr>
         <w:t>Plan</w:t>
       </w:r>
@@ -295,6 +325,7 @@
         <w:rPr>
           <w:b w:val="0"/>
           <w:i w:val="0"/>
+          <w:strike w:val="0"/>
         </w:rPr>
         <w:t xml:space="preserve"> at the head of one, and under it a number that wasn't a name.</w:t>
       </w:r>
@@ -304,6 +335,7 @@
         <w:rPr>
           <w:b w:val="0"/>
           <w:i w:val="0"/>
+          <w:strike w:val="0"/>
         </w:rPr>
         <w:t>"These were written in the trial rooms by an examiner called Sef." He read without raising his voice. "</w:t>
       </w:r>
@@ -311,6 +343,7 @@
         <w:rPr>
           <w:b w:val="0"/>
           <w:i/>
+          <w:strike w:val="0"/>
         </w:rPr>
         <w:t>Fear present in all four. Reasoning continuous in all four. The girl thinks in exits, the gentle one thinks in patterns, and they listen to each other without ranking.</w:t>
       </w:r>
@@ -318,6 +351,7 @@
         <w:rPr>
           <w:b w:val="0"/>
           <w:i w:val="0"/>
+          <w:strike w:val="0"/>
         </w:rPr>
         <w:t>"</w:t>
       </w:r>
@@ -327,6 +361,7 @@
         <w:rPr>
           <w:b w:val="0"/>
           <w:i w:val="0"/>
+          <w:strike w:val="0"/>
         </w:rPr>
         <w:t>The plucked thing failed its run of notes again and began it over.</w:t>
       </w:r>
@@ -336,6 +371,7 @@
         <w:rPr>
           <w:b w:val="0"/>
           <w:i w:val="0"/>
+          <w:strike w:val="0"/>
         </w:rPr>
         <w:t xml:space="preserve">"Under </w:t>
       </w:r>
@@ -343,6 +379,7 @@
         <w:rPr>
           <w:b w:val="0"/>
           <w:i/>
+          <w:strike w:val="0"/>
         </w:rPr>
         <w:t>Control</w:t>
       </w:r>
@@ -350,6 +387,7 @@
         <w:rPr>
           <w:b w:val="0"/>
           <w:i w:val="0"/>
+          <w:strike w:val="0"/>
         </w:rPr>
         <w:t xml:space="preserve">: </w:t>
       </w:r>
@@ -357,6 +395,7 @@
         <w:rPr>
           <w:b w:val="0"/>
           <w:i/>
+          <w:strike w:val="0"/>
         </w:rPr>
         <w:t>The strong one spent his strength making the others stronger.</w:t>
       </w:r>
@@ -364,6 +403,7 @@
         <w:rPr>
           <w:b w:val="0"/>
           <w:i w:val="0"/>
+          <w:strike w:val="0"/>
         </w:rPr>
         <w:t xml:space="preserve">" He closed the folder. "Sef asked me, that night, for an assessment. </w:t>
       </w:r>
@@ -371,6 +411,7 @@
         <w:rPr>
           <w:b w:val="0"/>
           <w:i/>
+          <w:strike w:val="0"/>
         </w:rPr>
         <w:t>Unlikely heroes,</w:t>
       </w:r>
@@ -378,6 +419,7 @@
         <w:rPr>
           <w:b w:val="0"/>
           <w:i w:val="0"/>
+          <w:strike w:val="0"/>
         </w:rPr>
         <w:t xml:space="preserve"> I told her. </w:t>
       </w:r>
@@ -385,6 +427,7 @@
         <w:rPr>
           <w:b w:val="0"/>
           <w:i/>
+          <w:strike w:val="0"/>
         </w:rPr>
         <w:t>Possible.</w:t>
       </w:r>
@@ -392,6 +435,7 @@
         <w:rPr>
           <w:b w:val="0"/>
           <w:i w:val="0"/>
+          <w:strike w:val="0"/>
         </w:rPr>
         <w:t xml:space="preserve"> Sef wrote it down. Sef writes everything down." He looked at Ben. "Ashoka's copyist does too. You will like her, I think. She will not like you for several hours."</w:t>
       </w:r>
@@ -401,6 +445,7 @@
         <w:rPr>
           <w:b w:val="0"/>
           <w:i w:val="0"/>
+          <w:strike w:val="0"/>
         </w:rPr>
         <w:t>"He's the shift," Gage said.</w:t>
       </w:r>
@@ -410,6 +455,7 @@
         <w:rPr>
           <w:b w:val="0"/>
           <w:i w:val="0"/>
+          <w:strike w:val="0"/>
         </w:rPr>
         <w:t>Three words. His hands had come up off his sides and stayed open, showing Flitzberg they were empty.</w:t>
       </w:r>
@@ -419,6 +465,7 @@
         <w:rPr>
           <w:b w:val="0"/>
           <w:i w:val="0"/>
+          <w:strike w:val="0"/>
         </w:rPr>
         <w:t>"He is."</w:t>
       </w:r>
@@ -428,6 +475,7 @@
         <w:rPr>
           <w:b w:val="0"/>
           <w:i w:val="0"/>
+          <w:strike w:val="0"/>
         </w:rPr>
         <w:t xml:space="preserve">"Five nights. He counts the men off the Hub. Nobody else can." Gage looked at Ben, and his voice stayed where it was, which Camilla knew cost him. "You go up there, and something keeps you, and I'm at that wall with Cami saying </w:t>
       </w:r>
@@ -435,6 +483,7 @@
         <w:rPr>
           <w:b w:val="0"/>
           <w:i/>
+          <w:strike w:val="0"/>
         </w:rPr>
         <w:t>feeds</w:t>
       </w:r>
@@ -442,6 +491,7 @@
         <w:rPr>
           <w:b w:val="0"/>
           <w:i w:val="0"/>
+          <w:strike w:val="0"/>
         </w:rPr>
         <w:t xml:space="preserve"> into an empty count."</w:t>
       </w:r>
@@ -451,6 +501,7 @@
         <w:rPr>
           <w:b w:val="0"/>
           <w:i w:val="0"/>
+          <w:strike w:val="0"/>
         </w:rPr>
         <w:t>"I know," Ben said.</w:t>
       </w:r>
@@ -460,6 +511,7 @@
         <w:rPr>
           <w:b w:val="0"/>
           <w:i w:val="0"/>
+          <w:strike w:val="0"/>
         </w:rPr>
         <w:t>"Then say no."</w:t>
       </w:r>
@@ -469,6 +521,7 @@
         <w:rPr>
           <w:b w:val="0"/>
           <w:i w:val="0"/>
+          <w:strike w:val="0"/>
         </w:rPr>
         <w:t>Ben's hand pressed flat over the pocket that wasn't there. He was looking at the join in the floor plates between his boots, and Camilla knew the look; he'd worn it kneeling over her shoulder with a spray can, reading what the wound needed before he let himself feel anything about it.</w:t>
       </w:r>
@@ -478,6 +531,7 @@
         <w:rPr>
           <w:b w:val="0"/>
           <w:i w:val="0"/>
+          <w:strike w:val="0"/>
         </w:rPr>
         <w:t>"I'm scared of it," he said. "Up there. All that light, and everyone's wrist talking. I'm scared I'll look at the wrong thing and someone'll see me looking." He lifted his head. "And I'm scared of what I'll do with a wall of somebody else's paper in front of me, because I'll be good at it. Same as the screens. And up there I might start to like it." He breathed in. "I want to go anyway. That's the truth, so I'm saying it."</w:t>
       </w:r>
@@ -487,6 +541,7 @@
         <w:rPr>
           <w:b w:val="0"/>
           <w:i w:val="0"/>
+          <w:strike w:val="0"/>
         </w:rPr>
         <w:t>Gage looked at him for a long time, and then he looked at her. They all did.</w:t>
       </w:r>
@@ -496,6 +551,7 @@
         <w:rPr>
           <w:b w:val="0"/>
           <w:i w:val="0"/>
+          <w:strike w:val="0"/>
         </w:rPr>
         <w:t>She thought about the box on her bench, which still couldn't tell rock from footsteps.</w:t>
       </w:r>
@@ -505,6 +561,7 @@
         <w:rPr>
           <w:b w:val="0"/>
           <w:i w:val="0"/>
+          <w:strike w:val="0"/>
         </w:rPr>
         <w:t>"How long," she said.</w:t>
       </w:r>
@@ -514,6 +571,7 @@
         <w:rPr>
           <w:b w:val="0"/>
           <w:i w:val="0"/>
+          <w:strike w:val="0"/>
         </w:rPr>
         <w:t>"Up tomorrow. Two nights there, in a bed Ashoka will give him under a name that is not his. Back by the third night."</w:t>
       </w:r>
@@ -523,6 +581,7 @@
         <w:rPr>
           <w:b w:val="0"/>
           <w:i w:val="0"/>
+          <w:strike w:val="0"/>
         </w:rPr>
         <w:t>"Last rehearsal's the third night."</w:t>
       </w:r>
@@ -532,6 +591,7 @@
         <w:rPr>
           <w:b w:val="0"/>
           <w:i w:val="0"/>
+          <w:strike w:val="0"/>
         </w:rPr>
         <w:t>"Then he will be at it."</w:t>
       </w:r>
@@ -541,6 +601,7 @@
         <w:rPr>
           <w:b w:val="0"/>
           <w:i w:val="0"/>
+          <w:strike w:val="0"/>
         </w:rPr>
         <w:t>"He'd better be." She made the metal hand lie flat on her knee. "He goes. If you're not on that stool when the glass turns over, Ben, I call it without you." Her voice didn't move. "I'll hate it. I'll still call it."</w:t>
       </w:r>
@@ -550,6 +611,7 @@
         <w:rPr>
           <w:b w:val="0"/>
           <w:i w:val="0"/>
+          <w:strike w:val="0"/>
         </w:rPr>
         <w:t>Gage's hands went back to his sides. He didn't close them.</w:t>
       </w:r>
@@ -559,6 +621,7 @@
         <w:rPr>
           <w:b w:val="0"/>
           <w:i w:val="0"/>
+          <w:strike w:val="0"/>
         </w:rPr>
         <w:t>"Three terms," Flitzberg said to Ben, "and they are mine, not the office's. You will not name this ring, to anyone, under anything. You will not lie to them. If a lie is the only thing between you and harm, you tell it, and you tell me afterward; that is the one door I leave open, and I am telling you plainly so you will know where it is." He stood. "And you will come home. The count is Gage's reason. Mine is that you are owed one."</w:t>
       </w:r>
@@ -568,6 +631,7 @@
         <w:rPr>
           <w:b w:val="0"/>
           <w:i w:val="0"/>
+          <w:strike w:val="0"/>
         </w:rPr>
         <w:t>"Right," Ben said. His voice had gone thin, and he cleared it. "Right."</w:t>
       </w:r>
@@ -577,6 +641,7 @@
         <w:rPr>
           <w:b w:val="0"/>
           <w:i w:val="0"/>
+          <w:strike w:val="0"/>
         </w:rPr>
         <w:t>The lift went up for a long time.</w:t>
       </w:r>
@@ -586,6 +651,7 @@
         <w:rPr>
           <w:b w:val="0"/>
           <w:i w:val="0"/>
+          <w:strike w:val="0"/>
         </w:rPr>
         <w:t>Ben lost count of the floors at sixty-something, and when the doors opened the first thing that came in was the air.</w:t>
       </w:r>
@@ -595,6 +661,7 @@
         <w:rPr>
           <w:b w:val="0"/>
           <w:i w:val="0"/>
+          <w:strike w:val="0"/>
         </w:rPr>
         <w:t>It smelled of nothing. No sulfur, no coal-sweat, no people. A faint sweetness under it like washed stone.</w:t>
       </w:r>
@@ -604,6 +671,7 @@
         <w:rPr>
           <w:b w:val="0"/>
           <w:i w:val="0"/>
+          <w:strike w:val="0"/>
         </w:rPr>
         <w:t>The lower stacks were a cellar of shelving, and a door at the end of them opened onto the sky.</w:t>
       </w:r>
@@ -613,6 +681,7 @@
         <w:rPr>
           <w:b w:val="0"/>
           <w:i w:val="0"/>
+          <w:strike w:val="0"/>
         </w:rPr>
         <w:t>The light came from everywhere, in his eyes and on the backs of his hands, and he had to look at the floor. Someone had cut a thin groove along it for the rain.</w:t>
       </w:r>
@@ -622,6 +691,7 @@
         <w:rPr>
           <w:b w:val="0"/>
           <w:i w:val="0"/>
+          <w:strike w:val="0"/>
         </w:rPr>
         <w:t>People went past him. Nobody looked, because nothing on their wrists had told them to. His own said what the ring had set it to say: RUNNER, LOWER STACKS, DRONA, and a number. He was no one. He was a boy with paper.</w:t>
       </w:r>
@@ -631,6 +701,7 @@
         <w:rPr>
           <w:b w:val="0"/>
           <w:i w:val="0"/>
+          <w:strike w:val="0"/>
         </w:rPr>
         <w:t>He thought of the gates. He couldn't help it. Somewhere under his boots, under the rock and the cloud and the sixty-odd floors, Gretchen was standing on a worn patch of dirt with a scarf over her hair, and he was up here where nobody coughed, and the two facts wouldn't sit in the same chest. He put his hand on his hip.</w:t>
       </w:r>
@@ -640,6 +711,7 @@
         <w:rPr>
           <w:b w:val="0"/>
           <w:i w:val="0"/>
+          <w:strike w:val="0"/>
         </w:rPr>
         <w:t>Nothing there. There hadn't been anything there since a room full of orange light, and his hand went anyway.</w:t>
       </w:r>
@@ -649,6 +721,7 @@
         <w:rPr>
           <w:b w:val="0"/>
           <w:i w:val="0"/>
+          <w:strike w:val="0"/>
         </w:rPr>
         <w:t xml:space="preserve">A maglev took him across the open dark to Trinity-3. Ashoka was red-black and quieter, and its stone was old. He went down three flights worn hollow in the middle by feet, and at the bottom there was a door with </w:t>
       </w:r>
@@ -656,6 +729,7 @@
         <w:rPr>
           <w:b w:val="0"/>
           <w:i/>
+          <w:strike w:val="0"/>
         </w:rPr>
         <w:t>dead room</w:t>
       </w:r>
@@ -663,6 +737,7 @@
         <w:rPr>
           <w:b w:val="0"/>
           <w:i w:val="0"/>
+          <w:strike w:val="0"/>
         </w:rPr>
         <w:t xml:space="preserve"> on it in plain white paint, and a man in front of it.</w:t>
       </w:r>
@@ -672,8 +747,9 @@
         <w:rPr>
           <w:b w:val="0"/>
           <w:i w:val="0"/>
-        </w:rPr>
-        <w:t>Twenty-one, maybe. Red-black, no insignia. A scar along the jaw, old and pale. The knuckles of the right hand split and glued and split again; knuckles went like that when they met bone a lot. He stood as nobody in Miner Town stood, settled, as if the floor had asked him and he'd agreed to it.</w:t>
+          <w:strike w:val="0"/>
+        </w:rPr>
+        <w:t>Twenty-one, maybe. Red-black, no insignia. A scar along the jaw, old and pale. The third knuckle of the right hand split and glued and split again; a knuckle went like that when they met bone a lot. He stood as nobody in Miner Town stood, settled, as if the floor had asked him and he'd agreed to it.</w:t>
       </w:r>
     </w:p>
     <w:p>
@@ -681,6 +757,7 @@
         <w:rPr>
           <w:b w:val="0"/>
           <w:i w:val="0"/>
+          <w:strike w:val="0"/>
         </w:rPr>
         <w:t>"She said they'd send someone who reads patterns."</w:t>
       </w:r>
@@ -690,6 +767,7 @@
         <w:rPr>
           <w:b w:val="0"/>
           <w:i w:val="0"/>
+          <w:strike w:val="0"/>
         </w:rPr>
         <w:t>"I'm the runner."</w:t>
       </w:r>
@@ -699,6 +777,7 @@
         <w:rPr>
           <w:b w:val="0"/>
           <w:i w:val="0"/>
+          <w:strike w:val="0"/>
         </w:rPr>
         <w:t>The man looked at him the way the medic looked, all of it at once, and Ben felt himself counted: the gray-blue that didn't fit at the shoulder, the boots, the hand that had gone to his hip and come away. He looked back. A commander. A man who'd knelt on stone recently; the left knee of his fatigues was paler than the right.</w:t>
       </w:r>
@@ -708,6 +787,7 @@
         <w:rPr>
           <w:b w:val="0"/>
           <w:i w:val="0"/>
+          <w:strike w:val="0"/>
         </w:rPr>
         <w:t>Neither of them said what they'd seen. The commander held it a second longer, then nodded once.</w:t>
       </w:r>
@@ -717,6 +797,7 @@
         <w:rPr>
           <w:b w:val="0"/>
           <w:i w:val="0"/>
+          <w:strike w:val="0"/>
         </w:rPr>
         <w:t>"Rohan. Terminal in the locker. Slot's the empty one."</w:t>
       </w:r>
@@ -726,6 +807,7 @@
         <w:rPr>
           <w:b w:val="0"/>
           <w:i w:val="0"/>
+          <w:strike w:val="0"/>
         </w:rPr>
         <w:t>Ben unbuckled the ring's terminal and laid it in the drawer, and the drawer sighed shut on it. The city had stopped talking to him. He hadn't known it had been.</w:t>
       </w:r>
@@ -735,6 +817,7 @@
         <w:rPr>
           <w:b w:val="0"/>
           <w:i w:val="0"/>
+          <w:strike w:val="0"/>
         </w:rPr>
         <w:t>"Shoes," said a woman's voice from inside. "Walk on the gaps."</w:t>
       </w:r>
@@ -744,6 +827,7 @@
         <w:rPr>
           <w:b w:val="0"/>
           <w:i w:val="0"/>
+          <w:strike w:val="0"/>
         </w:rPr>
         <w:t>She was on the floor among her columns, and she didn't look up.</w:t>
       </w:r>
@@ -753,6 +837,7 @@
         <w:rPr>
           <w:b w:val="0"/>
           <w:i w:val="0"/>
+          <w:strike w:val="0"/>
         </w:rPr>
         <w:t>Four strips of paper ran from the wall to the door, held at their corners by pencils and a tin cup and a whetstone and one glove. Every sheet was dated in the same small level hand. A brass pin in the fourth wall panel, pushed in crooked, and two sheets pinned a finger's width clear of it on either side.</w:t>
       </w:r>
@@ -762,6 +847,7 @@
         <w:rPr>
           <w:b w:val="0"/>
           <w:i w:val="0"/>
+          <w:strike w:val="0"/>
         </w:rPr>
         <w:t>He counted the room without deciding to. Her. Rohan, shutting the door. And in the corner beside the locker, a man.</w:t>
       </w:r>
@@ -771,6 +857,7 @@
         <w:rPr>
           <w:b w:val="0"/>
           <w:i w:val="0"/>
+          <w:strike w:val="0"/>
         </w:rPr>
         <w:t>Medium height. Medium everything. A face you'd call a wall if you called it anything. Ben's eyes went over the corner, and registered a wall, and came back, because that was what his eyes did when something was standing in one of the holes between people. A small white nick through the left eyebrow, old. A collar turned so the frayed side was in.</w:t>
       </w:r>
@@ -780,6 +867,7 @@
         <w:rPr>
           <w:b w:val="0"/>
           <w:i w:val="0"/>
+          <w:strike w:val="0"/>
         </w:rPr>
         <w:t>The man in the corner looked at him. Nothing in the face moved. But the eyes, which had been resting on nothing, came onto Ben and stayed, and Ben had the sense of a door that had never once been tried finding a hand on it.</w:t>
       </w:r>
@@ -789,6 +877,7 @@
         <w:rPr>
           <w:b w:val="0"/>
           <w:i w:val="0"/>
+          <w:strike w:val="0"/>
         </w:rPr>
         <w:t>"Three of us," Rohan said. "Nayan. Me. You."</w:t>
       </w:r>
@@ -798,6 +887,7 @@
         <w:rPr>
           <w:b w:val="0"/>
           <w:i w:val="0"/>
+          <w:strike w:val="0"/>
         </w:rPr>
         <w:t>"Four," Ben said.</w:t>
       </w:r>
@@ -807,6 +897,7 @@
         <w:rPr>
           <w:b w:val="0"/>
           <w:i w:val="0"/>
+          <w:strike w:val="0"/>
         </w:rPr>
         <w:t>Rohan looked at the corner, and at Ben, and his jaw shifted once.</w:t>
       </w:r>
@@ -816,6 +907,7 @@
         <w:rPr>
           <w:b w:val="0"/>
           <w:i w:val="0"/>
+          <w:strike w:val="0"/>
         </w:rPr>
         <w:t>"Kaan. He'll give you his hand after. He doesn't give it before." Rohan held Ben's eyes. "How did you see him?"</w:t>
       </w:r>
@@ -825,6 +917,7 @@
         <w:rPr>
           <w:b w:val="0"/>
           <w:i w:val="0"/>
+          <w:strike w:val="0"/>
         </w:rPr>
         <w:t>"My friend Otto stands like that," Ben said. "An old man in a shed taught him. You stop seeing him, and then you do."</w:t>
       </w:r>
@@ -834,6 +927,7 @@
         <w:rPr>
           <w:b w:val="0"/>
           <w:i w:val="0"/>
+          <w:strike w:val="0"/>
         </w:rPr>
         <w:t>Rohan didn't answer. Ben saw him put it somewhere.</w:t>
       </w:r>
@@ -843,6 +937,7 @@
         <w:rPr>
           <w:b w:val="0"/>
           <w:i w:val="0"/>
+          <w:strike w:val="0"/>
         </w:rPr>
         <w:t>The woman on the floor sat back on her heels and took the pencil out of her teeth.</w:t>
       </w:r>
@@ -852,6 +947,7 @@
         <w:rPr>
           <w:b w:val="0"/>
           <w:i w:val="0"/>
+          <w:strike w:val="0"/>
         </w:rPr>
         <w:t>"Read me Chanakya. Third year, autumn."</w:t>
       </w:r>
@@ -861,6 +957,7 @@
         <w:rPr>
           <w:b w:val="0"/>
           <w:i w:val="0"/>
+          <w:strike w:val="0"/>
         </w:rPr>
         <w:t>He found the column, second from the shaft, walked the gaps to it in his socks, and knelt on the left, because she numbered the right.</w:t>
       </w:r>
@@ -870,6 +967,7 @@
         <w:rPr>
           <w:b w:val="0"/>
           <w:i w:val="0"/>
+          <w:strike w:val="0"/>
         </w:rPr>
         <w:t>He read it aloud as he'd read the screens for the man with the crackers: flat, in order, nothing added. Filter media. Survey fee. Lamp oil. When he reached the forty-day line he read it like the rest and went on past, because stopping on it would have been a kind of speech.</w:t>
       </w:r>
@@ -879,6 +977,7 @@
         <w:rPr>
           <w:b w:val="0"/>
           <w:i w:val="0"/>
+          <w:strike w:val="0"/>
         </w:rPr>
         <w:t>She let him reach the bottom of the page. "Again. Across. Same date, all four. I want to see if you can."</w:t>
       </w:r>
@@ -888,6 +987,7 @@
         <w:rPr>
           <w:b w:val="0"/>
           <w:i w:val="0"/>
+          <w:strike w:val="0"/>
         </w:rPr>
         <w:t>He could. He did it on his knees, hands on his thighs so they wouldn't touch her paper, and the columns stopped being columns and became one thing with a grain in it, and he followed the grain.</w:t>
       </w:r>
@@ -897,6 +997,7 @@
         <w:rPr>
           <w:b w:val="0"/>
           <w:i w:val="0"/>
+          <w:strike w:val="0"/>
         </w:rPr>
         <w:t>Forty days. Bearings, filters, dressings, paper. He followed it year by year toward the door, and somewhere in the fourth year his eye caught on something, and stopped, and he made it go on. It went on a beat too late.</w:t>
       </w:r>
@@ -906,6 +1007,7 @@
         <w:rPr>
           <w:b w:val="0"/>
           <w:i w:val="0"/>
+          <w:strike w:val="0"/>
         </w:rPr>
         <w:t>He knew why. He knew whose cellar the paper was in. He'd eaten off a tin plate in it last night.</w:t>
       </w:r>
@@ -915,6 +1017,7 @@
         <w:rPr>
           <w:b w:val="0"/>
           <w:i w:val="0"/>
+          <w:strike w:val="0"/>
         </w:rPr>
         <w:t>Nayan was looking at him. She'd been looking for a while.</w:t>
       </w:r>
@@ -924,6 +1027,7 @@
         <w:rPr>
           <w:b w:val="0"/>
           <w:i w:val="0"/>
+          <w:strike w:val="0"/>
         </w:rPr>
         <w:t>"You stopped."</w:t>
       </w:r>
@@ -933,6 +1037,7 @@
         <w:rPr>
           <w:b w:val="0"/>
           <w:i w:val="0"/>
+          <w:strike w:val="0"/>
         </w:rPr>
         <w:t>"I'm reading."</w:t>
       </w:r>
@@ -942,6 +1047,7 @@
         <w:rPr>
           <w:b w:val="0"/>
           <w:i w:val="0"/>
+          <w:strike w:val="0"/>
         </w:rPr>
         <w:t>"No. You were reading. Then you stopped." She came down the column on her knees to where his eyes had been, and read it herself, and then read across. "Forty-seven," she said. "Not forty. All four." She went down a year, and another, fast. "Here. Here. Once a year, a week late, and never the same week." She sat back on her heels. "I read down. I've only ever read down. What's it waiting for?"</w:t>
       </w:r>
@@ -951,6 +1057,7 @@
         <w:rPr>
           <w:b w:val="0"/>
           <w:i w:val="0"/>
+          <w:strike w:val="0"/>
         </w:rPr>
         <w:t xml:space="preserve">He opened his mouth to say </w:t>
       </w:r>
@@ -958,6 +1065,7 @@
         <w:rPr>
           <w:b w:val="0"/>
           <w:i/>
+          <w:strike w:val="0"/>
         </w:rPr>
         <w:t>I don't know</w:t>
       </w:r>
@@ -965,6 +1073,7 @@
         <w:rPr>
           <w:b w:val="0"/>
           <w:i w:val="0"/>
+          <w:strike w:val="0"/>
         </w:rPr>
         <w:t>, and it wasn't true, so he shut it again.</w:t>
       </w:r>
@@ -974,6 +1083,7 @@
         <w:rPr>
           <w:b w:val="0"/>
           <w:i w:val="0"/>
+          <w:strike w:val="0"/>
         </w:rPr>
         <w:t>The silence went on long enough that Rohan turned from the wall. Kaan hadn't moved.</w:t>
       </w:r>
@@ -983,6 +1093,7 @@
         <w:rPr>
           <w:b w:val="0"/>
           <w:i w:val="0"/>
+          <w:strike w:val="0"/>
         </w:rPr>
         <w:t>"There's a thing I can't tell you," Ben said at last. "It isn't that I won't. I gave my word before I came up, and I'm not going to lie to you to keep it, so this is what you get instead. I don't know how it works, any of it. I know there's a reason it's late, and I'm not allowed to say the reason." He kept his hand off his hip. "You can throw me out. You'd be right to."</w:t>
       </w:r>
@@ -992,6 +1103,7 @@
         <w:rPr>
           <w:b w:val="0"/>
           <w:i w:val="0"/>
+          <w:strike w:val="0"/>
         </w:rPr>
         <w:t>Nayan looked at him over the pencil for a long while.</w:t>
       </w:r>
@@ -1001,6 +1113,7 @@
         <w:rPr>
           <w:b w:val="0"/>
           <w:i w:val="0"/>
+          <w:strike w:val="0"/>
         </w:rPr>
         <w:t>"I don't know his real name," she said, and tipped her head at Rohan. "Six years. He doesn't know mine. The man in the corner's never said a word in my hearing." She bent back to the sheet. "Nobody in this room gets to be angry about what somebody else won't say. Help me mark the late weeks."</w:t>
       </w:r>
@@ -1010,6 +1123,7 @@
         <w:rPr>
           <w:b w:val="0"/>
           <w:i w:val="0"/>
+          <w:strike w:val="0"/>
         </w:rPr>
         <w:t>She drew the squares; he found them. It took an hour, and he was good at it, and he liked it.</w:t>
       </w:r>
@@ -1019,6 +1133,7 @@
         <w:rPr>
           <w:b w:val="0"/>
           <w:i w:val="0"/>
+          <w:strike w:val="0"/>
         </w:rPr>
         <w:t>Kaan came out of the corner when they were done.</w:t>
       </w:r>
@@ -1028,6 +1143,7 @@
         <w:rPr>
           <w:b w:val="0"/>
           <w:i w:val="0"/>
+          <w:strike w:val="0"/>
         </w:rPr>
         <w:t>He crossed the room on the gaps, crouched, and took a pencil stub and a scrap of the house's cheap tag paper from inside his coat. Block letters, pressed in hard. He laid the scrap on the stone in front of Ben and took his hand off it, and his eyes came up to Ben's face and held there, as they had at the door.</w:t>
       </w:r>
@@ -1037,6 +1153,7 @@
         <w:rPr>
           <w:b w:val="0"/>
           <w:i w:val="0"/>
+          <w:strike w:val="0"/>
         </w:rPr>
         <w:t>A number. Long, with a letter in it. Nothing else.</w:t>
       </w:r>
@@ -1046,6 +1163,7 @@
         <w:rPr>
           <w:b w:val="0"/>
           <w:i w:val="0"/>
+          <w:strike w:val="0"/>
         </w:rPr>
         <w:t>"From a slip in a coat," Rohan said. "In Chanakya. The analyst's carried it three years."</w:t>
       </w:r>
@@ -1055,6 +1173,7 @@
         <w:rPr>
           <w:b w:val="0"/>
           <w:i w:val="0"/>
+          <w:strike w:val="0"/>
         </w:rPr>
         <w:t>Nayan was already moving. From under the tin cup she drew a thinner sheaf, and from under that a thinner one still, and laid a sheet beside Kaan's scrap without touching either.</w:t>
       </w:r>
@@ -1064,6 +1183,7 @@
         <w:rPr>
           <w:b w:val="0"/>
           <w:i w:val="0"/>
+          <w:strike w:val="0"/>
         </w:rPr>
         <w:t xml:space="preserve">Chanakya's records archive. Custody. File numbers, and beside each a name: </w:t>
       </w:r>
@@ -1071,6 +1191,7 @@
         <w:rPr>
           <w:b w:val="0"/>
           <w:i/>
+          <w:strike w:val="0"/>
         </w:rPr>
         <w:t>released to</w:t>
       </w:r>
@@ -1078,6 +1199,7 @@
         <w:rPr>
           <w:b w:val="0"/>
           <w:i w:val="0"/>
+          <w:strike w:val="0"/>
         </w:rPr>
         <w:t xml:space="preserve">, </w:t>
       </w:r>
@@ -1085,6 +1207,7 @@
         <w:rPr>
           <w:b w:val="0"/>
           <w:i/>
+          <w:strike w:val="0"/>
         </w:rPr>
         <w:t>returned by</w:t>
       </w:r>
@@ -1092,6 +1215,7 @@
         <w:rPr>
           <w:b w:val="0"/>
           <w:i w:val="0"/>
+          <w:strike w:val="0"/>
         </w:rPr>
         <w:t>.</w:t>
       </w:r>
@@ -1101,6 +1225,7 @@
         <w:rPr>
           <w:b w:val="0"/>
           <w:i w:val="0"/>
+          <w:strike w:val="0"/>
         </w:rPr>
         <w:t xml:space="preserve">Near the bottom, the same number. Beside it: </w:t>
       </w:r>
@@ -1108,6 +1233,7 @@
         <w:rPr>
           <w:b w:val="0"/>
           <w:i/>
+          <w:strike w:val="0"/>
         </w:rPr>
         <w:t>Source folio. One night. Author's custody. Ravi.</w:t>
       </w:r>
@@ -1115,6 +1241,7 @@
         <w:rPr>
           <w:b w:val="0"/>
           <w:i w:val="0"/>
+          <w:strike w:val="0"/>
         </w:rPr>
         <w:t xml:space="preserve"> A date, the morning of the fourth. The </w:t>
       </w:r>
@@ -1122,6 +1249,7 @@
         <w:rPr>
           <w:b w:val="0"/>
           <w:i/>
+          <w:strike w:val="0"/>
         </w:rPr>
         <w:t>returned by</w:t>
       </w:r>
@@ -1129,6 +1257,7 @@
         <w:rPr>
           <w:b w:val="0"/>
           <w:i w:val="0"/>
+          <w:strike w:val="0"/>
         </w:rPr>
         <w:t xml:space="preserve"> column beside it was empty.</w:t>
       </w:r>
@@ -1138,6 +1267,7 @@
         <w:rPr>
           <w:b w:val="0"/>
           <w:i w:val="0"/>
+          <w:strike w:val="0"/>
         </w:rPr>
         <w:t>"Public," Nayan said. "It sits open on the counter. I copy it every fourth day."</w:t>
       </w:r>
@@ -1147,6 +1277,7 @@
         <w:rPr>
           <w:b w:val="0"/>
           <w:i w:val="0"/>
+          <w:strike w:val="0"/>
         </w:rPr>
         <w:t>One number, written twice, in two hands, by two people who'd never spoken. Ben looked at the two scraps as he'd looked at the crystal, waiting for the pulse.</w:t>
       </w:r>
@@ -1156,6 +1287,7 @@
         <w:rPr>
           <w:b w:val="0"/>
           <w:i w:val="0"/>
+          <w:strike w:val="0"/>
         </w:rPr>
         <w:t>The pulse was the date.</w:t>
       </w:r>
@@ -1165,6 +1297,7 @@
         <w:rPr>
           <w:b w:val="0"/>
           <w:i w:val="0"/>
+          <w:strike w:val="0"/>
         </w:rPr>
         <w:t>"When did you set the appointment?" he said to Kaan. "The one he kept."</w:t>
       </w:r>
@@ -1174,6 +1307,7 @@
         <w:rPr>
           <w:b w:val="0"/>
           <w:i w:val="0"/>
+          <w:strike w:val="0"/>
         </w:rPr>
         <w:t xml:space="preserve">Kaan didn't answer. Rohan did. "A slip in his coat, the morning before. </w:t>
       </w:r>
@@ -1181,6 +1315,7 @@
         <w:rPr>
           <w:b w:val="0"/>
           <w:i/>
+          <w:strike w:val="0"/>
         </w:rPr>
         <w:t>Room Four. Two hours.</w:t>
       </w:r>
@@ -1188,6 +1323,7 @@
         <w:rPr>
           <w:b w:val="0"/>
           <w:i w:val="0"/>
+          <w:strike w:val="0"/>
         </w:rPr>
         <w:t xml:space="preserve"> He went and found a note instead. </w:t>
       </w:r>
@@ -1195,6 +1331,7 @@
         <w:rPr>
           <w:b w:val="0"/>
           <w:i/>
+          <w:strike w:val="0"/>
         </w:rPr>
         <w:t>Tomorrow. Bring what you took.</w:t>
       </w:r>
@@ -1202,6 +1339,7 @@
         <w:rPr>
           <w:b w:val="0"/>
           <w:i w:val="0"/>
+          <w:strike w:val="0"/>
         </w:rPr>
         <w:t>"</w:t>
       </w:r>
@@ -1211,6 +1349,7 @@
         <w:rPr>
           <w:b w:val="0"/>
           <w:i w:val="0"/>
+          <w:strike w:val="0"/>
         </w:rPr>
         <w:t xml:space="preserve">Ben put his finger above the custody line. "Same morning. He signed this out before he ever saw your note." He looked up at Kaan. "Your note said </w:t>
       </w:r>
@@ -1218,6 +1357,7 @@
         <w:rPr>
           <w:b w:val="0"/>
           <w:i/>
+          <w:strike w:val="0"/>
         </w:rPr>
         <w:t>bring</w:t>
       </w:r>
@@ -1225,6 +1365,7 @@
         <w:rPr>
           <w:b w:val="0"/>
           <w:i w:val="0"/>
+          <w:strike w:val="0"/>
         </w:rPr>
         <w:t>. He'd already fetched it. He wanted it in his hands before anyone told him to."</w:t>
       </w:r>
@@ -1234,6 +1375,7 @@
         <w:rPr>
           <w:b w:val="0"/>
           <w:i w:val="0"/>
+          <w:strike w:val="0"/>
         </w:rPr>
         <w:t>Kaan's face did nothing. But he picked up the scrap and set it down again a finger's width closer to the custody page, so the two numbers lay nearly touching. Then Kaan held out his hand.</w:t>
       </w:r>
@@ -1243,6 +1385,7 @@
         <w:rPr>
           <w:b w:val="0"/>
           <w:i w:val="0"/>
+          <w:strike w:val="0"/>
         </w:rPr>
         <w:t>"What is it?" Ben said. "The file."</w:t>
       </w:r>
@@ -1252,6 +1395,7 @@
         <w:rPr>
           <w:b w:val="0"/>
           <w:i w:val="0"/>
+          <w:strike w:val="0"/>
         </w:rPr>
         <w:t>"Sealed above his grade," Nayan said. "Above mine. A case, three years old, filed by him in his first year. That's as far as paper goes."</w:t>
       </w:r>
@@ -1261,6 +1405,7 @@
         <w:rPr>
           <w:b w:val="0"/>
           <w:i w:val="0"/>
+          <w:strike w:val="0"/>
         </w:rPr>
         <w:t>"Then that's where we stop," Rohan said. "A number in two hands, both lawful, both citable. The man who holds it fetching it before he was asked." His jaw worked once along the scar. "That's the other road."</w:t>
       </w:r>
@@ -1270,6 +1415,7 @@
         <w:rPr>
           <w:b w:val="0"/>
           <w:i w:val="0"/>
+          <w:strike w:val="0"/>
         </w:rPr>
         <w:t>Nobody asked him what the first one was. Ben saw the question cross Nayan's face and get put away, and he said nothing either.</w:t>
       </w:r>
@@ -1279,6 +1425,7 @@
         <w:rPr>
           <w:b w:val="0"/>
           <w:i w:val="0"/>
+          <w:strike w:val="0"/>
         </w:rPr>
         <w:t>They gave him a bed in a room with a window. He stood at it in his socks for a long time before he could make himself look down.</w:t>
       </w:r>
@@ -1288,6 +1435,7 @@
         <w:rPr>
           <w:b w:val="0"/>
           <w:i w:val="0"/>
+          <w:strike w:val="0"/>
         </w:rPr>
         <w:t>Cloud, at first. Then the cloud thinned, and the mountain came up through it, grey and brown and enormous, with the lights of the Hub lift like a row of teeth in its flank. He found the pithead. He found the basin, a dull sheet of water catching the last of the light. And there, on its granite shelf a hundred feet up and to the north-east, a scatter of rust and broken shapes, so small from here he could have covered it with his thumb.</w:t>
       </w:r>
@@ -1297,6 +1445,7 @@
         <w:rPr>
           <w:b w:val="0"/>
           <w:i w:val="0"/>
+          <w:strike w:val="0"/>
         </w:rPr>
         <w:t>The Junkyard. He'd never seen it from above.</w:t>
       </w:r>
@@ -1306,6 +1455,7 @@
         <w:rPr>
           <w:b w:val="0"/>
           <w:i w:val="0"/>
+          <w:strike w:val="0"/>
         </w:rPr>
         <w:t xml:space="preserve">Before he slept he took a sheet of the house's ruled paper and wrote one line on it in a small, level hand, as near Nayan's as he could make it. The date in the corner. Then: </w:t>
       </w:r>
@@ -1313,6 +1463,7 @@
         <w:rPr>
           <w:b w:val="0"/>
           <w:i/>
+          <w:strike w:val="0"/>
         </w:rPr>
         <w:t>Forty-seven. One week in every year.</w:t>
       </w:r>
@@ -1320,6 +1471,7 @@
         <w:rPr>
           <w:b w:val="0"/>
           <w:i w:val="0"/>
+          <w:strike w:val="0"/>
         </w:rPr>
         <w:t xml:space="preserve"> In the morning he'd put it in her pile, on the left, where she didn't number.</w:t>
       </w:r>
@@ -1329,6 +1481,7 @@
         <w:rPr>
           <w:b w:val="0"/>
           <w:i w:val="0"/>
+          <w:strike w:val="0"/>
         </w:rPr>
         <w:t>He lay down with the light still in the room, because up here it didn't go out, and put his hand on his hip, and left it there.</w:t>
       </w:r>

</xml_diff>

<commit_message>
Ch24 round 2: Ben reads the empty column; Camilla asks if the arm can be heard; continuity and trims
Co-Authored-By: Claude Opus 5.5 <noreply@anthropic.com>
</commit_message>
<xml_diff>
--- a/claude-notes/manuscript-v2/24-first-contact-merged.docx
+++ b/claude-notes/manuscript-v2/24-first-contact-merged.docx
@@ -53,7 +53,7 @@
           <w:i w:val="0"/>
           <w:strike w:val="0"/>
         </w:rPr>
-        <w:t>Otto was sitting up when they passed his door, which he hadn't been yesterday.</w:t>
+        <w:t>Otto was sitting up when they passed his door. Six days out of the tank, and it was the first time.</w:t>
       </w:r>
     </w:p>
     <w:p>
@@ -241,7 +241,7 @@
           <w:i w:val="0"/>
           <w:strike w:val="0"/>
         </w:rPr>
-        <w:t>"From Drona," Flitzberg said, because she had asked, and he had promised. "The part that listens was built for an instrument the four houses sealed away a century ago. This office copied it, the way it copies what it needs, and Drona's books show Drona buying for itself." He held her eyes. "I have never told anyone that. No one asked."</w:t>
+        <w:t>"From Drona," Flitzberg said, because she had asked, and he had promised. "The part that listens was built for an instrument the four houses sealed away a century ago. Drona swore it burned the plans. This office copied them first, and Drona's books still show Drona buying the parts for itself." He held her eyes. "I have never told anyone that. No one asked."</w:t>
       </w:r>
     </w:p>
     <w:p>
@@ -251,7 +251,7 @@
           <w:i w:val="0"/>
           <w:strike w:val="0"/>
         </w:rPr>
-        <w:t>The metal fingers on her knee closed, late, and she let them. "And the forty days," she said.</w:t>
+        <w:t>The metal fingers on her knee closed, late. She pried them open with her good hand. "Can it be heard? Up there?"</w:t>
       </w:r>
     </w:p>
     <w:p>
@@ -261,7 +261,23 @@
           <w:i w:val="0"/>
           <w:strike w:val="0"/>
         </w:rPr>
-        <w:t>"Every forty days, since the charter was signed. The sum has not changed because this office has not grown. It was built not to." He laid one hand flat on the folder. "Now one woman with a pencil has looked, and her Grandmaster will carry it to the table, and I will be asked to answer it."</w:t>
+        <w:t xml:space="preserve">"Not by anyone in this office," Flitzberg said. "I know of no ear above that could." She believed him exactly as far as the word </w:t>
+      </w:r>
+      <w:r>
+        <w:rPr>
+          <w:b w:val="0"/>
+          <w:i/>
+          <w:strike w:val="0"/>
+        </w:rPr>
+        <w:t>know</w:t>
+      </w:r>
+      <w:r>
+        <w:rPr>
+          <w:b w:val="0"/>
+          <w:i w:val="0"/>
+          <w:strike w:val="0"/>
+        </w:rPr>
+        <w:t>.</w:t>
       </w:r>
     </w:p>
     <w:p>
@@ -271,7 +287,7 @@
           <w:i w:val="0"/>
           <w:strike w:val="0"/>
         </w:rPr>
-        <w:t>"Before our night, or after?" Gage said.</w:t>
+        <w:t>"And the forty days," she said.</w:t>
       </w:r>
     </w:p>
     <w:p>
@@ -281,7 +297,7 @@
           <w:i w:val="0"/>
           <w:strike w:val="0"/>
         </w:rPr>
-        <w:t>"The table names its own day. I had thought of that." He let it sit. "If it names yours, then the city's clock and ours have just become the same clock. I told you you would not feel ready." He opened the folder. "I am going to answer the copyist before it sits. I will send someone to work beside her, under this ring's cover, who reads as she reads, and I will not tell her what he is." His eyes came round to the stool by the door. "Nor will he."</w:t>
+        <w:t>"Every forty days, since the charter was signed. The sum has not changed because this office has not grown. It was built not to." He laid one hand flat on the folder. "Now one woman with a pencil has looked, and her Grandmaster will carry it to the table, and I will be asked to answer it."</w:t>
       </w:r>
     </w:p>
     <w:p>
@@ -291,7 +307,7 @@
           <w:i w:val="0"/>
           <w:strike w:val="0"/>
         </w:rPr>
-        <w:t>"You want him to steer her off us," Camilla said.</w:t>
+        <w:t>"Before our night, or after?" Gage said.</w:t>
       </w:r>
     </w:p>
     <w:p>
@@ -301,7 +317,7 @@
           <w:i w:val="0"/>
           <w:strike w:val="0"/>
         </w:rPr>
-        <w:t>"No. What she hunts is a hand that moves through all four houses, the same hand, I think, that put a number on your brother. She stopped at us because we were lying across her road." His fingers stayed flat on the folder. "I would like her to look past us to what she came for. And I would like to know what this office looks like from her floor. I have only ever seen it from mine."</w:t>
+        <w:t>"The table names its own day. I had thought of that." He let it sit. "If it names yours, then the city's clock and ours have just become the same clock. I told you you would not feel ready." He opened the folder. "I am going to answer the copyist before it sits. I will send someone to work beside her, under this ring's cover, who reads as she reads, and I will not tell her what he is." His eyes came round to the stool by the door. "Nor will he."</w:t>
       </w:r>
     </w:p>
     <w:p>
@@ -311,7 +327,7 @@
           <w:i w:val="0"/>
           <w:strike w:val="0"/>
         </w:rPr>
-        <w:t>Ben had gone very still. His right hand had found his hip.</w:t>
+        <w:t>"You want him to steer her off us," Camilla said.</w:t>
       </w:r>
     </w:p>
     <w:p>
@@ -321,23 +337,7 @@
           <w:i w:val="0"/>
           <w:strike w:val="0"/>
         </w:rPr>
-        <w:t xml:space="preserve">Inside the folder were sheets of thin ruled paper, filled edge to edge in a small upright hand that leaned nowhere. Camilla saw, upside down, the word </w:t>
-      </w:r>
-      <w:r>
-        <w:rPr>
-          <w:b w:val="0"/>
-          <w:i/>
-          <w:strike w:val="0"/>
-        </w:rPr>
-        <w:t>Plan</w:t>
-      </w:r>
-      <w:r>
-        <w:rPr>
-          <w:b w:val="0"/>
-          <w:i w:val="0"/>
-          <w:strike w:val="0"/>
-        </w:rPr>
-        <w:t xml:space="preserve"> at the head of one, and under it a number that wasn't a name.</w:t>
+        <w:t>"No. What she hunts is a hand that moves through all four houses, the same hand, I think, that put a number on your brother. She stopped at us because we were lying across her road." His fingers stayed flat on the folder. "I would like her to look past us to what she came for. And I would like to know what this office looks like from her floor. I have only ever seen it from mine."</w:t>
       </w:r>
     </w:p>
     <w:p>
@@ -347,23 +347,7 @@
           <w:i w:val="0"/>
           <w:strike w:val="0"/>
         </w:rPr>
-        <w:t>"These were written in the trial rooms by an examiner called Sef." He read without raising his voice. "</w:t>
-      </w:r>
-      <w:r>
-        <w:rPr>
-          <w:b w:val="0"/>
-          <w:i/>
-          <w:strike w:val="0"/>
-        </w:rPr>
-        <w:t>Fear present in all four. Reasoning continuous in all four. The girl thinks in exits, the gentle one thinks in patterns, and they listen to each other without ranking.</w:t>
-      </w:r>
-      <w:r>
-        <w:rPr>
-          <w:b w:val="0"/>
-          <w:i w:val="0"/>
-          <w:strike w:val="0"/>
-        </w:rPr>
-        <w:t>"</w:t>
+        <w:t>Ben had gone very still.</w:t>
       </w:r>
     </w:p>
     <w:p>
@@ -373,7 +357,23 @@
           <w:i w:val="0"/>
           <w:strike w:val="0"/>
         </w:rPr>
-        <w:t>The plucked thing failed its run of notes again and began it over.</w:t>
+        <w:t xml:space="preserve">Inside the folder were sheets of thin ruled paper, filled edge to edge in a small upright hand that leaned nowhere. Camilla saw, upside down, the word </w:t>
+      </w:r>
+      <w:r>
+        <w:rPr>
+          <w:b w:val="0"/>
+          <w:i/>
+          <w:strike w:val="0"/>
+        </w:rPr>
+        <w:t>Plan</w:t>
+      </w:r>
+      <w:r>
+        <w:rPr>
+          <w:b w:val="0"/>
+          <w:i w:val="0"/>
+          <w:strike w:val="0"/>
+        </w:rPr>
+        <w:t xml:space="preserve"> at the head of one, and under it a number that wasn't a name.</w:t>
       </w:r>
     </w:p>
     <w:p>
@@ -383,7 +383,7 @@
           <w:i w:val="0"/>
           <w:strike w:val="0"/>
         </w:rPr>
-        <w:t xml:space="preserve">"Under </w:t>
+        <w:t>"These were written in the trial rooms by an examiner called Sef." He read without raising his voice. "</w:t>
       </w:r>
       <w:r>
         <w:rPr>
@@ -391,7 +391,7 @@
           <w:i/>
           <w:strike w:val="0"/>
         </w:rPr>
-        <w:t>Control</w:t>
+        <w:t>Fear present in all four. Reasoning continuous in all four. The girl thinks in exits, the gentle one thinks in patterns, and they listen to each other without ranking.</w:t>
       </w:r>
       <w:r>
         <w:rPr>
@@ -399,55 +399,7 @@
           <w:i w:val="0"/>
           <w:strike w:val="0"/>
         </w:rPr>
-        <w:t xml:space="preserve">: </w:t>
-      </w:r>
-      <w:r>
-        <w:rPr>
-          <w:b w:val="0"/>
-          <w:i/>
-          <w:strike w:val="0"/>
-        </w:rPr>
-        <w:t>The strong one spent his strength making the others stronger.</w:t>
-      </w:r>
-      <w:r>
-        <w:rPr>
-          <w:b w:val="0"/>
-          <w:i w:val="0"/>
-          <w:strike w:val="0"/>
-        </w:rPr>
-        <w:t xml:space="preserve">" He closed the folder. "Sef asked me, that night, for an assessment. </w:t>
-      </w:r>
-      <w:r>
-        <w:rPr>
-          <w:b w:val="0"/>
-          <w:i/>
-          <w:strike w:val="0"/>
-        </w:rPr>
-        <w:t>Unlikely heroes,</w:t>
-      </w:r>
-      <w:r>
-        <w:rPr>
-          <w:b w:val="0"/>
-          <w:i w:val="0"/>
-          <w:strike w:val="0"/>
-        </w:rPr>
-        <w:t xml:space="preserve"> I told her. </w:t>
-      </w:r>
-      <w:r>
-        <w:rPr>
-          <w:b w:val="0"/>
-          <w:i/>
-          <w:strike w:val="0"/>
-        </w:rPr>
-        <w:t>Possible.</w:t>
-      </w:r>
-      <w:r>
-        <w:rPr>
-          <w:b w:val="0"/>
-          <w:i w:val="0"/>
-          <w:strike w:val="0"/>
-        </w:rPr>
-        <w:t xml:space="preserve"> Sef wrote it down. Sef writes everything down." He looked at Ben. "Ashoka's copyist does too. You will like her, I think. She will not like you for several hours."</w:t>
+        <w:t>"</w:t>
       </w:r>
     </w:p>
     <w:p>
@@ -457,7 +409,7 @@
           <w:i w:val="0"/>
           <w:strike w:val="0"/>
         </w:rPr>
-        <w:t>"He's the shift," Gage said.</w:t>
+        <w:t>The plucked thing failed its run of notes again and began it over.</w:t>
       </w:r>
     </w:p>
     <w:p>
@@ -467,7 +419,71 @@
           <w:i w:val="0"/>
           <w:strike w:val="0"/>
         </w:rPr>
-        <w:t>Three words. His hands had come up off his sides and stayed open, showing Flitzberg they were empty.</w:t>
+        <w:t xml:space="preserve">"Under </w:t>
+      </w:r>
+      <w:r>
+        <w:rPr>
+          <w:b w:val="0"/>
+          <w:i/>
+          <w:strike w:val="0"/>
+        </w:rPr>
+        <w:t>Control</w:t>
+      </w:r>
+      <w:r>
+        <w:rPr>
+          <w:b w:val="0"/>
+          <w:i w:val="0"/>
+          <w:strike w:val="0"/>
+        </w:rPr>
+        <w:t xml:space="preserve">: </w:t>
+      </w:r>
+      <w:r>
+        <w:rPr>
+          <w:b w:val="0"/>
+          <w:i/>
+          <w:strike w:val="0"/>
+        </w:rPr>
+        <w:t>The strong one spent his strength making the others stronger.</w:t>
+      </w:r>
+      <w:r>
+        <w:rPr>
+          <w:b w:val="0"/>
+          <w:i w:val="0"/>
+          <w:strike w:val="0"/>
+        </w:rPr>
+        <w:t xml:space="preserve">" He closed the folder. "Sef asked me, that night, for an assessment. </w:t>
+      </w:r>
+      <w:r>
+        <w:rPr>
+          <w:b w:val="0"/>
+          <w:i/>
+          <w:strike w:val="0"/>
+        </w:rPr>
+        <w:t>Unlikely heroes,</w:t>
+      </w:r>
+      <w:r>
+        <w:rPr>
+          <w:b w:val="0"/>
+          <w:i w:val="0"/>
+          <w:strike w:val="0"/>
+        </w:rPr>
+        <w:t xml:space="preserve"> I told her. </w:t>
+      </w:r>
+      <w:r>
+        <w:rPr>
+          <w:b w:val="0"/>
+          <w:i/>
+          <w:strike w:val="0"/>
+        </w:rPr>
+        <w:t>Possible.</w:t>
+      </w:r>
+      <w:r>
+        <w:rPr>
+          <w:b w:val="0"/>
+          <w:i w:val="0"/>
+          <w:strike w:val="0"/>
+        </w:rPr>
+        <w:t xml:space="preserve"> Sef wrote it down. Sef writes everything down." He looked at Ben. "Ashoka's copyist does too. You will like her, I think."</w:t>
       </w:r>
     </w:p>
     <w:p>
@@ -477,7 +493,7 @@
           <w:i w:val="0"/>
           <w:strike w:val="0"/>
         </w:rPr>
-        <w:t>"He is."</w:t>
+        <w:t>"He's the shift," Gage said.</w:t>
       </w:r>
     </w:p>
     <w:p>
@@ -487,23 +503,7 @@
           <w:i w:val="0"/>
           <w:strike w:val="0"/>
         </w:rPr>
-        <w:t xml:space="preserve">"Five nights. He counts the men off the Hub. Nobody else can." Gage looked at Ben, and his voice stayed where it was, which Camilla knew cost him. "You go up there, and something keeps you, and I'm at that wall with Cami saying </w:t>
-      </w:r>
-      <w:r>
-        <w:rPr>
-          <w:b w:val="0"/>
-          <w:i/>
-          <w:strike w:val="0"/>
-        </w:rPr>
-        <w:t>feeds</w:t>
-      </w:r>
-      <w:r>
-        <w:rPr>
-          <w:b w:val="0"/>
-          <w:i w:val="0"/>
-          <w:strike w:val="0"/>
-        </w:rPr>
-        <w:t xml:space="preserve"> into an empty count."</w:t>
+        <w:t>Three words. His hands had come up off his sides and stayed open, showing Flitzberg they were empty.</w:t>
       </w:r>
     </w:p>
     <w:p>
@@ -513,7 +513,7 @@
           <w:i w:val="0"/>
           <w:strike w:val="0"/>
         </w:rPr>
-        <w:t>"I know," Ben said.</w:t>
+        <w:t>"He is."</w:t>
       </w:r>
     </w:p>
     <w:p>
@@ -523,7 +523,23 @@
           <w:i w:val="0"/>
           <w:strike w:val="0"/>
         </w:rPr>
-        <w:t>"Then say no."</w:t>
+        <w:t xml:space="preserve">"Five nights. He counts the men off the Hub. Nobody else can." Gage looked at Ben, and his voice stayed where it was, which Camilla knew cost him. "You go up there, and something keeps you, and I'm at that wall with Cami saying </w:t>
+      </w:r>
+      <w:r>
+        <w:rPr>
+          <w:b w:val="0"/>
+          <w:i/>
+          <w:strike w:val="0"/>
+        </w:rPr>
+        <w:t>feeds</w:t>
+      </w:r>
+      <w:r>
+        <w:rPr>
+          <w:b w:val="0"/>
+          <w:i w:val="0"/>
+          <w:strike w:val="0"/>
+        </w:rPr>
+        <w:t xml:space="preserve"> into an empty count."</w:t>
       </w:r>
     </w:p>
     <w:p>
@@ -533,7 +549,7 @@
           <w:i w:val="0"/>
           <w:strike w:val="0"/>
         </w:rPr>
-        <w:t>Ben's hand pressed flat over the pocket that wasn't there. He was looking at the join in the floor plates between his boots, and Camilla knew the look; he'd worn it kneeling over her shoulder with a spray can, reading what the wound needed before he let himself feel anything about it.</w:t>
+        <w:t>"I know," Ben said.</w:t>
       </w:r>
     </w:p>
     <w:p>
@@ -543,7 +559,7 @@
           <w:i w:val="0"/>
           <w:strike w:val="0"/>
         </w:rPr>
-        <w:t>"I'm scared of it," he said. "Up there. All that light, and everyone's wrist talking. I'm scared I'll look at the wrong thing and someone'll see me looking." He lifted his head. "And I'm scared of what I'll do with a wall of somebody else's paper in front of me, because I'll be good at it. Same as the screens. And up there I might start to like it." He breathed in. "I want to go anyway. That's the truth, so I'm saying it."</w:t>
+        <w:t>"Then say no."</w:t>
       </w:r>
     </w:p>
     <w:p>
@@ -553,7 +569,7 @@
           <w:i w:val="0"/>
           <w:strike w:val="0"/>
         </w:rPr>
-        <w:t>Gage looked at him for a long time, and then he looked at her. They all did.</w:t>
+        <w:t>Ben's hand pressed flat over the pocket that wasn't there. He was looking at the join in the floor plates between his boots, and Camilla knew the look; he'd worn it kneeling over her shoulder with a spray can, reading what the wound needed before he let himself feel anything about it.</w:t>
       </w:r>
     </w:p>
     <w:p>
@@ -563,7 +579,7 @@
           <w:i w:val="0"/>
           <w:strike w:val="0"/>
         </w:rPr>
-        <w:t>She thought about the box on her bench, which still couldn't tell rock from footsteps.</w:t>
+        <w:t>"I'm scared of it," he said. "Up there. All that light, and everyone's wrist talking. I'm scared I'll look at the wrong thing and someone'll see me looking." He lifted his head. "And I'm scared of what I'll do with a wall of somebody else's paper in front of me, because I'll be good at it. Same as the screens. And up there I might start to like it." He breathed in. "I want to go anyway. That's the truth, so I'm saying it."</w:t>
       </w:r>
     </w:p>
     <w:p>
@@ -573,7 +589,7 @@
           <w:i w:val="0"/>
           <w:strike w:val="0"/>
         </w:rPr>
-        <w:t>"How long," she said.</w:t>
+        <w:t>Gage looked at him for a long time, and then he looked at her. They all did.</w:t>
       </w:r>
     </w:p>
     <w:p>
@@ -583,7 +599,7 @@
           <w:i w:val="0"/>
           <w:strike w:val="0"/>
         </w:rPr>
-        <w:t>"Up tomorrow. Two nights there, in a bed Ashoka will give him under a name that is not his. Back by the third night."</w:t>
+        <w:t>She thought about the box on her bench, which still couldn't tell rock from footsteps.</w:t>
       </w:r>
     </w:p>
     <w:p>
@@ -593,7 +609,7 @@
           <w:i w:val="0"/>
           <w:strike w:val="0"/>
         </w:rPr>
-        <w:t>"Last rehearsal's the third night."</w:t>
+        <w:t>"How long," she said.</w:t>
       </w:r>
     </w:p>
     <w:p>
@@ -603,7 +619,7 @@
           <w:i w:val="0"/>
           <w:strike w:val="0"/>
         </w:rPr>
-        <w:t>"Then he will be at it."</w:t>
+        <w:t>"Up tomorrow. Two nights there, in a bed Ashoka will give him under a name that is not his. Back by the third night."</w:t>
       </w:r>
     </w:p>
     <w:p>
@@ -613,7 +629,7 @@
           <w:i w:val="0"/>
           <w:strike w:val="0"/>
         </w:rPr>
-        <w:t>"He'd better be." She made the metal hand lie flat on her knee. "He goes. If you're not on that stool when the glass turns over, Ben, I call it without you." Her voice didn't move. "I'll hate it. I'll still call it."</w:t>
+        <w:t>"Last rehearsal's the third night."</w:t>
       </w:r>
     </w:p>
     <w:p>
@@ -623,7 +639,7 @@
           <w:i w:val="0"/>
           <w:strike w:val="0"/>
         </w:rPr>
-        <w:t>Gage's hands went back to his sides. He didn't close them.</w:t>
+        <w:t>"Then he will be at it."</w:t>
       </w:r>
     </w:p>
     <w:p>
@@ -633,7 +649,7 @@
           <w:i w:val="0"/>
           <w:strike w:val="0"/>
         </w:rPr>
-        <w:t>"Three terms," Flitzberg said to Ben, "and they are mine, not the office's. You will not name this ring, to anyone, under anything. You will not lie to them. If a lie is the only thing between you and harm, you tell it, and you tell me afterward; that is the one door I leave open, and I am telling you plainly so you will know where it is." He stood. "And you will come home. The count is Gage's reason. Mine is that you are owed one."</w:t>
+        <w:t>"He'd better be." She made the metal hand lie flat on her knee. "He goes. If you're not on that stool when the glass turns over, Ben, I call it without you." Her voice didn't move. "I'll hate it. I'll still call it."</w:t>
       </w:r>
     </w:p>
     <w:p>
@@ -643,7 +659,7 @@
           <w:i w:val="0"/>
           <w:strike w:val="0"/>
         </w:rPr>
-        <w:t>"Right," Ben said. His voice had gone thin, and he cleared it. "Right."</w:t>
+        <w:t>Gage's hands went back to his sides. He didn't close them.</w:t>
       </w:r>
     </w:p>
     <w:p>
@@ -653,7 +669,7 @@
           <w:i w:val="0"/>
           <w:strike w:val="0"/>
         </w:rPr>
-        <w:t>---</w:t>
+        <w:t>"Three terms," Flitzberg said to Ben, "and they are mine, not the office's. You will not name this ring, to anyone, under anything. You will not lie to them. If a lie is the only thing between you and harm, you tell it, and you tell me afterward; that is the one door I leave open, and I am telling you plainly so you will know where it is." He stood. "And you will come home. The count is Gage's reason. Mine is that you are owed one."</w:t>
       </w:r>
     </w:p>
     <w:p>
@@ -663,7 +679,7 @@
           <w:i w:val="0"/>
           <w:strike w:val="0"/>
         </w:rPr>
-        <w:t>The lift went up for a long time.</w:t>
+        <w:t>"Right," Ben said. His voice had gone thin, and he cleared it. "Right."</w:t>
       </w:r>
     </w:p>
     <w:p>
@@ -673,7 +689,7 @@
           <w:i w:val="0"/>
           <w:strike w:val="0"/>
         </w:rPr>
-        <w:t>Ben lost count of the floors at sixty-something, and when the doors opened the first thing that came in was the air.</w:t>
+        <w:t>---</w:t>
       </w:r>
     </w:p>
     <w:p>
@@ -683,7 +699,7 @@
           <w:i w:val="0"/>
           <w:strike w:val="0"/>
         </w:rPr>
-        <w:t>It smelled of nothing. No sulfur, no coal-sweat, no people. A faint sweetness under it like washed stone.</w:t>
+        <w:t>The lift went up for a long time.</w:t>
       </w:r>
     </w:p>
     <w:p>
@@ -693,7 +709,7 @@
           <w:i w:val="0"/>
           <w:strike w:val="0"/>
         </w:rPr>
-        <w:t>The lower stacks were a cellar of shelving, and a door at the end of them opened onto the sky.</w:t>
+        <w:t>Ben lost count of the floors at sixty-something, and when the doors opened the first thing that came in was the air.</w:t>
       </w:r>
     </w:p>
     <w:p>
@@ -703,7 +719,7 @@
           <w:i w:val="0"/>
           <w:strike w:val="0"/>
         </w:rPr>
-        <w:t>The light came from everywhere, in his eyes and on the backs of his hands, and he had to look at the floor. Someone had cut a thin groove along it for the rain.</w:t>
+        <w:t>It smelled of nothing. No sulfur, no coal-sweat, no people. A faint sweetness under it like washed stone.</w:t>
       </w:r>
     </w:p>
     <w:p>
@@ -713,7 +729,7 @@
           <w:i w:val="0"/>
           <w:strike w:val="0"/>
         </w:rPr>
-        <w:t>People went past him. Nobody looked, because nothing on their wrists had told them to. His own said what the ring had set it to say: RUNNER, LOWER STACKS, DRONA, and a number. He was no one. He was a boy with paper.</w:t>
+        <w:t>The lower stacks were a cellar of shelving, and a door at the end of them opened onto the sky.</w:t>
       </w:r>
     </w:p>
     <w:p>
@@ -723,7 +739,7 @@
           <w:i w:val="0"/>
           <w:strike w:val="0"/>
         </w:rPr>
-        <w:t>He thought of the gates. He couldn't help it. Somewhere under his boots, under the rock and the cloud and the sixty-odd floors, Gretchen was standing on a worn patch of dirt with a scarf over her hair, and he was up here where nobody coughed, and the two facts wouldn't sit in the same chest. He put his hand on his hip.</w:t>
+        <w:t>The light came from everywhere, in his eyes and on the backs of his hands, and he had to look at the floor. Someone had cut a thin groove along it for the rain.</w:t>
       </w:r>
     </w:p>
     <w:p>
@@ -733,7 +749,7 @@
           <w:i w:val="0"/>
           <w:strike w:val="0"/>
         </w:rPr>
-        <w:t>Nothing there. There hadn't been anything there since a room full of orange light, and his hand went anyway.</w:t>
+        <w:t>People went past him. Nobody looked, because nothing on their wrists had told them to. His own said what the ring had set it to say: RUNNER, LOWER STACKS, DRONA, and a number.</w:t>
       </w:r>
     </w:p>
     <w:p>
@@ -743,7 +759,7 @@
           <w:i w:val="0"/>
           <w:strike w:val="0"/>
         </w:rPr>
-        <w:t>---</w:t>
+        <w:t>He thought of the gates. He couldn't help it. Somewhere under his boots, under the rock and the cloud and the sixty-odd floors, Gretchen was standing on a worn patch of dirt with a scarf over her hair, and he was up here where nobody coughed, and the two facts wouldn't sit in the same chest. He put his hand on his hip.</w:t>
       </w:r>
     </w:p>
     <w:p>
@@ -753,23 +769,7 @@
           <w:i w:val="0"/>
           <w:strike w:val="0"/>
         </w:rPr>
-        <w:t xml:space="preserve">A maglev took him across the open dark to Trinity-3. Ashoka was red-black and quieter, and its stone was old. He went down three flights worn hollow in the middle by feet, and at the bottom there was a door with </w:t>
-      </w:r>
-      <w:r>
-        <w:rPr>
-          <w:b w:val="0"/>
-          <w:i/>
-          <w:strike w:val="0"/>
-        </w:rPr>
-        <w:t>dead room</w:t>
-      </w:r>
-      <w:r>
-        <w:rPr>
-          <w:b w:val="0"/>
-          <w:i w:val="0"/>
-          <w:strike w:val="0"/>
-        </w:rPr>
-        <w:t xml:space="preserve"> on it in plain white paint, and a man in front of it.</w:t>
+        <w:t>Nothing there. There hadn't been anything there since a room full of orange light, and his hand went anyway.</w:t>
       </w:r>
     </w:p>
     <w:p>
@@ -779,7 +779,7 @@
           <w:i w:val="0"/>
           <w:strike w:val="0"/>
         </w:rPr>
-        <w:t>Twenty-one, maybe. Red-black, no insignia. A scar along the jaw, old and pale. The third knuckle of the right hand split and glued and split again; a knuckle went like that when they met bone a lot. He stood as nobody in Miner Town stood, settled, as if the floor had asked him and he'd agreed to it.</w:t>
+        <w:t>---</w:t>
       </w:r>
     </w:p>
     <w:p>
@@ -789,7 +789,23 @@
           <w:i w:val="0"/>
           <w:strike w:val="0"/>
         </w:rPr>
-        <w:t>"She said they'd send someone who reads patterns."</w:t>
+        <w:t xml:space="preserve">A maglev took him across the open air to Trinity-3. Ashoka was red-black and quieter, and its stone was old. He went down three flights worn hollow in the middle by feet, and at the bottom there was a door with </w:t>
+      </w:r>
+      <w:r>
+        <w:rPr>
+          <w:b w:val="0"/>
+          <w:i/>
+          <w:strike w:val="0"/>
+        </w:rPr>
+        <w:t>dead room</w:t>
+      </w:r>
+      <w:r>
+        <w:rPr>
+          <w:b w:val="0"/>
+          <w:i w:val="0"/>
+          <w:strike w:val="0"/>
+        </w:rPr>
+        <w:t xml:space="preserve"> on it in plain white paint, and a man in front of it.</w:t>
       </w:r>
     </w:p>
     <w:p>
@@ -799,7 +815,7 @@
           <w:i w:val="0"/>
           <w:strike w:val="0"/>
         </w:rPr>
-        <w:t>"I'm the runner."</w:t>
+        <w:t>Twenty-one, maybe. Red-black, no insignia. A scar along the jaw, old and pale. The third knuckle of the right hand split and glued and split again; a knuckle went like that when they met bone a lot. He stood as nobody in Miner Town stood, settled, as if the floor had asked him and he'd agreed to it.</w:t>
       </w:r>
     </w:p>
     <w:p>
@@ -809,7 +825,7 @@
           <w:i w:val="0"/>
           <w:strike w:val="0"/>
         </w:rPr>
-        <w:t>The man looked at him the way the medic looked, all of it at once, and Ben felt himself counted: the gray-blue that didn't fit at the shoulder, the boots, the hand that had gone to his hip and come away. He looked back. A commander. A man who'd knelt on stone recently; the left knee of his fatigues was paler than the right.</w:t>
+        <w:t>"She said they'd send someone who reads patterns."</w:t>
       </w:r>
     </w:p>
     <w:p>
@@ -819,7 +835,7 @@
           <w:i w:val="0"/>
           <w:strike w:val="0"/>
         </w:rPr>
-        <w:t>Neither of them said what they'd seen. The commander held it a second longer, then nodded once.</w:t>
+        <w:t>"I'm the runner."</w:t>
       </w:r>
     </w:p>
     <w:p>
@@ -829,7 +845,7 @@
           <w:i w:val="0"/>
           <w:strike w:val="0"/>
         </w:rPr>
-        <w:t>"Rohan. Terminal in the locker. Slot's the empty one."</w:t>
+        <w:t>The man looked at him the way the medic looked, all of it at once, and Ben felt himself counted: the gray-blue that didn't fit at the shoulder, the boots, the hand that had gone to his hip and come away. He looked back. A commander. A man who'd knelt on stone recently; the left knee of his fatigues was paler than the right.</w:t>
       </w:r>
     </w:p>
     <w:p>
@@ -839,7 +855,7 @@
           <w:i w:val="0"/>
           <w:strike w:val="0"/>
         </w:rPr>
-        <w:t>Ben unbuckled the ring's terminal and laid it in the drawer, and the drawer sighed shut on it. The city had stopped talking to him. He hadn't known it had been.</w:t>
+        <w:t>Neither of them said what they'd seen. The commander held it a second longer, then nodded once.</w:t>
       </w:r>
     </w:p>
     <w:p>
@@ -849,7 +865,7 @@
           <w:i w:val="0"/>
           <w:strike w:val="0"/>
         </w:rPr>
-        <w:t>"Shoes," said a woman's voice from inside. "Walk on the gaps."</w:t>
+        <w:t>"Rohan. Terminal in the locker. Slot's the empty one."</w:t>
       </w:r>
     </w:p>
     <w:p>
@@ -859,7 +875,7 @@
           <w:i w:val="0"/>
           <w:strike w:val="0"/>
         </w:rPr>
-        <w:t>---</w:t>
+        <w:t>Ben unbuckled the ring's terminal and laid it in the drawer, and the drawer sighed shut on it. The city had stopped talking to him. He hadn't known it had been.</w:t>
       </w:r>
     </w:p>
     <w:p>
@@ -869,7 +885,7 @@
           <w:i w:val="0"/>
           <w:strike w:val="0"/>
         </w:rPr>
-        <w:t>She was on the floor among her columns, and she didn't look up.</w:t>
+        <w:t>"Shoes," said a woman's voice from inside. "Walk on the gaps."</w:t>
       </w:r>
     </w:p>
     <w:p>
@@ -879,7 +895,7 @@
           <w:i w:val="0"/>
           <w:strike w:val="0"/>
         </w:rPr>
-        <w:t>Four strips of paper ran from the wall to the door, held at their corners by pencils and a tin cup and a whetstone and one glove. Every sheet was dated in the same small level hand. A brass pin in the fourth wall panel, pushed in crooked, and two sheets pinned a finger's width clear of it on either side.</w:t>
+        <w:t>---</w:t>
       </w:r>
     </w:p>
     <w:p>
@@ -889,7 +905,7 @@
           <w:i w:val="0"/>
           <w:strike w:val="0"/>
         </w:rPr>
-        <w:t>He counted the room without deciding to. Her. Rohan, shutting the door. And in the corner beside the locker, a man.</w:t>
+        <w:t>She was on the floor among her columns, and she didn't look up.</w:t>
       </w:r>
     </w:p>
     <w:p>
@@ -899,7 +915,7 @@
           <w:i w:val="0"/>
           <w:strike w:val="0"/>
         </w:rPr>
-        <w:t>Medium height. Medium everything. A face you'd call a wall if you called it anything. Ben's eyes went over the corner, and registered a wall, and came back, because that was what his eyes did when something was standing in one of the holes between people. A small white nick through the left eyebrow, old. A collar turned so the frayed side was in.</w:t>
+        <w:t>Four strips of paper ran from the wall to the door, held at their corners by pencils and a tin cup and a whetstone and one glove. Every sheet was dated in the same small level hand. A brass pin in the fourth wall panel, pushed in crooked, and two sheets pinned a finger's width clear of it on either side.</w:t>
       </w:r>
     </w:p>
     <w:p>
@@ -909,7 +925,7 @@
           <w:i w:val="0"/>
           <w:strike w:val="0"/>
         </w:rPr>
-        <w:t>The man in the corner looked at him. Nothing in the face moved. But the eyes, which had been resting on nothing, came onto Ben and stayed, and Ben had the sense of a door that had never once been tried finding a hand on it.</w:t>
+        <w:t>He counted the room without deciding to. Her. Rohan, shutting the door. And in the corner beside the locker, a man.</w:t>
       </w:r>
     </w:p>
     <w:p>
@@ -919,7 +935,7 @@
           <w:i w:val="0"/>
           <w:strike w:val="0"/>
         </w:rPr>
-        <w:t>"Three of us," Rohan said. "Nayan. Me. You."</w:t>
+        <w:t>Medium height. Medium everything. A face you'd call a wall if you called it anything. Ben's eyes went over the corner, and registered a wall, and came back, because that was what his eyes did when something was standing in one of the holes between people. A small white nick through the left eyebrow, old. A collar turned so the frayed side was in.</w:t>
       </w:r>
     </w:p>
     <w:p>
@@ -929,7 +945,7 @@
           <w:i w:val="0"/>
           <w:strike w:val="0"/>
         </w:rPr>
-        <w:t>"Four," Ben said.</w:t>
+        <w:t>The man in the corner looked at him. Nothing in the face moved. But the eyes, which had been resting on nothing, came onto Ben and stayed, and Ben had the sense of a door that had never once been tried finding a hand on it.</w:t>
       </w:r>
     </w:p>
     <w:p>
@@ -939,7 +955,7 @@
           <w:i w:val="0"/>
           <w:strike w:val="0"/>
         </w:rPr>
-        <w:t>Rohan looked at the corner, and at Ben, and his jaw shifted once.</w:t>
+        <w:t>"Three of us," Rohan said. "Nayan. Me. You."</w:t>
       </w:r>
     </w:p>
     <w:p>
@@ -949,7 +965,7 @@
           <w:i w:val="0"/>
           <w:strike w:val="0"/>
         </w:rPr>
-        <w:t>"Kaan. He'll give you his hand after. He doesn't give it before." Rohan held Ben's eyes. "How did you see him?"</w:t>
+        <w:t>"Four," Ben said.</w:t>
       </w:r>
     </w:p>
     <w:p>
@@ -959,7 +975,7 @@
           <w:i w:val="0"/>
           <w:strike w:val="0"/>
         </w:rPr>
-        <w:t>"My friend Otto stands like that," Ben said. "An old man in a shed taught him. You stop seeing him, and then you do."</w:t>
+        <w:t>Rohan looked at the corner, and at Ben, and his jaw shifted once.</w:t>
       </w:r>
     </w:p>
     <w:p>
@@ -969,7 +985,7 @@
           <w:i w:val="0"/>
           <w:strike w:val="0"/>
         </w:rPr>
-        <w:t>Rohan didn't answer. Ben saw him put it somewhere.</w:t>
+        <w:t>"Kaan. He'll give you his hand after. He doesn't give it before." Rohan held Ben's eyes. "How did you see him?"</w:t>
       </w:r>
     </w:p>
     <w:p>
@@ -979,7 +995,7 @@
           <w:i w:val="0"/>
           <w:strike w:val="0"/>
         </w:rPr>
-        <w:t>The woman on the floor sat back on her heels and took the pencil out of her teeth.</w:t>
+        <w:t>"My friend stands like that," Ben said. "An old man in a shed taught him. You stop seeing him, and then you do."</w:t>
       </w:r>
     </w:p>
     <w:p>
@@ -989,7 +1005,7 @@
           <w:i w:val="0"/>
           <w:strike w:val="0"/>
         </w:rPr>
-        <w:t>"Read me Chanakya. Third year, autumn."</w:t>
+        <w:t>Rohan didn't answer. Ben saw him put it somewhere.</w:t>
       </w:r>
     </w:p>
     <w:p>
@@ -999,7 +1015,7 @@
           <w:i w:val="0"/>
           <w:strike w:val="0"/>
         </w:rPr>
-        <w:t>He found the column, second from the shaft, walked the gaps to it in his socks, and knelt on the left, because she numbered the right.</w:t>
+        <w:t>The woman on the floor sat back on her heels and took the pencil out of her teeth.</w:t>
       </w:r>
     </w:p>
     <w:p>
@@ -1009,7 +1025,7 @@
           <w:i w:val="0"/>
           <w:strike w:val="0"/>
         </w:rPr>
-        <w:t>He read it aloud as he'd read the screens for the man with the crackers: flat, in order, nothing added. Filter media. Survey fee. Lamp oil. When he reached the forty-day line he read it like the rest and went on past, because stopping on it would have been a kind of speech.</w:t>
+        <w:t>"Read me Chanakya. Third year, autumn."</w:t>
       </w:r>
     </w:p>
     <w:p>
@@ -1019,7 +1035,7 @@
           <w:i w:val="0"/>
           <w:strike w:val="0"/>
         </w:rPr>
-        <w:t>She let him reach the bottom of the page. "Again. Across. Same date, all four. I want to see if you can."</w:t>
+        <w:t>He found the column, second from the shaft, walked the gaps to it in his socks, and knelt on the left, because she numbered the right.</w:t>
       </w:r>
     </w:p>
     <w:p>
@@ -1029,7 +1045,7 @@
           <w:i w:val="0"/>
           <w:strike w:val="0"/>
         </w:rPr>
-        <w:t>He could. He did it on his knees, hands on his thighs so they wouldn't touch her paper, and the columns stopped being columns and became one thing with a grain in it, and he followed the grain.</w:t>
+        <w:t>He read it aloud as he'd read the screens for the man with the crackers: flat, in order, nothing added. Filter media. Survey fee. Lamp oil. When he reached the forty-day line he read it like the rest and went on past it.</w:t>
       </w:r>
     </w:p>
     <w:p>
@@ -1039,7 +1055,7 @@
           <w:i w:val="0"/>
           <w:strike w:val="0"/>
         </w:rPr>
-        <w:t>Forty days. Bearings, filters, dressings, paper. He followed it year by year toward the door, and somewhere in the fourth year his eye caught on something, and stopped, and he made it go on. It went on a beat too late.</w:t>
+        <w:t>She let him reach the bottom of the page. "Again. Across. Same date, all four. I want to see if you can."</w:t>
       </w:r>
     </w:p>
     <w:p>
@@ -1049,7 +1065,7 @@
           <w:i w:val="0"/>
           <w:strike w:val="0"/>
         </w:rPr>
-        <w:t>He knew why. He knew whose cellar the paper was in. He'd eaten off a tin plate in it last night.</w:t>
+        <w:t>He could. He did it on his knees, hands on his thighs so they wouldn't touch her paper, and the columns stopped being columns and became one thing with a grain in it, and he followed the grain.</w:t>
       </w:r>
     </w:p>
     <w:p>
@@ -1059,7 +1075,7 @@
           <w:i w:val="0"/>
           <w:strike w:val="0"/>
         </w:rPr>
-        <w:t>Nayan was looking at him. She'd been looking for a while.</w:t>
+        <w:t>Forty days. Bearings, filters, dressings, paper. He followed it year by year toward the door, and somewhere in the fourth year his eye caught on something, and stopped, and he made it go on. It went on a beat too late.</w:t>
       </w:r>
     </w:p>
     <w:p>
@@ -1069,7 +1085,7 @@
           <w:i w:val="0"/>
           <w:strike w:val="0"/>
         </w:rPr>
-        <w:t>"You stopped."</w:t>
+        <w:t>He knew why. He knew whose cellar the paper was in. He'd eaten off a tin plate in it last night.</w:t>
       </w:r>
     </w:p>
     <w:p>
@@ -1079,7 +1095,7 @@
           <w:i w:val="0"/>
           <w:strike w:val="0"/>
         </w:rPr>
-        <w:t>"I'm reading."</w:t>
+        <w:t>Nayan was looking at him. She'd been looking for a while.</w:t>
       </w:r>
     </w:p>
     <w:p>
@@ -1089,7 +1105,7 @@
           <w:i w:val="0"/>
           <w:strike w:val="0"/>
         </w:rPr>
-        <w:t>"No. You were reading. Then you stopped." She came down the column on her knees to where his eyes had been, and read it herself, and then read across. "Forty-seven," she said. "Not forty. All four." She went down a year, and another, fast. "Here. Here. Once a year, a week late, and never the same week." She sat back on her heels. "I read down. I've only ever read down. What's it waiting for?"</w:t>
+        <w:t>"You stopped."</w:t>
       </w:r>
     </w:p>
     <w:p>
@@ -1099,23 +1115,7 @@
           <w:i w:val="0"/>
           <w:strike w:val="0"/>
         </w:rPr>
-        <w:t xml:space="preserve">He opened his mouth to say </w:t>
-      </w:r>
-      <w:r>
-        <w:rPr>
-          <w:b w:val="0"/>
-          <w:i/>
-          <w:strike w:val="0"/>
-        </w:rPr>
-        <w:t>I don't know</w:t>
-      </w:r>
-      <w:r>
-        <w:rPr>
-          <w:b w:val="0"/>
-          <w:i w:val="0"/>
-          <w:strike w:val="0"/>
-        </w:rPr>
-        <w:t>, and it wasn't true, so he shut it again.</w:t>
+        <w:t>"I'm reading."</w:t>
       </w:r>
     </w:p>
     <w:p>
@@ -1125,7 +1125,7 @@
           <w:i w:val="0"/>
           <w:strike w:val="0"/>
         </w:rPr>
-        <w:t>The silence went on long enough that Rohan turned from the wall. Kaan hadn't moved.</w:t>
+        <w:t>"No. You were reading. Then you stopped." She came down the column on her knees to where his eyes had been, and read it herself, and then read across. "Forty-seven days," she said. "Not forty. All four." She went down a year, and another, fast. "Here. Here. Once a year, a week late, and never the same week." She sat back on her heels. "I read down. I've only ever read down. What's it waiting for?"</w:t>
       </w:r>
     </w:p>
     <w:p>
@@ -1135,7 +1135,39 @@
           <w:i w:val="0"/>
           <w:strike w:val="0"/>
         </w:rPr>
-        <w:t>"There's a thing I can't tell you," Ben said at last. "It isn't that I won't. I gave my word before I came up, and I'm not going to lie to you to keep it, so this is what you get instead. I don't know how it works, any of it. I know there's a reason it's late, and I'm not allowed to say the reason." He kept his hand off his hip. "You can throw me out. You'd be right to."</w:t>
+        <w:t xml:space="preserve">He opened his mouth to say </w:t>
+      </w:r>
+      <w:r>
+        <w:rPr>
+          <w:b w:val="0"/>
+          <w:i/>
+          <w:strike w:val="0"/>
+        </w:rPr>
+        <w:t>I don't know</w:t>
+      </w:r>
+      <w:r>
+        <w:rPr>
+          <w:b w:val="0"/>
+          <w:i w:val="0"/>
+          <w:strike w:val="0"/>
+        </w:rPr>
+        <w:t xml:space="preserve">, and it wasn't true. </w:t>
+      </w:r>
+      <w:r>
+        <w:rPr>
+          <w:b w:val="0"/>
+          <w:i/>
+          <w:strike w:val="0"/>
+        </w:rPr>
+        <w:t>Once a year the four Grandmasters sit with me.</w:t>
+      </w:r>
+      <w:r>
+        <w:rPr>
+          <w:b w:val="0"/>
+          <w:i w:val="0"/>
+          <w:strike w:val="0"/>
+        </w:rPr>
+        <w:t xml:space="preserve"> He shut it again.</w:t>
       </w:r>
     </w:p>
     <w:p>
@@ -1145,7 +1177,7 @@
           <w:i w:val="0"/>
           <w:strike w:val="0"/>
         </w:rPr>
-        <w:t>Nayan looked at him over the pencil for a long while.</w:t>
+        <w:t>The silence went on long enough that Rohan turned from the wall. Kaan hadn't moved.</w:t>
       </w:r>
     </w:p>
     <w:p>
@@ -1155,7 +1187,7 @@
           <w:i w:val="0"/>
           <w:strike w:val="0"/>
         </w:rPr>
-        <w:t>"I don't know his real name," she said, and tipped her head at Rohan. "Six years. He doesn't know mine. The man in the corner's never said a word in my hearing." She bent back to the sheet. "Nobody in this room gets to be angry about what somebody else won't say. Help me mark the late weeks."</w:t>
+        <w:t>"There's a thing I can't tell you," Ben said at last. "It isn't that I won't. I gave my word before I came up, and I'm not going to lie to you to keep it, so this is what you get instead. I don't know how it works, any of it. I know there's a reason it's late, and I'm not allowed to say the reason." He kept his hand off his hip. "You can throw me out. You'd be right to."</w:t>
       </w:r>
     </w:p>
     <w:p>
@@ -1165,7 +1197,7 @@
           <w:i w:val="0"/>
           <w:strike w:val="0"/>
         </w:rPr>
-        <w:t>She drew the squares; he found them. It took an hour, and he was good at it, and he liked it.</w:t>
+        <w:t>Nayan looked at him over the pencil for a long while.</w:t>
       </w:r>
     </w:p>
     <w:p>
@@ -1175,7 +1207,7 @@
           <w:i w:val="0"/>
           <w:strike w:val="0"/>
         </w:rPr>
-        <w:t>---</w:t>
+        <w:t>"He doesn't know my real name," she said, and tipped her head at Rohan. "I don't know the corner's. He's never said a word in my hearing." She bent back to the sheet. "Nobody in this room gets to be angry about what somebody else won't say. Help me mark the late weeks."</w:t>
       </w:r>
     </w:p>
     <w:p>
@@ -1185,7 +1217,7 @@
           <w:i w:val="0"/>
           <w:strike w:val="0"/>
         </w:rPr>
-        <w:t>Kaan came out of the corner when they were done.</w:t>
+        <w:t>She drew the squares; he found them. It took an hour, and he was good at it, and he liked it.</w:t>
       </w:r>
     </w:p>
     <w:p>
@@ -1195,7 +1227,7 @@
           <w:i w:val="0"/>
           <w:strike w:val="0"/>
         </w:rPr>
-        <w:t>He crossed the room on the gaps, crouched, and took a pencil stub and a scrap of the house's cheap tag paper from inside his coat. Block letters, pressed in hard. He laid the scrap on the stone in front of Ben and took his hand off it, and his eyes came up to Ben's face and held there, as they had at the door.</w:t>
+        <w:t>---</w:t>
       </w:r>
     </w:p>
     <w:p>
@@ -1205,7 +1237,7 @@
           <w:i w:val="0"/>
           <w:strike w:val="0"/>
         </w:rPr>
-        <w:t>A number. Long, with a letter in it. Nothing else.</w:t>
+        <w:t>Kaan came out of the corner when they were done.</w:t>
       </w:r>
     </w:p>
     <w:p>
@@ -1215,7 +1247,7 @@
           <w:i w:val="0"/>
           <w:strike w:val="0"/>
         </w:rPr>
-        <w:t>"From a slip in a coat," Rohan said. "In Chanakya. The analyst's carried it three years."</w:t>
+        <w:t>He crossed the room on the gaps, crouched, and took a pencil stub and a scrap of the house's cheap tag paper from inside his coat. Block letters, pressed in hard. He laid the scrap on the stone in front of Ben and took his hand off it, and his eyes came up to Ben's face and held there, as they had at the door.</w:t>
       </w:r>
     </w:p>
     <w:p>
@@ -1225,7 +1257,7 @@
           <w:i w:val="0"/>
           <w:strike w:val="0"/>
         </w:rPr>
-        <w:t>Nayan was already moving. From under the tin cup she drew a thinner sheaf, and from under that a thinner one still, and laid a sheet beside Kaan's scrap without touching either.</w:t>
+        <w:t>A number. Long, with a letter in it. Nothing else.</w:t>
       </w:r>
     </w:p>
     <w:p>
@@ -1235,39 +1267,7 @@
           <w:i w:val="0"/>
           <w:strike w:val="0"/>
         </w:rPr>
-        <w:t xml:space="preserve">Chanakya's records archive. Custody. File numbers, and beside each a name: </w:t>
-      </w:r>
-      <w:r>
-        <w:rPr>
-          <w:b w:val="0"/>
-          <w:i/>
-          <w:strike w:val="0"/>
-        </w:rPr>
-        <w:t>released to</w:t>
-      </w:r>
-      <w:r>
-        <w:rPr>
-          <w:b w:val="0"/>
-          <w:i w:val="0"/>
-          <w:strike w:val="0"/>
-        </w:rPr>
-        <w:t xml:space="preserve">, </w:t>
-      </w:r>
-      <w:r>
-        <w:rPr>
-          <w:b w:val="0"/>
-          <w:i/>
-          <w:strike w:val="0"/>
-        </w:rPr>
-        <w:t>returned by</w:t>
-      </w:r>
-      <w:r>
-        <w:rPr>
-          <w:b w:val="0"/>
-          <w:i w:val="0"/>
-          <w:strike w:val="0"/>
-        </w:rPr>
-        <w:t>.</w:t>
+        <w:t>"From a slip in a coat," Rohan said. "In Chanakya. The analyst's carried it three years."</w:t>
       </w:r>
     </w:p>
     <w:p>
@@ -1277,39 +1277,7 @@
           <w:i w:val="0"/>
           <w:strike w:val="0"/>
         </w:rPr>
-        <w:t xml:space="preserve">Near the bottom, the same number. Beside it: </w:t>
-      </w:r>
-      <w:r>
-        <w:rPr>
-          <w:b w:val="0"/>
-          <w:i/>
-          <w:strike w:val="0"/>
-        </w:rPr>
-        <w:t>Source folio. One night. Author's custody. Ravi.</w:t>
-      </w:r>
-      <w:r>
-        <w:rPr>
-          <w:b w:val="0"/>
-          <w:i w:val="0"/>
-          <w:strike w:val="0"/>
-        </w:rPr>
-        <w:t xml:space="preserve"> A date, the morning of the fourth. The </w:t>
-      </w:r>
-      <w:r>
-        <w:rPr>
-          <w:b w:val="0"/>
-          <w:i/>
-          <w:strike w:val="0"/>
-        </w:rPr>
-        <w:t>returned by</w:t>
-      </w:r>
-      <w:r>
-        <w:rPr>
-          <w:b w:val="0"/>
-          <w:i w:val="0"/>
-          <w:strike w:val="0"/>
-        </w:rPr>
-        <w:t xml:space="preserve"> column beside it was empty.</w:t>
+        <w:t>Nayan was already moving. From under the tin cup she drew a thinner sheaf, and from under that a thinner one still, and laid a sheet beside Kaan's scrap without touching either.</w:t>
       </w:r>
     </w:p>
     <w:p>
@@ -1319,7 +1287,39 @@
           <w:i w:val="0"/>
           <w:strike w:val="0"/>
         </w:rPr>
-        <w:t>"Public," Nayan said. "It sits open on the counter. I copy it every fourth day."</w:t>
+        <w:t xml:space="preserve">Chanakya's records archive. Custody. File numbers, and beside each a name: </w:t>
+      </w:r>
+      <w:r>
+        <w:rPr>
+          <w:b w:val="0"/>
+          <w:i/>
+          <w:strike w:val="0"/>
+        </w:rPr>
+        <w:t>released to</w:t>
+      </w:r>
+      <w:r>
+        <w:rPr>
+          <w:b w:val="0"/>
+          <w:i w:val="0"/>
+          <w:strike w:val="0"/>
+        </w:rPr>
+        <w:t xml:space="preserve">, </w:t>
+      </w:r>
+      <w:r>
+        <w:rPr>
+          <w:b w:val="0"/>
+          <w:i/>
+          <w:strike w:val="0"/>
+        </w:rPr>
+        <w:t>returned by</w:t>
+      </w:r>
+      <w:r>
+        <w:rPr>
+          <w:b w:val="0"/>
+          <w:i w:val="0"/>
+          <w:strike w:val="0"/>
+        </w:rPr>
+        <w:t>.</w:t>
       </w:r>
     </w:p>
     <w:p>
@@ -1329,7 +1329,39 @@
           <w:i w:val="0"/>
           <w:strike w:val="0"/>
         </w:rPr>
-        <w:t>One number, written twice, in two hands, by two people who'd never spoken. Ben looked at the two scraps as he'd looked at the crystal, waiting for the pulse.</w:t>
+        <w:t xml:space="preserve">Near the bottom, the same number. Beside it: </w:t>
+      </w:r>
+      <w:r>
+        <w:rPr>
+          <w:b w:val="0"/>
+          <w:i/>
+          <w:strike w:val="0"/>
+        </w:rPr>
+        <w:t>Source folio. One night. Author's custody. Ravi.</w:t>
+      </w:r>
+      <w:r>
+        <w:rPr>
+          <w:b w:val="0"/>
+          <w:i w:val="0"/>
+          <w:strike w:val="0"/>
+        </w:rPr>
+        <w:t xml:space="preserve"> A date, the morning of the fourth. The </w:t>
+      </w:r>
+      <w:r>
+        <w:rPr>
+          <w:b w:val="0"/>
+          <w:i/>
+          <w:strike w:val="0"/>
+        </w:rPr>
+        <w:t>returned by</w:t>
+      </w:r>
+      <w:r>
+        <w:rPr>
+          <w:b w:val="0"/>
+          <w:i w:val="0"/>
+          <w:strike w:val="0"/>
+        </w:rPr>
+        <w:t xml:space="preserve"> column beside it was empty.</w:t>
       </w:r>
     </w:p>
     <w:p>
@@ -1339,7 +1371,7 @@
           <w:i w:val="0"/>
           <w:strike w:val="0"/>
         </w:rPr>
-        <w:t>The pulse was the date.</w:t>
+        <w:t>"Public," Nayan said. "It sits open on the counter. I copy it every few days."</w:t>
       </w:r>
     </w:p>
     <w:p>
@@ -1349,7 +1381,7 @@
           <w:i w:val="0"/>
           <w:strike w:val="0"/>
         </w:rPr>
-        <w:t>"When did you set the appointment?" he said to Kaan. "The one he kept."</w:t>
+        <w:t>One number, written twice, in two hands, by two people who'd never spoken. Ben looked at the two scraps as he'd looked at the crystal, waiting for the pulse.</w:t>
       </w:r>
     </w:p>
     <w:p>
@@ -1359,39 +1391,7 @@
           <w:i w:val="0"/>
           <w:strike w:val="0"/>
         </w:rPr>
-        <w:t xml:space="preserve">Kaan didn't answer. Rohan did. "A slip in his coat, the morning before. </w:t>
-      </w:r>
-      <w:r>
-        <w:rPr>
-          <w:b w:val="0"/>
-          <w:i/>
-          <w:strike w:val="0"/>
-        </w:rPr>
-        <w:t>Room Four. Two hours.</w:t>
-      </w:r>
-      <w:r>
-        <w:rPr>
-          <w:b w:val="0"/>
-          <w:i w:val="0"/>
-          <w:strike w:val="0"/>
-        </w:rPr>
-        <w:t xml:space="preserve"> He went and found a note instead. </w:t>
-      </w:r>
-      <w:r>
-        <w:rPr>
-          <w:b w:val="0"/>
-          <w:i/>
-          <w:strike w:val="0"/>
-        </w:rPr>
-        <w:t>Tomorrow. Bring what you took.</w:t>
-      </w:r>
-      <w:r>
-        <w:rPr>
-          <w:b w:val="0"/>
-          <w:i w:val="0"/>
-          <w:strike w:val="0"/>
-        </w:rPr>
-        <w:t>"</w:t>
+        <w:t>Ben moved his finger to the empty column. "One night, he signed for. That was the fourth." He looked up at Kaan. "He hasn't brought it back."</w:t>
       </w:r>
     </w:p>
     <w:p>
@@ -1401,23 +1401,7 @@
           <w:i w:val="0"/>
           <w:strike w:val="0"/>
         </w:rPr>
-        <w:t xml:space="preserve">Ben put his finger above the custody line. "Same morning. He signed this out before he ever saw your note." He looked up at Kaan. "Your note said </w:t>
-      </w:r>
-      <w:r>
-        <w:rPr>
-          <w:b w:val="0"/>
-          <w:i/>
-          <w:strike w:val="0"/>
-        </w:rPr>
-        <w:t>bring</w:t>
-      </w:r>
-      <w:r>
-        <w:rPr>
-          <w:b w:val="0"/>
-          <w:i w:val="0"/>
-          <w:strike w:val="0"/>
-        </w:rPr>
-        <w:t>. He'd already fetched it. He wanted it in his hands before anyone told him to."</w:t>
+        <w:t>Kaan's face did nothing. But he picked up the scrap and set it down again a finger's width closer to the custody page, so the two numbers lay nearly touching. Then Kaan held out his hand.</w:t>
       </w:r>
     </w:p>
     <w:p>
@@ -1427,7 +1411,7 @@
           <w:i w:val="0"/>
           <w:strike w:val="0"/>
         </w:rPr>
-        <w:t>Kaan's face did nothing. But he picked up the scrap and set it down again a finger's width closer to the custody page, so the two numbers lay nearly touching. Then Kaan held out his hand.</w:t>
+        <w:t>"What is it?" Ben said. "The file."</w:t>
       </w:r>
     </w:p>
     <w:p>
@@ -1437,7 +1421,7 @@
           <w:i w:val="0"/>
           <w:strike w:val="0"/>
         </w:rPr>
-        <w:t>"What is it?" Ben said. "The file."</w:t>
+        <w:t>"Sealed above his grade," Nayan said. "Above mine. A case, three years old, filed by him in his first year. That's as far as paper goes."</w:t>
       </w:r>
     </w:p>
     <w:p>
@@ -1447,7 +1431,7 @@
           <w:i w:val="0"/>
           <w:strike w:val="0"/>
         </w:rPr>
-        <w:t>"Sealed above his grade," Nayan said. "Above mine. A case, three years old, filed by him in his first year. That's as far as paper goes."</w:t>
+        <w:t>"Then that's where we stop," Rohan said. "A number on a public ledger, and a man keeping a sealed file past his own signature. All of it citable." His jaw worked once along the scar. "That's the other road."</w:t>
       </w:r>
     </w:p>
     <w:p>
@@ -1457,7 +1441,7 @@
           <w:i w:val="0"/>
           <w:strike w:val="0"/>
         </w:rPr>
-        <w:t>"Then that's where we stop," Rohan said. "A number in two hands, both lawful, both citable. The man who holds it fetching it before he was asked." His jaw worked once along the scar. "That's the other road."</w:t>
+        <w:t>Nobody asked him what the first one was. Ben saw the question cross Nayan's face and get put away, and he said nothing either.</w:t>
       </w:r>
     </w:p>
     <w:p>
@@ -1467,7 +1451,7 @@
           <w:i w:val="0"/>
           <w:strike w:val="0"/>
         </w:rPr>
-        <w:t>Nobody asked him what the first one was. Ben saw the question cross Nayan's face and get put away, and he said nothing either.</w:t>
+        <w:t>---</w:t>
       </w:r>
     </w:p>
     <w:p>
@@ -1477,7 +1461,7 @@
           <w:i w:val="0"/>
           <w:strike w:val="0"/>
         </w:rPr>
-        <w:t>---</w:t>
+        <w:t>They gave him a bed in a room with a window. He stood at it in his socks for a long time before he could make himself look down.</w:t>
       </w:r>
     </w:p>
     <w:p>
@@ -1487,7 +1471,7 @@
           <w:i w:val="0"/>
           <w:strike w:val="0"/>
         </w:rPr>
-        <w:t>They gave him a bed in a room with a window. He stood at it in his socks for a long time before he could make himself look down.</w:t>
+        <w:t>Cloud, at first. Then the cloud thinned, and the mountain came up through it, grey and brown and enormous, with the lights of the Hub lift like a row of teeth in its flank. He found the pithead. He found the basin, a dull sheet of water catching the last of the light. And there, on its granite shelf a hundred feet up and to the north-east, a scatter of rust and broken shapes, so small from here he could have covered it with his thumb.</w:t>
       </w:r>
     </w:p>
     <w:p>
@@ -1497,7 +1481,7 @@
           <w:i w:val="0"/>
           <w:strike w:val="0"/>
         </w:rPr>
-        <w:t>Cloud, at first. Then the cloud thinned, and the mountain came up through it, grey and brown and enormous, with the lights of the Hub lift like a row of teeth in its flank. He found the pithead. He found the basin, a dull sheet of water catching the last of the light. And there, on its granite shelf a hundred feet up and to the north-east, a scatter of rust and broken shapes, so small from here he could have covered it with his thumb.</w:t>
+        <w:t>The Junkyard. He'd never seen it from above.</w:t>
       </w:r>
     </w:p>
     <w:p>
@@ -1507,43 +1491,7 @@
           <w:i w:val="0"/>
           <w:strike w:val="0"/>
         </w:rPr>
-        <w:t>The Junkyard. He'd never seen it from above.</w:t>
-      </w:r>
-    </w:p>
-    <w:p>
-      <w:r>
-        <w:rPr>
-          <w:b w:val="0"/>
-          <w:i w:val="0"/>
-          <w:strike w:val="0"/>
-        </w:rPr>
-        <w:t xml:space="preserve">Before he slept he took a sheet of the house's ruled paper and wrote one line on it in a small, level hand, as near Nayan's as he could make it. The date in the corner. Then: </w:t>
-      </w:r>
-      <w:r>
-        <w:rPr>
-          <w:b w:val="0"/>
-          <w:i/>
-          <w:strike w:val="0"/>
-        </w:rPr>
-        <w:t>Forty-seven. One week in every year.</w:t>
-      </w:r>
-      <w:r>
-        <w:rPr>
-          <w:b w:val="0"/>
-          <w:i w:val="0"/>
-          <w:strike w:val="0"/>
-        </w:rPr>
-        <w:t xml:space="preserve"> In the morning he'd put it in her pile, on the left, where she didn't number.</w:t>
-      </w:r>
-    </w:p>
-    <w:p>
-      <w:r>
-        <w:rPr>
-          <w:b w:val="0"/>
-          <w:i w:val="0"/>
-          <w:strike w:val="0"/>
-        </w:rPr>
-        <w:t>He lay down with the light still in the room, because up here it didn't go out, and put his hand on his hip, and left it there.</w:t>
+        <w:t>He lay down with the city's light still in the room, because up here it didn't go out, and put his hand on his hip, and left it there.</w:t>
       </w:r>
     </w:p>
     <w:sectPr>

</xml_diff>

<commit_message>
Ch24 round 3: Kaan's handshake, Nayan's gaps, return column, speaker split, Sef trim
Co-Authored-By: Claude Opus 5.5 <noreply@anthropic.com>
</commit_message>
<xml_diff>
--- a/claude-notes/manuscript-v2/24-first-contact-merged.docx
+++ b/claude-notes/manuscript-v2/24-first-contact-merged.docx
@@ -153,7 +153,7 @@
           <w:i w:val="0"/>
           <w:strike w:val="0"/>
         </w:rPr>
-        <w:t>"Sit, if you like. Gage will not; I have stopped asking." Ben took the stool by the door and turned it a quarter, so he could see the corridor. "A thing to tell you and a thing to ask. Under our pact the telling comes first."</w:t>
+        <w:t>"Sit, if you like," Flitzberg said. "Gage will not; I have stopped asking."</w:t>
       </w:r>
     </w:p>
     <w:p>
@@ -163,7 +163,7 @@
           <w:i w:val="0"/>
           <w:strike w:val="0"/>
         </w:rPr>
-        <w:t>"Go on."</w:t>
+        <w:t>Ben took the stool by the door and turned it a quarter, so he could see the corridor. "A thing to tell you and a thing to ask. Under our pact the telling comes first."</w:t>
       </w:r>
     </w:p>
     <w:p>
@@ -173,7 +173,7 @@
           <w:i w:val="0"/>
           <w:strike w:val="0"/>
         </w:rPr>
-        <w:t>"One of the four Grandmasters has asked the table to sit out of season. In the life of anyone now living, that has happened never." He said it in the voice he used for reading gauges. "She believes something is moving in her tower. Ashoka's will bring a matter to it. Someone in that house has laid four houses' public books side by side, on a floor, by hand, and found the same small leak in all four."</w:t>
+        <w:t>"Go on."</w:t>
       </w:r>
     </w:p>
     <w:p>
@@ -183,35 +183,35 @@
           <w:i w:val="0"/>
           <w:strike w:val="0"/>
         </w:rPr>
-        <w:t>Ben's stool creaked. Gage, standing by the shelves with his hands open at his sides, didn't move at all.</w:t>
+        <w:t>"One of the four Grandmasters has asked the table to sit out of season. In the life of anyone now living, that has happened never." He said it in the voice he used for reading gauges. "She believes something is moving in her tower. Ashoka's has sent word ahead of what she will bring to it. Someone in that house has laid four houses' public books side by side, on a floor, by hand, and found the same small leak in all four."</w:t>
       </w:r>
     </w:p>
     <w:p>
       <w:r>
         <w:rPr>
           <w:b w:val="0"/>
-          <w:i/>
-          <w:strike w:val="0"/>
-        </w:rPr>
-        <w:t>None of them has ever laid four sets of books side by side.</w:t>
-      </w:r>
-      <w:r>
-        <w:rPr>
-          <w:b w:val="0"/>
           <w:i w:val="0"/>
           <w:strike w:val="0"/>
         </w:rPr>
-        <w:t xml:space="preserve"> He'd said it to her across a table the first week, with a bruise on his neck shaped like her brother's hand.</w:t>
+        <w:t>Ben's stool creaked. Gage, standing by the shelves with his hands open at his sides, didn't move at all.</w:t>
       </w:r>
     </w:p>
     <w:p>
       <w:r>
         <w:rPr>
           <w:b w:val="0"/>
+          <w:i/>
+          <w:strike w:val="0"/>
+        </w:rPr>
+        <w:t>None of them has ever laid four sets of books side by side.</w:t>
+      </w:r>
+      <w:r>
+        <w:rPr>
+          <w:b w:val="0"/>
           <w:i w:val="0"/>
           <w:strike w:val="0"/>
         </w:rPr>
-        <w:t>"It's you," she said. "The leak's this office."</w:t>
+        <w:t xml:space="preserve"> He'd said it to her across a table the first week, with a bruise on his neck shaped like her brother's hand.</w:t>
       </w:r>
     </w:p>
     <w:p>
@@ -221,7 +221,7 @@
           <w:i w:val="0"/>
           <w:strike w:val="0"/>
         </w:rPr>
-        <w:t>"Yes."</w:t>
+        <w:t>"It's you," she said. "The leak's this office."</w:t>
       </w:r>
     </w:p>
     <w:p>
@@ -231,7 +231,7 @@
           <w:i w:val="0"/>
           <w:strike w:val="0"/>
         </w:rPr>
-        <w:t>"Forty reams of paper. Bearings." She'd read them off his own wall. "Dressings for the medics." Her metal hand was on her knee. She looked at it, and then at him. "And this. Where did this come from?"</w:t>
+        <w:t>"Yes."</w:t>
       </w:r>
     </w:p>
     <w:p>
@@ -241,7 +241,7 @@
           <w:i w:val="0"/>
           <w:strike w:val="0"/>
         </w:rPr>
-        <w:t>"From Drona," Flitzberg said, because she had asked, and he had promised. "The part that listens was built for an instrument the four houses sealed away a century ago. Drona swore it burned the plans. This office copied them first, and Drona's books still show Drona buying the parts for itself." He held her eyes. "I have never told anyone that. No one asked."</w:t>
+        <w:t>"Forty reams of paper. Bearings." She'd read them off his own wall. "Dressings for the medics." "And this." She turned the metal hand over on her knee and looked at him. "Where did this come from?"</w:t>
       </w:r>
     </w:p>
     <w:p>
@@ -251,7 +251,7 @@
           <w:i w:val="0"/>
           <w:strike w:val="0"/>
         </w:rPr>
-        <w:t>The metal fingers on her knee closed, late. She pried them open with her good hand. "Can it be heard? Up there?"</w:t>
+        <w:t>"From Drona," Flitzberg said, because she had asked, and he had promised. "The part that listens was built for an instrument the four houses sealed away a century ago. Drona swore it burned the plans. This office copied them first, and Drona's books still show Drona buying the parts for itself." He held her eyes. "I have never told anyone that. No one asked."</w:t>
       </w:r>
     </w:p>
     <w:p>
@@ -261,23 +261,7 @@
           <w:i w:val="0"/>
           <w:strike w:val="0"/>
         </w:rPr>
-        <w:t xml:space="preserve">"Not by anyone in this office," Flitzberg said. "I know of no ear above that could." She believed him exactly as far as the word </w:t>
-      </w:r>
-      <w:r>
-        <w:rPr>
-          <w:b w:val="0"/>
-          <w:i/>
-          <w:strike w:val="0"/>
-        </w:rPr>
-        <w:t>know</w:t>
-      </w:r>
-      <w:r>
-        <w:rPr>
-          <w:b w:val="0"/>
-          <w:i w:val="0"/>
-          <w:strike w:val="0"/>
-        </w:rPr>
-        <w:t>.</w:t>
+        <w:t>The metal fingers on her knee closed, late. She pried them open with her good hand. "Can it be heard? Up there?"</w:t>
       </w:r>
     </w:p>
     <w:p>
@@ -287,7 +271,23 @@
           <w:i w:val="0"/>
           <w:strike w:val="0"/>
         </w:rPr>
-        <w:t>"And the forty days," she said.</w:t>
+        <w:t xml:space="preserve">"Not by anyone in this office," Flitzberg said. "I know of no ear above that could." She believed him exactly as far as the word </w:t>
+      </w:r>
+      <w:r>
+        <w:rPr>
+          <w:b w:val="0"/>
+          <w:i/>
+          <w:strike w:val="0"/>
+        </w:rPr>
+        <w:t>know</w:t>
+      </w:r>
+      <w:r>
+        <w:rPr>
+          <w:b w:val="0"/>
+          <w:i w:val="0"/>
+          <w:strike w:val="0"/>
+        </w:rPr>
+        <w:t>.</w:t>
       </w:r>
     </w:p>
     <w:p>
@@ -297,7 +297,7 @@
           <w:i w:val="0"/>
           <w:strike w:val="0"/>
         </w:rPr>
-        <w:t>"Every forty days, since the charter was signed. The sum has not changed because this office has not grown. It was built not to." He laid one hand flat on the folder. "Now one woman with a pencil has looked, and her Grandmaster will carry it to the table, and I will be asked to answer it."</w:t>
+        <w:t>"And the forty days," she said.</w:t>
       </w:r>
     </w:p>
     <w:p>
@@ -307,7 +307,7 @@
           <w:i w:val="0"/>
           <w:strike w:val="0"/>
         </w:rPr>
-        <w:t>"Before our night, or after?" Gage said.</w:t>
+        <w:t>"Every forty days, since the charter was signed. The sum has not changed because this office has not grown. It was built not to." He laid one hand flat on the folder. "Now one woman with a pencil has looked, and her Grandmaster will carry it to the table, and I will be asked to answer it."</w:t>
       </w:r>
     </w:p>
     <w:p>
@@ -317,7 +317,7 @@
           <w:i w:val="0"/>
           <w:strike w:val="0"/>
         </w:rPr>
-        <w:t>"The table names its own day. I had thought of that." He let it sit. "If it names yours, then the city's clock and ours have just become the same clock. I told you you would not feel ready." He opened the folder. "I am going to answer the copyist before it sits. I will send someone to work beside her, under this ring's cover, who reads as she reads, and I will not tell her what he is." His eyes came round to the stool by the door. "Nor will he."</w:t>
+        <w:t>"Before our night, or after?" Gage said.</w:t>
       </w:r>
     </w:p>
     <w:p>
@@ -327,7 +327,7 @@
           <w:i w:val="0"/>
           <w:strike w:val="0"/>
         </w:rPr>
-        <w:t>"You want him to steer her off us," Camilla said.</w:t>
+        <w:t>"The table names its own day. I had thought of that." He let it sit. "If it names yours, then the city's clock and ours have just become the same clock. I told you you would not feel ready." He opened the folder. "I am going to answer the copyist before it sits. I will send someone to work beside her, under this ring's cover, who reads as she reads, and I will not tell her what he is." His eyes came round to the stool by the door. "Nor will he."</w:t>
       </w:r>
     </w:p>
     <w:p>
@@ -337,7 +337,7 @@
           <w:i w:val="0"/>
           <w:strike w:val="0"/>
         </w:rPr>
-        <w:t>"No. What she hunts is a hand that moves through all four houses, the same hand, I think, that put a number on your brother. She stopped at us because we were lying across her road." His fingers stayed flat on the folder. "I would like her to look past us to what she came for. And I would like to know what this office looks like from her floor. I have only ever seen it from mine."</w:t>
+        <w:t>"You want him to steer her off us," Camilla said.</w:t>
       </w:r>
     </w:p>
     <w:p>
@@ -347,7 +347,7 @@
           <w:i w:val="0"/>
           <w:strike w:val="0"/>
         </w:rPr>
-        <w:t>Ben had gone very still.</w:t>
+        <w:t>"No. What she hunts is a hand that moves through all four houses, the same hand, I think, that put a number on your brother. She stopped at us because we were lying across her road." His fingers stayed flat on the folder. "I would like her to look past us to what she came for. And I would like to know what this office looks like from her floor. I have only ever seen it from mine."</w:t>
       </w:r>
     </w:p>
     <w:p>
@@ -357,23 +357,7 @@
           <w:i w:val="0"/>
           <w:strike w:val="0"/>
         </w:rPr>
-        <w:t xml:space="preserve">Inside the folder were sheets of thin ruled paper, filled edge to edge in a small upright hand that leaned nowhere. Camilla saw, upside down, the word </w:t>
-      </w:r>
-      <w:r>
-        <w:rPr>
-          <w:b w:val="0"/>
-          <w:i/>
-          <w:strike w:val="0"/>
-        </w:rPr>
-        <w:t>Plan</w:t>
-      </w:r>
-      <w:r>
-        <w:rPr>
-          <w:b w:val="0"/>
-          <w:i w:val="0"/>
-          <w:strike w:val="0"/>
-        </w:rPr>
-        <w:t xml:space="preserve"> at the head of one, and under it a number that wasn't a name.</w:t>
+        <w:t>Ben had gone very still.</w:t>
       </w:r>
     </w:p>
     <w:p>
@@ -383,7 +367,7 @@
           <w:i w:val="0"/>
           <w:strike w:val="0"/>
         </w:rPr>
-        <w:t>"These were written in the trial rooms by an examiner called Sef." He read without raising his voice. "</w:t>
+        <w:t xml:space="preserve">Inside the folder were sheets of thin ruled paper, filled edge to edge in a small upright hand that leaned nowhere. Camilla saw, upside down, the word </w:t>
       </w:r>
       <w:r>
         <w:rPr>
@@ -391,7 +375,7 @@
           <w:i/>
           <w:strike w:val="0"/>
         </w:rPr>
-        <w:t>Fear present in all four. Reasoning continuous in all four. The girl thinks in exits, the gentle one thinks in patterns, and they listen to each other without ranking.</w:t>
+        <w:t>Plan</w:t>
       </w:r>
       <w:r>
         <w:rPr>
@@ -399,7 +383,7 @@
           <w:i w:val="0"/>
           <w:strike w:val="0"/>
         </w:rPr>
-        <w:t>"</w:t>
+        <w:t xml:space="preserve"> at the head of one, and under it a number that wasn't a name.</w:t>
       </w:r>
     </w:p>
     <w:p>
@@ -409,7 +393,23 @@
           <w:i w:val="0"/>
           <w:strike w:val="0"/>
         </w:rPr>
-        <w:t>The plucked thing failed its run of notes again and began it over.</w:t>
+        <w:t>"These were written in the trial rooms by an examiner called Sef." He read without raising his voice. "</w:t>
+      </w:r>
+      <w:r>
+        <w:rPr>
+          <w:b w:val="0"/>
+          <w:i/>
+          <w:strike w:val="0"/>
+        </w:rPr>
+        <w:t>Fear present in all four. Reasoning continuous in all four. The girl thinks in exits, the gentle one thinks in patterns, and they listen to each other without ranking.</w:t>
+      </w:r>
+      <w:r>
+        <w:rPr>
+          <w:b w:val="0"/>
+          <w:i w:val="0"/>
+          <w:strike w:val="0"/>
+        </w:rPr>
+        <w:t>"</w:t>
       </w:r>
     </w:p>
     <w:p>
@@ -419,71 +419,7 @@
           <w:i w:val="0"/>
           <w:strike w:val="0"/>
         </w:rPr>
-        <w:t xml:space="preserve">"Under </w:t>
-      </w:r>
-      <w:r>
-        <w:rPr>
-          <w:b w:val="0"/>
-          <w:i/>
-          <w:strike w:val="0"/>
-        </w:rPr>
-        <w:t>Control</w:t>
-      </w:r>
-      <w:r>
-        <w:rPr>
-          <w:b w:val="0"/>
-          <w:i w:val="0"/>
-          <w:strike w:val="0"/>
-        </w:rPr>
-        <w:t xml:space="preserve">: </w:t>
-      </w:r>
-      <w:r>
-        <w:rPr>
-          <w:b w:val="0"/>
-          <w:i/>
-          <w:strike w:val="0"/>
-        </w:rPr>
-        <w:t>The strong one spent his strength making the others stronger.</w:t>
-      </w:r>
-      <w:r>
-        <w:rPr>
-          <w:b w:val="0"/>
-          <w:i w:val="0"/>
-          <w:strike w:val="0"/>
-        </w:rPr>
-        <w:t xml:space="preserve">" He closed the folder. "Sef asked me, that night, for an assessment. </w:t>
-      </w:r>
-      <w:r>
-        <w:rPr>
-          <w:b w:val="0"/>
-          <w:i/>
-          <w:strike w:val="0"/>
-        </w:rPr>
-        <w:t>Unlikely heroes,</w:t>
-      </w:r>
-      <w:r>
-        <w:rPr>
-          <w:b w:val="0"/>
-          <w:i w:val="0"/>
-          <w:strike w:val="0"/>
-        </w:rPr>
-        <w:t xml:space="preserve"> I told her. </w:t>
-      </w:r>
-      <w:r>
-        <w:rPr>
-          <w:b w:val="0"/>
-          <w:i/>
-          <w:strike w:val="0"/>
-        </w:rPr>
-        <w:t>Possible.</w:t>
-      </w:r>
-      <w:r>
-        <w:rPr>
-          <w:b w:val="0"/>
-          <w:i w:val="0"/>
-          <w:strike w:val="0"/>
-        </w:rPr>
-        <w:t xml:space="preserve"> Sef wrote it down. Sef writes everything down." He looked at Ben. "Ashoka's copyist does too. You will like her, I think."</w:t>
+        <w:t>The plucked thing failed its run of notes again and began it over.</w:t>
       </w:r>
     </w:p>
     <w:p>
@@ -493,7 +429,39 @@
           <w:i w:val="0"/>
           <w:strike w:val="0"/>
         </w:rPr>
-        <w:t>"He's the shift," Gage said.</w:t>
+        <w:t xml:space="preserve">"Under </w:t>
+      </w:r>
+      <w:r>
+        <w:rPr>
+          <w:b w:val="0"/>
+          <w:i/>
+          <w:strike w:val="0"/>
+        </w:rPr>
+        <w:t>Control</w:t>
+      </w:r>
+      <w:r>
+        <w:rPr>
+          <w:b w:val="0"/>
+          <w:i w:val="0"/>
+          <w:strike w:val="0"/>
+        </w:rPr>
+        <w:t xml:space="preserve">: </w:t>
+      </w:r>
+      <w:r>
+        <w:rPr>
+          <w:b w:val="0"/>
+          <w:i/>
+          <w:strike w:val="0"/>
+        </w:rPr>
+        <w:t>The strong one spent his strength making the others stronger.</w:t>
+      </w:r>
+      <w:r>
+        <w:rPr>
+          <w:b w:val="0"/>
+          <w:i w:val="0"/>
+          <w:strike w:val="0"/>
+        </w:rPr>
+        <w:t>" He closed the folder. "Sef writes everything down." He looked at Ben. "Ashoka's copyist does too. You will like her, I think."</w:t>
       </w:r>
     </w:p>
     <w:p>
@@ -503,7 +471,7 @@
           <w:i w:val="0"/>
           <w:strike w:val="0"/>
         </w:rPr>
-        <w:t>Three words. His hands had come up off his sides and stayed open, showing Flitzberg they were empty.</w:t>
+        <w:t>"He's the shift," Gage said.</w:t>
       </w:r>
     </w:p>
     <w:p>
@@ -513,7 +481,7 @@
           <w:i w:val="0"/>
           <w:strike w:val="0"/>
         </w:rPr>
-        <w:t>"He is."</w:t>
+        <w:t>Three words. His hands had come up off his sides and stayed open, showing Flitzberg they were empty.</w:t>
       </w:r>
     </w:p>
     <w:p>
@@ -523,23 +491,7 @@
           <w:i w:val="0"/>
           <w:strike w:val="0"/>
         </w:rPr>
-        <w:t xml:space="preserve">"Five nights. He counts the men off the Hub. Nobody else can." Gage looked at Ben, and his voice stayed where it was, which Camilla knew cost him. "You go up there, and something keeps you, and I'm at that wall with Cami saying </w:t>
-      </w:r>
-      <w:r>
-        <w:rPr>
-          <w:b w:val="0"/>
-          <w:i/>
-          <w:strike w:val="0"/>
-        </w:rPr>
-        <w:t>feeds</w:t>
-      </w:r>
-      <w:r>
-        <w:rPr>
-          <w:b w:val="0"/>
-          <w:i w:val="0"/>
-          <w:strike w:val="0"/>
-        </w:rPr>
-        <w:t xml:space="preserve"> into an empty count."</w:t>
+        <w:t>"He is."</w:t>
       </w:r>
     </w:p>
     <w:p>
@@ -549,7 +501,23 @@
           <w:i w:val="0"/>
           <w:strike w:val="0"/>
         </w:rPr>
-        <w:t>"I know," Ben said.</w:t>
+        <w:t xml:space="preserve">"Five nights. He counts the men off the Hub. Nobody else can." Gage looked at Ben, and his voice stayed where it was, which Camilla knew cost him. "You go up there, and something keeps you, and I'm at that wall with Cami saying </w:t>
+      </w:r>
+      <w:r>
+        <w:rPr>
+          <w:b w:val="0"/>
+          <w:i/>
+          <w:strike w:val="0"/>
+        </w:rPr>
+        <w:t>feeds</w:t>
+      </w:r>
+      <w:r>
+        <w:rPr>
+          <w:b w:val="0"/>
+          <w:i w:val="0"/>
+          <w:strike w:val="0"/>
+        </w:rPr>
+        <w:t xml:space="preserve"> into an empty count."</w:t>
       </w:r>
     </w:p>
     <w:p>
@@ -559,7 +527,7 @@
           <w:i w:val="0"/>
           <w:strike w:val="0"/>
         </w:rPr>
-        <w:t>"Then say no."</w:t>
+        <w:t>"I know," Ben said.</w:t>
       </w:r>
     </w:p>
     <w:p>
@@ -569,7 +537,7 @@
           <w:i w:val="0"/>
           <w:strike w:val="0"/>
         </w:rPr>
-        <w:t>Ben's hand pressed flat over the pocket that wasn't there. He was looking at the join in the floor plates between his boots, and Camilla knew the look; he'd worn it kneeling over her shoulder with a spray can, reading what the wound needed before he let himself feel anything about it.</w:t>
+        <w:t>"Then say no."</w:t>
       </w:r>
     </w:p>
     <w:p>
@@ -579,7 +547,7 @@
           <w:i w:val="0"/>
           <w:strike w:val="0"/>
         </w:rPr>
-        <w:t>"I'm scared of it," he said. "Up there. All that light, and everyone's wrist talking. I'm scared I'll look at the wrong thing and someone'll see me looking." He lifted his head. "And I'm scared of what I'll do with a wall of somebody else's paper in front of me, because I'll be good at it. Same as the screens. And up there I might start to like it." He breathed in. "I want to go anyway. That's the truth, so I'm saying it."</w:t>
+        <w:t>Ben's hand pressed flat over the pocket that wasn't there. He was looking at the join in the floor plates between his boots, and Camilla knew the look; he'd worn it kneeling over her shoulder with a spray can, reading what the wound needed before he let himself feel anything about it.</w:t>
       </w:r>
     </w:p>
     <w:p>
@@ -589,7 +557,7 @@
           <w:i w:val="0"/>
           <w:strike w:val="0"/>
         </w:rPr>
-        <w:t>Gage looked at him for a long time, and then he looked at her. They all did.</w:t>
+        <w:t>"I'm scared of it," he said. "Up there. All that light, and everyone's wrist talking. I'm scared I'll look at the wrong thing and someone'll see me looking." He lifted his head. "And I'm scared of what I'll do with a wall of somebody else's paper in front of me, because I'll be good at it. Same as the screens. And up there I might start to like it." He breathed in. "I want to go anyway."</w:t>
       </w:r>
     </w:p>
     <w:p>
@@ -599,7 +567,7 @@
           <w:i w:val="0"/>
           <w:strike w:val="0"/>
         </w:rPr>
-        <w:t>She thought about the box on her bench, which still couldn't tell rock from footsteps.</w:t>
+        <w:t>Gage looked at him for a long time, and then he looked at her. They all did.</w:t>
       </w:r>
     </w:p>
     <w:p>
@@ -609,7 +577,7 @@
           <w:i w:val="0"/>
           <w:strike w:val="0"/>
         </w:rPr>
-        <w:t>"How long," she said.</w:t>
+        <w:t>She thought about the box on her bench, which still couldn't tell rock from footsteps.</w:t>
       </w:r>
     </w:p>
     <w:p>
@@ -619,7 +587,7 @@
           <w:i w:val="0"/>
           <w:strike w:val="0"/>
         </w:rPr>
-        <w:t>"Up tomorrow. Two nights there, in a bed Ashoka will give him under a name that is not his. Back by the third night."</w:t>
+        <w:t>"How long," she said.</w:t>
       </w:r>
     </w:p>
     <w:p>
@@ -629,7 +597,7 @@
           <w:i w:val="0"/>
           <w:strike w:val="0"/>
         </w:rPr>
-        <w:t>"Last rehearsal's the third night."</w:t>
+        <w:t>"Up tomorrow. Two nights there, in a bed Ashoka will give him under a name that is not his. Back by the third night."</w:t>
       </w:r>
     </w:p>
     <w:p>
@@ -639,7 +607,7 @@
           <w:i w:val="0"/>
           <w:strike w:val="0"/>
         </w:rPr>
-        <w:t>"Then he will be at it."</w:t>
+        <w:t>"Last rehearsal's the third night."</w:t>
       </w:r>
     </w:p>
     <w:p>
@@ -649,7 +617,7 @@
           <w:i w:val="0"/>
           <w:strike w:val="0"/>
         </w:rPr>
-        <w:t>"He'd better be." She made the metal hand lie flat on her knee. "He goes. If you're not on that stool when the glass turns over, Ben, I call it without you." Her voice didn't move. "I'll hate it. I'll still call it."</w:t>
+        <w:t>"Then he will be at it."</w:t>
       </w:r>
     </w:p>
     <w:p>
@@ -659,7 +627,7 @@
           <w:i w:val="0"/>
           <w:strike w:val="0"/>
         </w:rPr>
-        <w:t>Gage's hands went back to his sides. He didn't close them.</w:t>
+        <w:t>"He'd better be." She made the metal hand lie flat on her knee. "He goes. If you're not on that stool when the glass turns over, Ben, I call it without you." Her voice didn't move. "I'll hate it. I'll still call it."</w:t>
       </w:r>
     </w:p>
     <w:p>
@@ -669,7 +637,7 @@
           <w:i w:val="0"/>
           <w:strike w:val="0"/>
         </w:rPr>
-        <w:t>"Three terms," Flitzberg said to Ben, "and they are mine, not the office's. You will not name this ring, to anyone, under anything. You will not lie to them. If a lie is the only thing between you and harm, you tell it, and you tell me afterward; that is the one door I leave open, and I am telling you plainly so you will know where it is." He stood. "And you will come home. The count is Gage's reason. Mine is that you are owed one."</w:t>
+        <w:t>Gage's hands went back to his sides. He didn't close them.</w:t>
       </w:r>
     </w:p>
     <w:p>
@@ -679,7 +647,7 @@
           <w:i w:val="0"/>
           <w:strike w:val="0"/>
         </w:rPr>
-        <w:t>"Right," Ben said. His voice had gone thin, and he cleared it. "Right."</w:t>
+        <w:t>"Three terms," Flitzberg said to Ben, "and they are mine, not the office's. You will not name this ring, to anyone, under anything. You will not lie to them. If a lie is the only thing between you and harm, you tell it, and you tell me afterward; that is the one door I leave open, and I am telling you plainly so you will know where it is." He stood. "And you will come home. The count is Gage's reason. Mine is that you are owed one."</w:t>
       </w:r>
     </w:p>
     <w:p>
@@ -689,7 +657,7 @@
           <w:i w:val="0"/>
           <w:strike w:val="0"/>
         </w:rPr>
-        <w:t>---</w:t>
+        <w:t>"Right," Ben said. His voice had gone thin, and he cleared it. "Right."</w:t>
       </w:r>
     </w:p>
     <w:p>
@@ -699,7 +667,7 @@
           <w:i w:val="0"/>
           <w:strike w:val="0"/>
         </w:rPr>
-        <w:t>The lift went up for a long time.</w:t>
+        <w:t>---</w:t>
       </w:r>
     </w:p>
     <w:p>
@@ -709,7 +677,7 @@
           <w:i w:val="0"/>
           <w:strike w:val="0"/>
         </w:rPr>
-        <w:t>Ben lost count of the floors at sixty-something, and when the doors opened the first thing that came in was the air.</w:t>
+        <w:t>The lift went up for a long time.</w:t>
       </w:r>
     </w:p>
     <w:p>
@@ -719,7 +687,7 @@
           <w:i w:val="0"/>
           <w:strike w:val="0"/>
         </w:rPr>
-        <w:t>It smelled of nothing. No sulfur, no coal-sweat, no people. A faint sweetness under it like washed stone.</w:t>
+        <w:t>Ben lost count of the floors at sixty-something, and when the doors opened the first thing that came in was the air.</w:t>
       </w:r>
     </w:p>
     <w:p>
@@ -729,7 +697,7 @@
           <w:i w:val="0"/>
           <w:strike w:val="0"/>
         </w:rPr>
-        <w:t>The lower stacks were a cellar of shelving, and a door at the end of them opened onto the sky.</w:t>
+        <w:t>It smelled of nothing. No sulfur, no coal-sweat, no people. A faint sweetness under it like washed stone.</w:t>
       </w:r>
     </w:p>
     <w:p>
@@ -739,7 +707,7 @@
           <w:i w:val="0"/>
           <w:strike w:val="0"/>
         </w:rPr>
-        <w:t>The light came from everywhere, in his eyes and on the backs of his hands, and he had to look at the floor. Someone had cut a thin groove along it for the rain.</w:t>
+        <w:t>The lower stacks were a cellar of shelving, and a door at the end of them opened onto the sky.</w:t>
       </w:r>
     </w:p>
     <w:p>
@@ -749,7 +717,7 @@
           <w:i w:val="0"/>
           <w:strike w:val="0"/>
         </w:rPr>
-        <w:t>People went past him. Nobody looked, because nothing on their wrists had told them to. His own said what the ring had set it to say: RUNNER, LOWER STACKS, DRONA, and a number.</w:t>
+        <w:t>The light came from everywhere, in his eyes and on the backs of his hands, and he had to look at the floor. Someone had cut a thin groove along it for the rain.</w:t>
       </w:r>
     </w:p>
     <w:p>
@@ -759,7 +727,7 @@
           <w:i w:val="0"/>
           <w:strike w:val="0"/>
         </w:rPr>
-        <w:t>He thought of the gates. He couldn't help it. Somewhere under his boots, under the rock and the cloud and the sixty-odd floors, Gretchen was standing on a worn patch of dirt with a scarf over her hair, and he was up here where nobody coughed, and the two facts wouldn't sit in the same chest. He put his hand on his hip.</w:t>
+        <w:t>People went past him. Nobody looked, because nothing on their wrists had told them to. His own said what the ring had set it to say: RUNNER, LOWER STACKS, DRONA, and a number.</w:t>
       </w:r>
     </w:p>
     <w:p>
@@ -769,7 +737,7 @@
           <w:i w:val="0"/>
           <w:strike w:val="0"/>
         </w:rPr>
-        <w:t>Nothing there. There hadn't been anything there since a room full of orange light, and his hand went anyway.</w:t>
+        <w:t>He thought of the gates. He couldn't help it. Somewhere under his boots, under the rock and the cloud and the sixty-odd floors, Gretchen was standing on a worn patch of dirt with a scarf over her hair, and he was up here where nobody coughed, and the two facts wouldn't sit in the same chest. He put his hand on his hip.</w:t>
       </w:r>
     </w:p>
     <w:p>
@@ -779,7 +747,7 @@
           <w:i w:val="0"/>
           <w:strike w:val="0"/>
         </w:rPr>
-        <w:t>---</w:t>
+        <w:t>Nothing there. There hadn't been anything there since a room full of orange light, and his hand went anyway.</w:t>
       </w:r>
     </w:p>
     <w:p>
@@ -789,23 +757,7 @@
           <w:i w:val="0"/>
           <w:strike w:val="0"/>
         </w:rPr>
-        <w:t xml:space="preserve">A maglev took him across the open air to Trinity-3. Ashoka was red-black and quieter, and its stone was old. He went down three flights worn hollow in the middle by feet, and at the bottom there was a door with </w:t>
-      </w:r>
-      <w:r>
-        <w:rPr>
-          <w:b w:val="0"/>
-          <w:i/>
-          <w:strike w:val="0"/>
-        </w:rPr>
-        <w:t>dead room</w:t>
-      </w:r>
-      <w:r>
-        <w:rPr>
-          <w:b w:val="0"/>
-          <w:i w:val="0"/>
-          <w:strike w:val="0"/>
-        </w:rPr>
-        <w:t xml:space="preserve"> on it in plain white paint, and a man in front of it.</w:t>
+        <w:t>---</w:t>
       </w:r>
     </w:p>
     <w:p>
@@ -815,7 +767,23 @@
           <w:i w:val="0"/>
           <w:strike w:val="0"/>
         </w:rPr>
-        <w:t>Twenty-one, maybe. Red-black, no insignia. A scar along the jaw, old and pale. The third knuckle of the right hand split and glued and split again; a knuckle went like that when they met bone a lot. He stood as nobody in Miner Town stood, settled, as if the floor had asked him and he'd agreed to it.</w:t>
+        <w:t xml:space="preserve">A maglev took him across the open air to Trinity-3. Ashoka was red-black and quieter, and its stone was old. He went down three flights worn hollow in the middle by feet, and at the bottom there was a door with </w:t>
+      </w:r>
+      <w:r>
+        <w:rPr>
+          <w:b w:val="0"/>
+          <w:i/>
+          <w:strike w:val="0"/>
+        </w:rPr>
+        <w:t>dead room</w:t>
+      </w:r>
+      <w:r>
+        <w:rPr>
+          <w:b w:val="0"/>
+          <w:i w:val="0"/>
+          <w:strike w:val="0"/>
+        </w:rPr>
+        <w:t xml:space="preserve"> on it in plain white paint, and a man in front of it.</w:t>
       </w:r>
     </w:p>
     <w:p>
@@ -825,7 +793,7 @@
           <w:i w:val="0"/>
           <w:strike w:val="0"/>
         </w:rPr>
-        <w:t>"She said they'd send someone who reads patterns."</w:t>
+        <w:t>Twenty-one, maybe. Red-black, no insignia. A scar along the jaw, old and pale. The third knuckle of the right hand split and glued and split again; a knuckle went like that when they met bone a lot. He stood as nobody in Miner Town stood: settled, weight down, nowhere to be.</w:t>
       </w:r>
     </w:p>
     <w:p>
@@ -835,7 +803,7 @@
           <w:i w:val="0"/>
           <w:strike w:val="0"/>
         </w:rPr>
-        <w:t>"I'm the runner."</w:t>
+        <w:t>"She said they'd send someone who reads patterns."</w:t>
       </w:r>
     </w:p>
     <w:p>
@@ -845,7 +813,7 @@
           <w:i w:val="0"/>
           <w:strike w:val="0"/>
         </w:rPr>
-        <w:t>The man looked at him the way the medic looked, all of it at once, and Ben felt himself counted: the gray-blue that didn't fit at the shoulder, the boots, the hand that had gone to his hip and come away. He looked back. A commander. A man who'd knelt on stone recently; the left knee of his fatigues was paler than the right.</w:t>
+        <w:t>"I'm the runner."</w:t>
       </w:r>
     </w:p>
     <w:p>
@@ -855,7 +823,7 @@
           <w:i w:val="0"/>
           <w:strike w:val="0"/>
         </w:rPr>
-        <w:t>Neither of them said what they'd seen. The commander held it a second longer, then nodded once.</w:t>
+        <w:t>The man looked at him the way the medic looked, all of it at once, and Ben felt himself counted: the gray-blue that didn't fit at the shoulder, the boots, the hand that had gone to his hip and come away. He looked back. A commander. A man who'd knelt on stone recently; the left knee of his fatigues was paler than the right.</w:t>
       </w:r>
     </w:p>
     <w:p>
@@ -865,7 +833,7 @@
           <w:i w:val="0"/>
           <w:strike w:val="0"/>
         </w:rPr>
-        <w:t>"Rohan. Terminal in the locker. Slot's the empty one."</w:t>
+        <w:t>Neither of them said what they'd seen. The commander held it a second longer, then nodded once.</w:t>
       </w:r>
     </w:p>
     <w:p>
@@ -875,7 +843,7 @@
           <w:i w:val="0"/>
           <w:strike w:val="0"/>
         </w:rPr>
-        <w:t>Ben unbuckled the ring's terminal and laid it in the drawer, and the drawer sighed shut on it. The city had stopped talking to him. He hadn't known it had been.</w:t>
+        <w:t>"Rohan. Terminal in the locker. Slot's the empty one."</w:t>
       </w:r>
     </w:p>
     <w:p>
@@ -885,7 +853,7 @@
           <w:i w:val="0"/>
           <w:strike w:val="0"/>
         </w:rPr>
-        <w:t>"Shoes," said a woman's voice from inside. "Walk on the gaps."</w:t>
+        <w:t>Ben unbuckled the ring's terminal and laid it in the drawer, and the drawer sighed shut on it. His wrist was quiet. He kept checking it anyway.</w:t>
       </w:r>
     </w:p>
     <w:p>
@@ -895,7 +863,7 @@
           <w:i w:val="0"/>
           <w:strike w:val="0"/>
         </w:rPr>
-        <w:t>---</w:t>
+        <w:t>"Shoes," said a woman's voice from inside. "Walk on the gaps."</w:t>
       </w:r>
     </w:p>
     <w:p>
@@ -905,7 +873,7 @@
           <w:i w:val="0"/>
           <w:strike w:val="0"/>
         </w:rPr>
-        <w:t>She was on the floor among her columns, and she didn't look up.</w:t>
+        <w:t>---</w:t>
       </w:r>
     </w:p>
     <w:p>
@@ -915,7 +883,7 @@
           <w:i w:val="0"/>
           <w:strike w:val="0"/>
         </w:rPr>
-        <w:t>Four strips of paper ran from the wall to the door, held at their corners by pencils and a tin cup and a whetstone and one glove. Every sheet was dated in the same small level hand. A brass pin in the fourth wall panel, pushed in crooked, and two sheets pinned a finger's width clear of it on either side.</w:t>
+        <w:t>She was on the floor among her columns, and she didn't look up.</w:t>
       </w:r>
     </w:p>
     <w:p>
@@ -925,7 +893,7 @@
           <w:i w:val="0"/>
           <w:strike w:val="0"/>
         </w:rPr>
-        <w:t>He counted the room without deciding to. Her. Rohan, shutting the door. And in the corner beside the locker, a man.</w:t>
+        <w:t>Four strips of paper ran from the wall to the door, held at their corners by pencils and a tin cup and a whetstone and one glove. Every sheet was dated in the same small level hand. A brass pin in the fourth wall panel, pushed in crooked, and two sheets pinned a finger's width clear of it on either side.</w:t>
       </w:r>
     </w:p>
     <w:p>
@@ -935,7 +903,7 @@
           <w:i w:val="0"/>
           <w:strike w:val="0"/>
         </w:rPr>
-        <w:t>Medium height. Medium everything. A face you'd call a wall if you called it anything. Ben's eyes went over the corner, and registered a wall, and came back, because that was what his eyes did when something was standing in one of the holes between people. A small white nick through the left eyebrow, old. A collar turned so the frayed side was in.</w:t>
+        <w:t>He counted the room without deciding to. Her. Rohan, shutting the door. And in the corner beside the locker, a man.</w:t>
       </w:r>
     </w:p>
     <w:p>
@@ -945,7 +913,7 @@
           <w:i w:val="0"/>
           <w:strike w:val="0"/>
         </w:rPr>
-        <w:t>The man in the corner looked at him. Nothing in the face moved. But the eyes, which had been resting on nothing, came onto Ben and stayed, and Ben had the sense of a door that had never once been tried finding a hand on it.</w:t>
+        <w:t>Medium height. Medium everything. A face you'd call a wall if you called it anything. Ben's eyes went over the corner, and registered a wall, and came back, because that was what his eyes did when something was standing in one of the holes between people. A small white nick through the left eyebrow, old. A collar turned so the frayed side was in.</w:t>
       </w:r>
     </w:p>
     <w:p>
@@ -955,7 +923,7 @@
           <w:i w:val="0"/>
           <w:strike w:val="0"/>
         </w:rPr>
-        <w:t>"Three of us," Rohan said. "Nayan. Me. You."</w:t>
+        <w:t>The man in the corner looked at him. Nothing in the face moved. But the eyes, which had been resting on nothing, came onto Ben and stayed, and Ben had the sense of a door that had never once been tried finding a hand on it.</w:t>
       </w:r>
     </w:p>
     <w:p>
@@ -965,7 +933,7 @@
           <w:i w:val="0"/>
           <w:strike w:val="0"/>
         </w:rPr>
-        <w:t>"Four," Ben said.</w:t>
+        <w:t>"Three of us," Rohan said. "Nayan. Me. You."</w:t>
       </w:r>
     </w:p>
     <w:p>
@@ -975,7 +943,7 @@
           <w:i w:val="0"/>
           <w:strike w:val="0"/>
         </w:rPr>
-        <w:t>Rohan looked at the corner, and at Ben, and his jaw shifted once.</w:t>
+        <w:t>"Four," Ben said.</w:t>
       </w:r>
     </w:p>
     <w:p>
@@ -985,7 +953,7 @@
           <w:i w:val="0"/>
           <w:strike w:val="0"/>
         </w:rPr>
-        <w:t>"Kaan. He'll give you his hand after. He doesn't give it before." Rohan held Ben's eyes. "How did you see him?"</w:t>
+        <w:t>Rohan looked at the corner, and at Ben, and his jaw shifted once.</w:t>
       </w:r>
     </w:p>
     <w:p>
@@ -995,7 +963,7 @@
           <w:i w:val="0"/>
           <w:strike w:val="0"/>
         </w:rPr>
-        <w:t>"My friend stands like that," Ben said. "An old man in a shed taught him. You stop seeing him, and then you do."</w:t>
+        <w:t>"Kaan. He'll give you his hand after. He doesn't give it before." Rohan held Ben's eyes. "How did you see him?"</w:t>
       </w:r>
     </w:p>
     <w:p>
@@ -1005,7 +973,7 @@
           <w:i w:val="0"/>
           <w:strike w:val="0"/>
         </w:rPr>
-        <w:t>Rohan didn't answer. Ben saw him put it somewhere.</w:t>
+        <w:t>"My friend stands like that," Ben said. "An old man in a shed taught him. You stop seeing him, and then you do."</w:t>
       </w:r>
     </w:p>
     <w:p>
@@ -1015,7 +983,7 @@
           <w:i w:val="0"/>
           <w:strike w:val="0"/>
         </w:rPr>
-        <w:t>The woman on the floor sat back on her heels and took the pencil out of her teeth.</w:t>
+        <w:t>Rohan didn't answer. Ben saw him put it somewhere.</w:t>
       </w:r>
     </w:p>
     <w:p>
@@ -1025,7 +993,7 @@
           <w:i w:val="0"/>
           <w:strike w:val="0"/>
         </w:rPr>
-        <w:t>"Read me Chanakya. Third year, autumn."</w:t>
+        <w:t>The woman on the floor sat back on her heels and took the pencil out of her teeth.</w:t>
       </w:r>
     </w:p>
     <w:p>
@@ -1035,7 +1003,7 @@
           <w:i w:val="0"/>
           <w:strike w:val="0"/>
         </w:rPr>
-        <w:t>He found the column, second from the shaft, walked the gaps to it in his socks, and knelt on the left, because she numbered the right.</w:t>
+        <w:t>"Read me Chanakya. Third year, autumn."</w:t>
       </w:r>
     </w:p>
     <w:p>
@@ -1045,7 +1013,7 @@
           <w:i w:val="0"/>
           <w:strike w:val="0"/>
         </w:rPr>
-        <w:t>He read it aloud as he'd read the screens for the man with the crackers: flat, in order, nothing added. Filter media. Survey fee. Lamp oil. When he reached the forty-day line he read it like the rest and went on past it.</w:t>
+        <w:t>He found the column, second from the shaft, walked the gaps to it in his socks, and knelt on the left, because she numbered the right.</w:t>
       </w:r>
     </w:p>
     <w:p>
@@ -1055,7 +1023,7 @@
           <w:i w:val="0"/>
           <w:strike w:val="0"/>
         </w:rPr>
-        <w:t>She let him reach the bottom of the page. "Again. Across. Same date, all four. I want to see if you can."</w:t>
+        <w:t>He read it aloud as he'd read the screens for the man with the crackers: flat, in order, nothing added. Filter media. Survey fee. Lamp oil. When he reached the forty-day line he read it like the rest and went on past it.</w:t>
       </w:r>
     </w:p>
     <w:p>
@@ -1065,7 +1033,7 @@
           <w:i w:val="0"/>
           <w:strike w:val="0"/>
         </w:rPr>
-        <w:t>He could. He did it on his knees, hands on his thighs so they wouldn't touch her paper, and the columns stopped being columns and became one thing with a grain in it, and he followed the grain.</w:t>
+        <w:t>She let him reach the bottom of the page. "Again. Across. Same date, all four. I want to see if you can."</w:t>
       </w:r>
     </w:p>
     <w:p>
@@ -1075,7 +1043,7 @@
           <w:i w:val="0"/>
           <w:strike w:val="0"/>
         </w:rPr>
-        <w:t>Forty days. Bearings, filters, dressings, paper. He followed it year by year toward the door, and somewhere in the fourth year his eye caught on something, and stopped, and he made it go on. It went on a beat too late.</w:t>
+        <w:t>He could. He did it on his knees, hands on his thighs so they wouldn't touch her paper, and the columns stopped being columns and became one thing with a grain in it, and he followed the grain.</w:t>
       </w:r>
     </w:p>
     <w:p>
@@ -1085,7 +1053,7 @@
           <w:i w:val="0"/>
           <w:strike w:val="0"/>
         </w:rPr>
-        <w:t>He knew why. He knew whose cellar the paper was in. He'd eaten off a tin plate in it last night.</w:t>
+        <w:t>Forty days. Bearings, filters, dressings, paper. He followed it year by year toward the door, and somewhere in the fourth year his eye caught on something, and stopped, and he made it go on. It went on a beat too late.</w:t>
       </w:r>
     </w:p>
     <w:p>
@@ -1095,7 +1063,7 @@
           <w:i w:val="0"/>
           <w:strike w:val="0"/>
         </w:rPr>
-        <w:t>Nayan was looking at him. She'd been looking for a while.</w:t>
+        <w:t>He knew why. He knew whose cellar the paper was in. He'd eaten off a tin plate in it last night.</w:t>
       </w:r>
     </w:p>
     <w:p>
@@ -1105,7 +1073,7 @@
           <w:i w:val="0"/>
           <w:strike w:val="0"/>
         </w:rPr>
-        <w:t>"You stopped."</w:t>
+        <w:t>Nayan was looking at him. She'd been looking for a while.</w:t>
       </w:r>
     </w:p>
     <w:p>
@@ -1115,7 +1083,7 @@
           <w:i w:val="0"/>
           <w:strike w:val="0"/>
         </w:rPr>
-        <w:t>"I'm reading."</w:t>
+        <w:t>"You stopped."</w:t>
       </w:r>
     </w:p>
     <w:p>
@@ -1125,7 +1093,7 @@
           <w:i w:val="0"/>
           <w:strike w:val="0"/>
         </w:rPr>
-        <w:t>"No. You were reading. Then you stopped." She came down the column on her knees to where his eyes had been, and read it herself, and then read across. "Forty-seven days," she said. "Not forty. All four." She went down a year, and another, fast. "Here. Here. Once a year, a week late, and never the same week." She sat back on her heels. "I read down. I've only ever read down. What's it waiting for?"</w:t>
+        <w:t>"I'm reading."</w:t>
       </w:r>
     </w:p>
     <w:p>
@@ -1135,39 +1103,7 @@
           <w:i w:val="0"/>
           <w:strike w:val="0"/>
         </w:rPr>
-        <w:t xml:space="preserve">He opened his mouth to say </w:t>
-      </w:r>
-      <w:r>
-        <w:rPr>
-          <w:b w:val="0"/>
-          <w:i/>
-          <w:strike w:val="0"/>
-        </w:rPr>
-        <w:t>I don't know</w:t>
-      </w:r>
-      <w:r>
-        <w:rPr>
-          <w:b w:val="0"/>
-          <w:i w:val="0"/>
-          <w:strike w:val="0"/>
-        </w:rPr>
-        <w:t xml:space="preserve">, and it wasn't true. </w:t>
-      </w:r>
-      <w:r>
-        <w:rPr>
-          <w:b w:val="0"/>
-          <w:i/>
-          <w:strike w:val="0"/>
-        </w:rPr>
-        <w:t>Once a year the four Grandmasters sit with me.</w:t>
-      </w:r>
-      <w:r>
-        <w:rPr>
-          <w:b w:val="0"/>
-          <w:i w:val="0"/>
-          <w:strike w:val="0"/>
-        </w:rPr>
-        <w:t xml:space="preserve"> He shut it again.</w:t>
+        <w:t>"No. You were reading. Then you stopped." She came down the column on her knees to where his eyes had been, and read it herself, and then read across. "Forty-seven days," she said. "Not forty. All four." She went down a year, and another, fast. "Here. Here. Once a year, a week late, and never the same week." She sat back on her heels. "I marked the forties. I never measured the gaps between them. What's it waiting for?"</w:t>
       </w:r>
     </w:p>
     <w:p>
@@ -1177,7 +1113,39 @@
           <w:i w:val="0"/>
           <w:strike w:val="0"/>
         </w:rPr>
-        <w:t>The silence went on long enough that Rohan turned from the wall. Kaan hadn't moved.</w:t>
+        <w:t xml:space="preserve">He opened his mouth to say </w:t>
+      </w:r>
+      <w:r>
+        <w:rPr>
+          <w:b w:val="0"/>
+          <w:i/>
+          <w:strike w:val="0"/>
+        </w:rPr>
+        <w:t>I don't know</w:t>
+      </w:r>
+      <w:r>
+        <w:rPr>
+          <w:b w:val="0"/>
+          <w:i w:val="0"/>
+          <w:strike w:val="0"/>
+        </w:rPr>
+        <w:t xml:space="preserve">, and it wasn't true. </w:t>
+      </w:r>
+      <w:r>
+        <w:rPr>
+          <w:b w:val="0"/>
+          <w:i/>
+          <w:strike w:val="0"/>
+        </w:rPr>
+        <w:t>Once a year the four Grandmasters sit with me.</w:t>
+      </w:r>
+      <w:r>
+        <w:rPr>
+          <w:b w:val="0"/>
+          <w:i w:val="0"/>
+          <w:strike w:val="0"/>
+        </w:rPr>
+        <w:t xml:space="preserve"> He shut it again.</w:t>
       </w:r>
     </w:p>
     <w:p>
@@ -1187,7 +1155,7 @@
           <w:i w:val="0"/>
           <w:strike w:val="0"/>
         </w:rPr>
-        <w:t>"There's a thing I can't tell you," Ben said at last. "It isn't that I won't. I gave my word before I came up, and I'm not going to lie to you to keep it, so this is what you get instead. I don't know how it works, any of it. I know there's a reason it's late, and I'm not allowed to say the reason." He kept his hand off his hip. "You can throw me out. You'd be right to."</w:t>
+        <w:t>The silence went on long enough that Rohan turned from the wall. Kaan hadn't moved.</w:t>
       </w:r>
     </w:p>
     <w:p>
@@ -1197,7 +1165,7 @@
           <w:i w:val="0"/>
           <w:strike w:val="0"/>
         </w:rPr>
-        <w:t>Nayan looked at him over the pencil for a long while.</w:t>
+        <w:t>"There's a thing I can't tell you," Ben said at last. "It isn't that I won't. I gave my word before I came up, and I'm not going to lie to you to keep it, so this is what you get instead. I don't know how it works, any of it. I know there's a reason it's late, and I'm not allowed to say the reason." He kept his hand off his hip. "You can throw me out. You'd be right to."</w:t>
       </w:r>
     </w:p>
     <w:p>
@@ -1207,7 +1175,7 @@
           <w:i w:val="0"/>
           <w:strike w:val="0"/>
         </w:rPr>
-        <w:t>"He doesn't know my real name," she said, and tipped her head at Rohan. "I don't know the corner's. He's never said a word in my hearing." She bent back to the sheet. "Nobody in this room gets to be angry about what somebody else won't say. Help me mark the late weeks."</w:t>
+        <w:t>Nayan looked at him over the pencil for a long while.</w:t>
       </w:r>
     </w:p>
     <w:p>
@@ -1217,7 +1185,7 @@
           <w:i w:val="0"/>
           <w:strike w:val="0"/>
         </w:rPr>
-        <w:t>She drew the squares; he found them. It took an hour, and he was good at it, and he liked it.</w:t>
+        <w:t>"He doesn't know my real name," she said, and tipped her head at Rohan. "I don't know the corner's. He's never said a word in my hearing." She bent back to the sheet. "Nobody in this room gets to be angry about what somebody else won't say. Help me mark the late weeks."</w:t>
       </w:r>
     </w:p>
     <w:p>
@@ -1227,7 +1195,7 @@
           <w:i w:val="0"/>
           <w:strike w:val="0"/>
         </w:rPr>
-        <w:t>---</w:t>
+        <w:t>She drew the squares; he found them. It took an hour, and he was good at it, and he liked it.</w:t>
       </w:r>
     </w:p>
     <w:p>
@@ -1237,7 +1205,7 @@
           <w:i w:val="0"/>
           <w:strike w:val="0"/>
         </w:rPr>
-        <w:t>Kaan came out of the corner when they were done.</w:t>
+        <w:t>---</w:t>
       </w:r>
     </w:p>
     <w:p>
@@ -1247,7 +1215,7 @@
           <w:i w:val="0"/>
           <w:strike w:val="0"/>
         </w:rPr>
-        <w:t>He crossed the room on the gaps, crouched, and took a pencil stub and a scrap of the house's cheap tag paper from inside his coat. Block letters, pressed in hard. He laid the scrap on the stone in front of Ben and took his hand off it, and his eyes came up to Ben's face and held there, as they had at the door.</w:t>
+        <w:t>Kaan came out of the corner when they were done.</w:t>
       </w:r>
     </w:p>
     <w:p>
@@ -1257,7 +1225,7 @@
           <w:i w:val="0"/>
           <w:strike w:val="0"/>
         </w:rPr>
-        <w:t>A number. Long, with a letter in it. Nothing else.</w:t>
+        <w:t>He crossed the room on the gaps, crouched, and took a pencil stub and a scrap of the house's cheap tag paper from inside his coat. Block letters, pressed in hard. He laid the scrap on the stone in front of Ben and took his hand off it, and his eyes came up to Ben's face and held there, as they had at the door.</w:t>
       </w:r>
     </w:p>
     <w:p>
@@ -1267,7 +1235,7 @@
           <w:i w:val="0"/>
           <w:strike w:val="0"/>
         </w:rPr>
-        <w:t>"From a slip in a coat," Rohan said. "In Chanakya. The analyst's carried it three years."</w:t>
+        <w:t>A number. Long, with a letter in it. Nothing else.</w:t>
       </w:r>
     </w:p>
     <w:p>
@@ -1277,7 +1245,7 @@
           <w:i w:val="0"/>
           <w:strike w:val="0"/>
         </w:rPr>
-        <w:t>Nayan was already moving. From under the tin cup she drew a thinner sheaf, and from under that a thinner one still, and laid a sheet beside Kaan's scrap without touching either.</w:t>
+        <w:t>"From a slip in a coat," Rohan said. "In Chanakya. The analyst's carried it three years."</w:t>
       </w:r>
     </w:p>
     <w:p>
@@ -1287,39 +1255,7 @@
           <w:i w:val="0"/>
           <w:strike w:val="0"/>
         </w:rPr>
-        <w:t xml:space="preserve">Chanakya's records archive. Custody. File numbers, and beside each a name: </w:t>
-      </w:r>
-      <w:r>
-        <w:rPr>
-          <w:b w:val="0"/>
-          <w:i/>
-          <w:strike w:val="0"/>
-        </w:rPr>
-        <w:t>released to</w:t>
-      </w:r>
-      <w:r>
-        <w:rPr>
-          <w:b w:val="0"/>
-          <w:i w:val="0"/>
-          <w:strike w:val="0"/>
-        </w:rPr>
-        <w:t xml:space="preserve">, </w:t>
-      </w:r>
-      <w:r>
-        <w:rPr>
-          <w:b w:val="0"/>
-          <w:i/>
-          <w:strike w:val="0"/>
-        </w:rPr>
-        <w:t>returned by</w:t>
-      </w:r>
-      <w:r>
-        <w:rPr>
-          <w:b w:val="0"/>
-          <w:i w:val="0"/>
-          <w:strike w:val="0"/>
-        </w:rPr>
-        <w:t>.</w:t>
+        <w:t>Nayan was already moving. From under the tin cup she drew a thinner sheaf, and from under that a thinner one still, and laid a sheet beside Kaan's scrap without touching either.</w:t>
       </w:r>
     </w:p>
     <w:p>
@@ -1329,7 +1265,7 @@
           <w:i w:val="0"/>
           <w:strike w:val="0"/>
         </w:rPr>
-        <w:t xml:space="preserve">Near the bottom, the same number. Beside it: </w:t>
+        <w:t xml:space="preserve">Chanakya's records archive. Custody. File numbers, and beside each a name: </w:t>
       </w:r>
       <w:r>
         <w:rPr>
@@ -1337,7 +1273,7 @@
           <w:i/>
           <w:strike w:val="0"/>
         </w:rPr>
-        <w:t>Source folio. One night. Author's custody. Ravi.</w:t>
+        <w:t>released to</w:t>
       </w:r>
       <w:r>
         <w:rPr>
@@ -1345,7 +1281,7 @@
           <w:i w:val="0"/>
           <w:strike w:val="0"/>
         </w:rPr>
-        <w:t xml:space="preserve"> A date, the morning of the fourth. The </w:t>
+        <w:t xml:space="preserve">, </w:t>
       </w:r>
       <w:r>
         <w:rPr>
@@ -1353,7 +1289,7 @@
           <w:i/>
           <w:strike w:val="0"/>
         </w:rPr>
-        <w:t>returned by</w:t>
+        <w:t>returned</w:t>
       </w:r>
       <w:r>
         <w:rPr>
@@ -1361,7 +1297,7 @@
           <w:i w:val="0"/>
           <w:strike w:val="0"/>
         </w:rPr>
-        <w:t xml:space="preserve"> column beside it was empty.</w:t>
+        <w:t>.</w:t>
       </w:r>
     </w:p>
     <w:p>
@@ -1371,7 +1307,23 @@
           <w:i w:val="0"/>
           <w:strike w:val="0"/>
         </w:rPr>
-        <w:t>"Public," Nayan said. "It sits open on the counter. I copy it every few days."</w:t>
+        <w:t xml:space="preserve">Near the bottom, the same number. Beside it: </w:t>
+      </w:r>
+      <w:r>
+        <w:rPr>
+          <w:b w:val="0"/>
+          <w:i/>
+          <w:strike w:val="0"/>
+        </w:rPr>
+        <w:t>Source folio. One night. Author's custody. Ravi.</w:t>
+      </w:r>
+      <w:r>
+        <w:rPr>
+          <w:b w:val="0"/>
+          <w:i w:val="0"/>
+          <w:strike w:val="0"/>
+        </w:rPr>
+        <w:t xml:space="preserve"> A date, the morning of the fourth. The return column beside it was empty.</w:t>
       </w:r>
     </w:p>
     <w:p>
@@ -1381,7 +1333,7 @@
           <w:i w:val="0"/>
           <w:strike w:val="0"/>
         </w:rPr>
-        <w:t>One number, written twice, in two hands, by two people who'd never spoken. Ben looked at the two scraps as he'd looked at the crystal, waiting for the pulse.</w:t>
+        <w:t>"Public," Nayan said. "It sits open on the counter. I copy it every few days."</w:t>
       </w:r>
     </w:p>
     <w:p>
@@ -1391,7 +1343,7 @@
           <w:i w:val="0"/>
           <w:strike w:val="0"/>
         </w:rPr>
-        <w:t>Ben moved his finger to the empty column. "One night, he signed for. That was the fourth." He looked up at Kaan. "He hasn't brought it back."</w:t>
+        <w:t>One number, written twice, in two hands, by two people who'd never spoken. Ben looked at the two scraps as he'd looked at the crystal, waiting for the pulse.</w:t>
       </w:r>
     </w:p>
     <w:p>
@@ -1401,7 +1353,17 @@
           <w:i w:val="0"/>
           <w:strike w:val="0"/>
         </w:rPr>
-        <w:t>Kaan's face did nothing. But he picked up the scrap and set it down again a finger's width closer to the custody page, so the two numbers lay nearly touching. Then Kaan held out his hand.</w:t>
+        <w:t>Ben moved his finger to the empty column. "One night, he signed for. That was the fourth." He looked up at Kaan. "He hasn't brought it back."</w:t>
+      </w:r>
+    </w:p>
+    <w:p>
+      <w:r>
+        <w:rPr>
+          <w:b w:val="0"/>
+          <w:i w:val="0"/>
+          <w:strike w:val="0"/>
+        </w:rPr>
+        <w:t>Kaan's face did nothing. But he picked up the scrap and set it down again a finger's width closer to the custody page, so the two numbers lay nearly touching. Then Kaan held out his hand, palm up. Ben took it. One dry, firm press, gone before he could answer it.</w:t>
       </w:r>
     </w:p>
     <w:p>

</xml_diff>

<commit_message>
Ch24: merge L45 split quote; 'return' column name throughout
Co-Authored-By: Claude Opus 5.5 <noreply@anthropic.com>
</commit_message>
<xml_diff>
--- a/claude-notes/manuscript-v2/24-first-contact-merged.docx
+++ b/claude-notes/manuscript-v2/24-first-contact-merged.docx
@@ -241,7 +241,7 @@
           <w:i w:val="0"/>
           <w:strike w:val="0"/>
         </w:rPr>
-        <w:t>"Forty reams of paper. Bearings." She'd read them off his own wall. "Dressings for the medics." "And this." She turned the metal hand over on her knee and looked at him. "Where did this come from?"</w:t>
+        <w:t>"Forty reams of paper. Bearings." She'd read them off his own wall. "Dressings for the medics. And this." She turned the metal hand over on her knee and looked at him. "Where did this come from?"</w:t>
       </w:r>
     </w:p>
     <w:p>
@@ -1289,7 +1289,7 @@
           <w:i/>
           <w:strike w:val="0"/>
         </w:rPr>
-        <w:t>returned</w:t>
+        <w:t>return</w:t>
       </w:r>
       <w:r>
         <w:rPr>

</xml_diff>